<commit_message>
Update L2 PRD v1.1: add CBM implementation, Google Workspace integration, session workflow
</commit_message>
<xml_diff>
--- a/PRDs/product/CustomApp/mentor_engagement_CUSTOM_app_prd_l2.docx
+++ b/PRDs/product/CustomApp/mentor_engagement_CUSTOM_app_prd_l2.docx
@@ -192,7 +192,7 @@
                 <w:sz w:val="22"/>
                 <w:szCs w:val="22"/>
               </w:rPr>
-              <w:t xml:space="preserve">1.0</w:t>
+              <w:t xml:space="preserve">1.1</w:t>
             </w:r>
           </w:p>
         </w:tc>
@@ -370,7 +370,7 @@
                 <w:sz w:val="22"/>
                 <w:szCs w:val="22"/>
               </w:rPr>
-              <w:t xml:space="preserve">04-02-26 21:00</w:t>
+              <w:t xml:space="preserve">04-02-26 22:00</w:t>
             </w:r>
           </w:p>
         </w:tc>
@@ -485,7 +485,7 @@
           <w:sz w:val="22"/>
           <w:szCs w:val="22"/>
         </w:rPr>
-        <w:t xml:space="preserve">This document defines the functional specification for the Mentor Engagement Application, expanding the strategic vision established in the Level 1 PRD into detailed requirements for user roles, view configuration, data access, API design, authentication, and deployment. It provides sufficient detail to guide technology selection, architecture decisions, and proof-of-concept development.</w:t>
+        <w:t xml:space="preserve">This document defines the functional specification for the Mentor Engagement Application, expanding the strategic vision established in the Level 1 PRD into detailed requirements for user roles, view configuration, data access, API design, authentication, external integrations, and deployment. It provides sufficient detail to guide technology selection, architecture decisions, and proof-of-concept development.</w:t>
       </w:r>
     </w:p>
     <w:p>
@@ -606,6 +606,24 @@
           <w:szCs w:val="22"/>
         </w:rPr>
         <w:t xml:space="preserve">The CRM uses a role-based security model with security teams that can be read programmatically.</w:t>
+      </w:r>
+    </w:p>
+    <w:p>
+      <w:pPr>
+        <w:pStyle w:val="ListParagraph"/>
+        <w:numPr>
+          <w:ilvl w:val="0"/>
+          <w:numId w:val="2"/>
+        </w:numPr>
+        <w:spacing w:after="80"/>
+      </w:pPr>
+      <w:r>
+        <w:rPr>
+          <w:rFonts w:ascii="Arial" w:cs="Arial" w:eastAsia="Arial" w:hAnsi="Arial"/>
+          <w:sz w:val="22"/>
+          <w:szCs w:val="22"/>
+        </w:rPr>
+        <w:t xml:space="preserve">The organization uses Google Workspace for email and calendar.</w:t>
       </w:r>
     </w:p>
     <w:p>
@@ -895,7 +913,7 @@
                 <w:sz w:val="22"/>
                 <w:szCs w:val="22"/>
               </w:rPr>
-              <w:t xml:space="preserve">Use any active view; open detail screens; edit records; create sessions; add relationships</w:t>
+              <w:t xml:space="preserve">Use any active view; open detail screens; edit records; create sessions; add relationships; send session summaries; create calendar invites</w:t>
             </w:r>
           </w:p>
         </w:tc>
@@ -2626,7 +2644,7 @@
           <w:sz w:val="22"/>
           <w:szCs w:val="22"/>
         </w:rPr>
-        <w:t xml:space="preserve">The mentor opens the application in a web browser and authenticates using their existing CRM credentials. No separate account creation or registration is required.</w:t>
+        <w:t xml:space="preserve">The mentor opens the application in a web browser and authenticates using their existing CRM credentials. No separate account creation or registration is required. On first login, the mentor is prompted to authorize the application to access their Google Workspace account for calendar and email functionality (see Section 9).</w:t>
       </w:r>
     </w:p>
     <w:p>
@@ -2910,7 +2928,7 @@
           <w:sz w:val="24"/>
           <w:szCs w:val="24"/>
         </w:rPr>
-        <w:t xml:space="preserve">4.7 Detail Screen</w:t>
+        <w:t xml:space="preserve">4.7 Engagement Detail Screen</w:t>
       </w:r>
     </w:p>
     <w:p>
@@ -2924,21 +2942,7 @@
           <w:sz w:val="22"/>
           <w:szCs w:val="22"/>
         </w:rPr>
-        <w:t xml:space="preserve">Clicking a parent row in the data grid opens a detail screen for that record. The detail screen is a custom-designed user interface that combines fields from the selected record and all of its related entities (as defined by the data source hierarchy) into a single editing view.</w:t>
-      </w:r>
-    </w:p>
-    <w:p>
-      <w:pPr>
-        <w:spacing w:after="160"/>
-      </w:pPr>
-      <w:r>
-        <w:rPr>
-          <w:rFonts w:ascii="Arial" w:cs="Arial" w:eastAsia="Arial" w:hAnsi="Arial"/>
-          <w:color w:val="000000"/>
-          <w:sz w:val="22"/>
-          <w:szCs w:val="22"/>
-        </w:rPr>
-        <w:t xml:space="preserve">Detail screen characteristics:</w:t>
+        <w:t xml:space="preserve">Clicking an engagement row in the data grid opens the engagement detail screen. This is a custom-designed user interface that combines fields from the engagement and all of its related entities into a single view, optimized for efficient use on large-format monitors. The detail screen displays:</w:t>
       </w:r>
     </w:p>
     <w:p>
@@ -2953,20 +2957,10 @@
       <w:r>
         <w:rPr>
           <w:rFonts w:ascii="Arial" w:cs="Arial" w:eastAsia="Arial" w:hAnsi="Arial"/>
-          <w:b/>
-          <w:bCs/>
-          <w:sz w:val="22"/>
-          <w:szCs w:val="22"/>
-        </w:rPr>
-        <w:t xml:space="preserve">Auto-save. </w:t>
-      </w:r>
-      <w:r>
-        <w:rPr>
-          <w:rFonts w:ascii="Arial" w:cs="Arial" w:eastAsia="Arial" w:hAnsi="Arial"/>
-          <w:sz w:val="22"/>
-          <w:szCs w:val="22"/>
-        </w:rPr>
-        <w:t xml:space="preserve">Every field change is saved immediately when the user completes the edit (focus leaves the field or the user presses Enter). There is no save button.</w:t>
+          <w:sz w:val="22"/>
+          <w:szCs w:val="22"/>
+        </w:rPr>
+        <w:t xml:space="preserve">Client contact details (name, phone, email)</w:t>
       </w:r>
     </w:p>
     <w:p>
@@ -2981,20 +2975,10 @@
       <w:r>
         <w:rPr>
           <w:rFonts w:ascii="Arial" w:cs="Arial" w:eastAsia="Arial" w:hAnsi="Arial"/>
-          <w:b/>
-          <w:bCs/>
-          <w:sz w:val="22"/>
-          <w:szCs w:val="22"/>
-        </w:rPr>
-        <w:t xml:space="preserve">Inline error handling. </w:t>
-      </w:r>
-      <w:r>
-        <w:rPr>
-          <w:rFonts w:ascii="Arial" w:cs="Arial" w:eastAsia="Arial" w:hAnsi="Arial"/>
-          <w:sz w:val="22"/>
-          <w:szCs w:val="22"/>
-        </w:rPr>
-        <w:t xml:space="preserve">If a save fails (for example, a CRM validation rule rejects the value), the field displays an error message and retains the user’s attempted value so they can correct it.</w:t>
+          <w:sz w:val="22"/>
+          <w:szCs w:val="22"/>
+        </w:rPr>
+        <w:t xml:space="preserve">Company details</w:t>
       </w:r>
     </w:p>
     <w:p>
@@ -3009,20 +2993,10 @@
       <w:r>
         <w:rPr>
           <w:rFonts w:ascii="Arial" w:cs="Arial" w:eastAsia="Arial" w:hAnsi="Arial"/>
-          <w:b/>
-          <w:bCs/>
-          <w:sz w:val="22"/>
-          <w:szCs w:val="22"/>
-        </w:rPr>
-        <w:t xml:space="preserve">Create sessions. </w:t>
-      </w:r>
-      <w:r>
-        <w:rPr>
-          <w:rFonts w:ascii="Arial" w:cs="Arial" w:eastAsia="Arial" w:hAnsi="Arial"/>
-          <w:sz w:val="22"/>
-          <w:szCs w:val="22"/>
-        </w:rPr>
-        <w:t xml:space="preserve">Users can create new session records associated with an engagement directly from the detail screen.</w:t>
+          <w:sz w:val="22"/>
+          <w:szCs w:val="22"/>
+        </w:rPr>
+        <w:t xml:space="preserve">Engagement metadata (start date, status, meeting cadence)</w:t>
       </w:r>
     </w:p>
     <w:p>
@@ -3037,20 +3011,10 @@
       <w:r>
         <w:rPr>
           <w:rFonts w:ascii="Arial" w:cs="Arial" w:eastAsia="Arial" w:hAnsi="Arial"/>
-          <w:b/>
-          <w:bCs/>
-          <w:sz w:val="22"/>
-          <w:szCs w:val="22"/>
-        </w:rPr>
-        <w:t xml:space="preserve">Add relationships. </w:t>
-      </w:r>
-      <w:r>
-        <w:rPr>
-          <w:rFonts w:ascii="Arial" w:cs="Arial" w:eastAsia="Arial" w:hAnsi="Arial"/>
-          <w:sz w:val="22"/>
-          <w:szCs w:val="22"/>
-        </w:rPr>
-        <w:t xml:space="preserve">Users can add relationships to a record (for example, adding a co-mentor to an engagement).</w:t>
+          <w:sz w:val="22"/>
+          <w:szCs w:val="22"/>
+        </w:rPr>
+        <w:t xml:space="preserve">Co-mentors and SMEs assigned to the engagement</w:t>
       </w:r>
     </w:p>
     <w:p>
@@ -3065,20 +3029,10 @@
       <w:r>
         <w:rPr>
           <w:rFonts w:ascii="Arial" w:cs="Arial" w:eastAsia="Arial" w:hAnsi="Arial"/>
-          <w:b/>
-          <w:bCs/>
-          <w:sz w:val="22"/>
-          <w:szCs w:val="22"/>
-        </w:rPr>
-        <w:t xml:space="preserve">No delete. </w:t>
-      </w:r>
-      <w:r>
-        <w:rPr>
-          <w:rFonts w:ascii="Arial" w:cs="Arial" w:eastAsia="Arial" w:hAnsi="Arial"/>
-          <w:sz w:val="22"/>
-          <w:szCs w:val="22"/>
-        </w:rPr>
-        <w:t xml:space="preserve">Delete operations are not available from the detail screen.</w:t>
+          <w:sz w:val="22"/>
+          <w:szCs w:val="22"/>
+        </w:rPr>
+        <w:t xml:space="preserve">QuickNote (editable)</w:t>
       </w:r>
     </w:p>
     <w:p>
@@ -3093,6 +3047,168 @@
       <w:r>
         <w:rPr>
           <w:rFonts w:ascii="Arial" w:cs="Arial" w:eastAsia="Arial" w:hAnsi="Arial"/>
+          <w:sz w:val="22"/>
+          <w:szCs w:val="22"/>
+        </w:rPr>
+        <w:t xml:space="preserve">Engagement Notes</w:t>
+      </w:r>
+    </w:p>
+    <w:p>
+      <w:pPr>
+        <w:pStyle w:val="ListParagraph"/>
+        <w:numPr>
+          <w:ilvl w:val="0"/>
+          <w:numId w:val="2"/>
+        </w:numPr>
+        <w:spacing w:after="80"/>
+      </w:pPr>
+      <w:r>
+        <w:rPr>
+          <w:rFonts w:ascii="Arial" w:cs="Arial" w:eastAsia="Arial" w:hAnsi="Arial"/>
+          <w:sz w:val="22"/>
+          <w:szCs w:val="22"/>
+        </w:rPr>
+        <w:t xml:space="preserve">Session history — a list of all sessions with date, status, and session notes</w:t>
+      </w:r>
+    </w:p>
+    <w:p>
+      <w:pPr>
+        <w:spacing w:after="160"/>
+      </w:pPr>
+      <w:r>
+        <w:rPr>
+          <w:rFonts w:ascii="Arial" w:cs="Arial" w:eastAsia="Arial" w:hAnsi="Arial"/>
+          <w:color w:val="000000"/>
+          <w:sz w:val="22"/>
+          <w:szCs w:val="22"/>
+        </w:rPr>
+        <w:t xml:space="preserve">Detail screen editing characteristics:</w:t>
+      </w:r>
+    </w:p>
+    <w:p>
+      <w:pPr>
+        <w:pStyle w:val="ListParagraph"/>
+        <w:numPr>
+          <w:ilvl w:val="0"/>
+          <w:numId w:val="2"/>
+        </w:numPr>
+        <w:spacing w:after="80"/>
+      </w:pPr>
+      <w:r>
+        <w:rPr>
+          <w:rFonts w:ascii="Arial" w:cs="Arial" w:eastAsia="Arial" w:hAnsi="Arial"/>
+          <w:b/>
+          <w:bCs/>
+          <w:sz w:val="22"/>
+          <w:szCs w:val="22"/>
+        </w:rPr>
+        <w:t xml:space="preserve">Auto-save. </w:t>
+      </w:r>
+      <w:r>
+        <w:rPr>
+          <w:rFonts w:ascii="Arial" w:cs="Arial" w:eastAsia="Arial" w:hAnsi="Arial"/>
+          <w:sz w:val="22"/>
+          <w:szCs w:val="22"/>
+        </w:rPr>
+        <w:t xml:space="preserve">Every field change is saved immediately when the user completes the edit (focus leaves the field or the user presses Enter). There is no save button.</w:t>
+      </w:r>
+    </w:p>
+    <w:p>
+      <w:pPr>
+        <w:pStyle w:val="ListParagraph"/>
+        <w:numPr>
+          <w:ilvl w:val="0"/>
+          <w:numId w:val="2"/>
+        </w:numPr>
+        <w:spacing w:after="80"/>
+      </w:pPr>
+      <w:r>
+        <w:rPr>
+          <w:rFonts w:ascii="Arial" w:cs="Arial" w:eastAsia="Arial" w:hAnsi="Arial"/>
+          <w:b/>
+          <w:bCs/>
+          <w:sz w:val="22"/>
+          <w:szCs w:val="22"/>
+        </w:rPr>
+        <w:t xml:space="preserve">Inline error handling. </w:t>
+      </w:r>
+      <w:r>
+        <w:rPr>
+          <w:rFonts w:ascii="Arial" w:cs="Arial" w:eastAsia="Arial" w:hAnsi="Arial"/>
+          <w:sz w:val="22"/>
+          <w:szCs w:val="22"/>
+        </w:rPr>
+        <w:t xml:space="preserve">If a save fails (for example, a CRM validation rule rejects the value), the field displays an error message and retains the user’s attempted value so they can correct it.</w:t>
+      </w:r>
+    </w:p>
+    <w:p>
+      <w:pPr>
+        <w:pStyle w:val="ListParagraph"/>
+        <w:numPr>
+          <w:ilvl w:val="0"/>
+          <w:numId w:val="2"/>
+        </w:numPr>
+        <w:spacing w:after="80"/>
+      </w:pPr>
+      <w:r>
+        <w:rPr>
+          <w:rFonts w:ascii="Arial" w:cs="Arial" w:eastAsia="Arial" w:hAnsi="Arial"/>
+          <w:b/>
+          <w:bCs/>
+          <w:sz w:val="22"/>
+          <w:szCs w:val="22"/>
+        </w:rPr>
+        <w:t xml:space="preserve">Add relationships. </w:t>
+      </w:r>
+      <w:r>
+        <w:rPr>
+          <w:rFonts w:ascii="Arial" w:cs="Arial" w:eastAsia="Arial" w:hAnsi="Arial"/>
+          <w:sz w:val="22"/>
+          <w:szCs w:val="22"/>
+        </w:rPr>
+        <w:t xml:space="preserve">Users can add relationships to the engagement (for example, adding a co-mentor or SME).</w:t>
+      </w:r>
+    </w:p>
+    <w:p>
+      <w:pPr>
+        <w:pStyle w:val="ListParagraph"/>
+        <w:numPr>
+          <w:ilvl w:val="0"/>
+          <w:numId w:val="2"/>
+        </w:numPr>
+        <w:spacing w:after="80"/>
+      </w:pPr>
+      <w:r>
+        <w:rPr>
+          <w:rFonts w:ascii="Arial" w:cs="Arial" w:eastAsia="Arial" w:hAnsi="Arial"/>
+          <w:b/>
+          <w:bCs/>
+          <w:sz w:val="22"/>
+          <w:szCs w:val="22"/>
+        </w:rPr>
+        <w:t xml:space="preserve">No delete. </w:t>
+      </w:r>
+      <w:r>
+        <w:rPr>
+          <w:rFonts w:ascii="Arial" w:cs="Arial" w:eastAsia="Arial" w:hAnsi="Arial"/>
+          <w:sz w:val="22"/>
+          <w:szCs w:val="22"/>
+        </w:rPr>
+        <w:t xml:space="preserve">Delete operations are not available from the detail screen.</w:t>
+      </w:r>
+    </w:p>
+    <w:p>
+      <w:pPr>
+        <w:pStyle w:val="ListParagraph"/>
+        <w:numPr>
+          <w:ilvl w:val="0"/>
+          <w:numId w:val="2"/>
+        </w:numPr>
+        <w:spacing w:after="80"/>
+      </w:pPr>
+      <w:r>
+        <w:rPr>
+          <w:rFonts w:ascii="Arial" w:cs="Arial" w:eastAsia="Arial" w:hAnsi="Arial"/>
           <w:b/>
           <w:bCs/>
           <w:sz w:val="22"/>
@@ -3123,7 +3239,7 @@
           <w:sz w:val="24"/>
           <w:szCs w:val="24"/>
         </w:rPr>
-        <w:t xml:space="preserve">4.8 Detail Screen Design</w:t>
+        <w:t xml:space="preserve">4.8 Session Workflow</w:t>
       </w:r>
     </w:p>
     <w:p>
@@ -3137,7 +3253,287 @@
           <w:sz w:val="22"/>
           <w:szCs w:val="22"/>
         </w:rPr>
-        <w:t xml:space="preserve">Detail screens are custom code artifacts, not runtime configurations. They are designed for efficient use on large-format monitors, presenting all related entity data in a single screen to minimize navigation. The development workflow for detail screens is:</w:t>
+        <w:t xml:space="preserve">From the engagement detail screen, the mentor initiates a session in one of two ways: selecting an existing session with Scheduled status from the session history, or creating a new session if none is scheduled.</w:t>
+      </w:r>
+    </w:p>
+    <w:p>
+      <w:pPr>
+        <w:spacing w:after="120" w:before="200"/>
+      </w:pPr>
+      <w:r>
+        <w:rPr>
+          <w:rFonts w:ascii="Arial" w:cs="Arial" w:eastAsia="Arial" w:hAnsi="Arial"/>
+          <w:b/>
+          <w:bCs/>
+          <w:color w:val="1F3864"/>
+          <w:sz w:val="22"/>
+          <w:szCs w:val="22"/>
+        </w:rPr>
+        <w:t xml:space="preserve">Session Form</w:t>
+      </w:r>
+    </w:p>
+    <w:p>
+      <w:pPr>
+        <w:spacing w:after="160"/>
+      </w:pPr>
+      <w:r>
+        <w:rPr>
+          <w:rFonts w:ascii="Arial" w:cs="Arial" w:eastAsia="Arial" w:hAnsi="Arial"/>
+          <w:color w:val="000000"/>
+          <w:sz w:val="22"/>
+          <w:szCs w:val="22"/>
+        </w:rPr>
+        <w:t xml:space="preserve">The session form captures the following information:</w:t>
+      </w:r>
+    </w:p>
+    <w:p>
+      <w:pPr>
+        <w:pStyle w:val="ListParagraph"/>
+        <w:numPr>
+          <w:ilvl w:val="0"/>
+          <w:numId w:val="2"/>
+        </w:numPr>
+        <w:spacing w:after="80"/>
+      </w:pPr>
+      <w:r>
+        <w:rPr>
+          <w:rFonts w:ascii="Arial" w:cs="Arial" w:eastAsia="Arial" w:hAnsi="Arial"/>
+          <w:sz w:val="22"/>
+          <w:szCs w:val="22"/>
+        </w:rPr>
+        <w:t xml:space="preserve">Session date and time</w:t>
+      </w:r>
+    </w:p>
+    <w:p>
+      <w:pPr>
+        <w:pStyle w:val="ListParagraph"/>
+        <w:numPr>
+          <w:ilvl w:val="0"/>
+          <w:numId w:val="2"/>
+        </w:numPr>
+        <w:spacing w:after="80"/>
+      </w:pPr>
+      <w:r>
+        <w:rPr>
+          <w:rFonts w:ascii="Arial" w:cs="Arial" w:eastAsia="Arial" w:hAnsi="Arial"/>
+          <w:sz w:val="22"/>
+          <w:szCs w:val="22"/>
+        </w:rPr>
+        <w:t xml:space="preserve">Session duration</w:t>
+      </w:r>
+    </w:p>
+    <w:p>
+      <w:pPr>
+        <w:pStyle w:val="ListParagraph"/>
+        <w:numPr>
+          <w:ilvl w:val="0"/>
+          <w:numId w:val="2"/>
+        </w:numPr>
+        <w:spacing w:after="80"/>
+      </w:pPr>
+      <w:r>
+        <w:rPr>
+          <w:rFonts w:ascii="Arial" w:cs="Arial" w:eastAsia="Arial" w:hAnsi="Arial"/>
+          <w:sz w:val="22"/>
+          <w:szCs w:val="22"/>
+        </w:rPr>
+        <w:t xml:space="preserve">Attendees (who was present)</w:t>
+      </w:r>
+    </w:p>
+    <w:p>
+      <w:pPr>
+        <w:pStyle w:val="ListParagraph"/>
+        <w:numPr>
+          <w:ilvl w:val="0"/>
+          <w:numId w:val="2"/>
+        </w:numPr>
+        <w:spacing w:after="80"/>
+      </w:pPr>
+      <w:r>
+        <w:rPr>
+          <w:rFonts w:ascii="Arial" w:cs="Arial" w:eastAsia="Arial" w:hAnsi="Arial"/>
+          <w:sz w:val="22"/>
+          <w:szCs w:val="22"/>
+        </w:rPr>
+        <w:t xml:space="preserve">Session status</w:t>
+      </w:r>
+    </w:p>
+    <w:p>
+      <w:pPr>
+        <w:pStyle w:val="ListParagraph"/>
+        <w:numPr>
+          <w:ilvl w:val="0"/>
+          <w:numId w:val="2"/>
+        </w:numPr>
+        <w:spacing w:after="80"/>
+      </w:pPr>
+      <w:r>
+        <w:rPr>
+          <w:rFonts w:ascii="Arial" w:cs="Arial" w:eastAsia="Arial" w:hAnsi="Arial"/>
+          <w:sz w:val="22"/>
+          <w:szCs w:val="22"/>
+        </w:rPr>
+        <w:t xml:space="preserve">Session notes</w:t>
+      </w:r>
+    </w:p>
+    <w:p>
+      <w:pPr>
+        <w:pStyle w:val="ListParagraph"/>
+        <w:numPr>
+          <w:ilvl w:val="0"/>
+          <w:numId w:val="2"/>
+        </w:numPr>
+        <w:spacing w:after="80"/>
+      </w:pPr>
+      <w:r>
+        <w:rPr>
+          <w:rFonts w:ascii="Arial" w:cs="Arial" w:eastAsia="Arial" w:hAnsi="Arial"/>
+          <w:sz w:val="22"/>
+          <w:szCs w:val="22"/>
+        </w:rPr>
+        <w:t xml:space="preserve">Topics discussed</w:t>
+      </w:r>
+    </w:p>
+    <w:p>
+      <w:pPr>
+        <w:pStyle w:val="ListParagraph"/>
+        <w:numPr>
+          <w:ilvl w:val="0"/>
+          <w:numId w:val="2"/>
+        </w:numPr>
+        <w:spacing w:after="80"/>
+      </w:pPr>
+      <w:r>
+        <w:rPr>
+          <w:rFonts w:ascii="Arial" w:cs="Arial" w:eastAsia="Arial" w:hAnsi="Arial"/>
+          <w:sz w:val="22"/>
+          <w:szCs w:val="22"/>
+        </w:rPr>
+        <w:t xml:space="preserve">Next session date and time</w:t>
+      </w:r>
+    </w:p>
+    <w:p>
+      <w:pPr>
+        <w:spacing w:after="160"/>
+      </w:pPr>
+      <w:r>
+        <w:rPr>
+          <w:rFonts w:ascii="Arial" w:cs="Arial" w:eastAsia="Arial" w:hAnsi="Arial"/>
+          <w:color w:val="000000"/>
+          <w:sz w:val="22"/>
+          <w:szCs w:val="22"/>
+        </w:rPr>
+        <w:t xml:space="preserve">All fields auto-save as they are completed, consistent with the detail screen editing behavior.</w:t>
+      </w:r>
+    </w:p>
+    <w:p>
+      <w:pPr>
+        <w:spacing w:after="120" w:before="200"/>
+      </w:pPr>
+      <w:r>
+        <w:rPr>
+          <w:rFonts w:ascii="Arial" w:cs="Arial" w:eastAsia="Arial" w:hAnsi="Arial"/>
+          <w:b/>
+          <w:bCs/>
+          <w:color w:val="1F3864"/>
+          <w:sz w:val="22"/>
+          <w:szCs w:val="22"/>
+        </w:rPr>
+        <w:t xml:space="preserve">Calendar Invite Creation</w:t>
+      </w:r>
+    </w:p>
+    <w:p>
+      <w:pPr>
+        <w:spacing w:after="160"/>
+      </w:pPr>
+      <w:r>
+        <w:rPr>
+          <w:rFonts w:ascii="Arial" w:cs="Arial" w:eastAsia="Arial" w:hAnsi="Arial"/>
+          <w:color w:val="000000"/>
+          <w:sz w:val="22"/>
+          <w:szCs w:val="22"/>
+        </w:rPr>
+        <w:t xml:space="preserve">When the mentor enters a next session date and time, the application creates a Google Calendar event via the Google Calendar API (see Section 9). The event is created on the mentor’s Google Calendar with the following attendees automatically included:</w:t>
+      </w:r>
+    </w:p>
+    <w:p>
+      <w:pPr>
+        <w:pStyle w:val="ListParagraph"/>
+        <w:numPr>
+          <w:ilvl w:val="0"/>
+          <w:numId w:val="2"/>
+        </w:numPr>
+        <w:spacing w:after="80"/>
+      </w:pPr>
+      <w:r>
+        <w:rPr>
+          <w:rFonts w:ascii="Arial" w:cs="Arial" w:eastAsia="Arial" w:hAnsi="Arial"/>
+          <w:sz w:val="22"/>
+          <w:szCs w:val="22"/>
+        </w:rPr>
+        <w:t xml:space="preserve">All engagement contacts (the client and any additional contacts)</w:t>
+      </w:r>
+    </w:p>
+    <w:p>
+      <w:pPr>
+        <w:pStyle w:val="ListParagraph"/>
+        <w:numPr>
+          <w:ilvl w:val="0"/>
+          <w:numId w:val="2"/>
+        </w:numPr>
+        <w:spacing w:after="80"/>
+      </w:pPr>
+      <w:r>
+        <w:rPr>
+          <w:rFonts w:ascii="Arial" w:cs="Arial" w:eastAsia="Arial" w:hAnsi="Arial"/>
+          <w:sz w:val="22"/>
+          <w:szCs w:val="22"/>
+        </w:rPr>
+        <w:t xml:space="preserve">All co-mentors and SMEs assigned to the engagement</w:t>
+      </w:r>
+    </w:p>
+    <w:p>
+      <w:pPr>
+        <w:spacing w:after="160"/>
+      </w:pPr>
+      <w:r>
+        <w:rPr>
+          <w:rFonts w:ascii="Arial" w:cs="Arial" w:eastAsia="Arial" w:hAnsi="Arial"/>
+          <w:color w:val="000000"/>
+          <w:sz w:val="22"/>
+          <w:szCs w:val="22"/>
+        </w:rPr>
+        <w:t xml:space="preserve">Google Calendar automatically sends invite emails to all attendees when the event is created.</w:t>
+      </w:r>
+    </w:p>
+    <w:p>
+      <w:pPr>
+        <w:spacing w:after="120" w:before="200"/>
+      </w:pPr>
+      <w:r>
+        <w:rPr>
+          <w:rFonts w:ascii="Arial" w:cs="Arial" w:eastAsia="Arial" w:hAnsi="Arial"/>
+          <w:b/>
+          <w:bCs/>
+          <w:color w:val="1F3864"/>
+          <w:sz w:val="22"/>
+          <w:szCs w:val="22"/>
+        </w:rPr>
+        <w:t xml:space="preserve">Session Completion</w:t>
+      </w:r>
+    </w:p>
+    <w:p>
+      <w:pPr>
+        <w:spacing w:after="160"/>
+      </w:pPr>
+      <w:r>
+        <w:rPr>
+          <w:rFonts w:ascii="Arial" w:cs="Arial" w:eastAsia="Arial" w:hAnsi="Arial"/>
+          <w:color w:val="000000"/>
+          <w:sz w:val="22"/>
+          <w:szCs w:val="22"/>
+        </w:rPr>
+        <w:t xml:space="preserve">When the mentor presses the Done button on the session form, the application presents a session summary email workflow:</w:t>
       </w:r>
     </w:p>
     <w:p>
@@ -3155,7 +3551,7 @@
           <w:sz w:val="22"/>
           <w:szCs w:val="22"/>
         </w:rPr>
-        <w:t xml:space="preserve">The data source defines the entities, relationships, and fields involved.</w:t>
+        <w:t xml:space="preserve">The application composes an email pre-populated with the session notes and next steps from the session form.</w:t>
       </w:r>
     </w:p>
     <w:p>
@@ -3173,7 +3569,7 @@
           <w:sz w:val="22"/>
           <w:szCs w:val="22"/>
         </w:rPr>
-        <w:t xml:space="preserve">An AI-assisted process generates an initial detail screen component based on the data source definition.</w:t>
+        <w:t xml:space="preserve">The default recipient list includes all engagement contacts (client, co-mentors, SMEs). The mentor can deselect individual recipients.</w:t>
       </w:r>
     </w:p>
     <w:p>
@@ -3191,7 +3587,7 @@
           <w:sz w:val="22"/>
           <w:szCs w:val="22"/>
         </w:rPr>
-        <w:t xml:space="preserve">A developer reviews and enhances the generated component for optimal usability and efficiency.</w:t>
+        <w:t xml:space="preserve">The mentor can review and edit the email content before sending.</w:t>
       </w:r>
     </w:p>
     <w:p>
@@ -3209,43 +3605,7 @@
           <w:sz w:val="22"/>
           <w:szCs w:val="22"/>
         </w:rPr>
-        <w:t xml:space="preserve">The finished component is deployed with the application.</w:t>
-      </w:r>
-    </w:p>
-    <w:p>
-      <w:pPr>
-        <w:spacing w:after="160"/>
-      </w:pPr>
-      <w:r>
-        <w:rPr>
-          <w:rFonts w:ascii="Arial" w:cs="Arial" w:eastAsia="Arial" w:hAnsi="Arial"/>
-          <w:color w:val="000000"/>
-          <w:sz w:val="22"/>
-          <w:szCs w:val="22"/>
-        </w:rPr>
-        <w:t xml:space="preserve">Adding or modifying a detail screen requires a code deployment. Detail screens are not configurable at runtime.</w:t>
-      </w:r>
-    </w:p>
-    <w:p>
-      <w:r>
-        <w:br w:type="page"/>
-      </w:r>
-    </w:p>
-    <w:p>
-      <w:pPr>
-        <w:pStyle w:val="Heading1"/>
-        <w:spacing w:after="200" w:before="360"/>
-      </w:pPr>
-      <w:r>
-        <w:rPr>
-          <w:rFonts w:ascii="Arial" w:cs="Arial" w:eastAsia="Arial" w:hAnsi="Arial"/>
-          <w:b/>
-          <w:bCs/>
-          <w:color w:val="1F3864"/>
-          <w:sz w:val="28"/>
-          <w:szCs w:val="28"/>
-        </w:rPr>
-        <w:t xml:space="preserve">5. Administrator Experience</w:t>
+        <w:t xml:space="preserve">Pressing Send dispatches the email via the Gmail API (see Section 9). The sent email appears in the mentor’s Gmail sent folder.</w:t>
       </w:r>
     </w:p>
     <w:p>
@@ -3262,7 +3622,7 @@
           <w:sz w:val="24"/>
           <w:szCs w:val="24"/>
         </w:rPr>
-        <w:t xml:space="preserve">5.1 View Management (Admin and Super Admin)</w:t>
+        <w:t xml:space="preserve">4.9 Detail Screen Design</w:t>
       </w:r>
     </w:p>
     <w:p>
@@ -3276,7 +3636,7 @@
           <w:sz w:val="22"/>
           <w:szCs w:val="22"/>
         </w:rPr>
-        <w:t xml:space="preserve">Admins and Super Admins access a dedicated view management screen to create and manage views. The view management workflow:</w:t>
+        <w:t xml:space="preserve">The engagement detail screen and session form are custom code artifacts, not runtime configurations. They are designed for efficient use on large-format monitors, presenting all related entity data in a single screen to minimize navigation. The development workflow for detail screens is:</w:t>
       </w:r>
     </w:p>
     <w:p>
@@ -3294,7 +3654,7 @@
           <w:sz w:val="22"/>
           <w:szCs w:val="22"/>
         </w:rPr>
-        <w:t xml:space="preserve">Select an existing active data source as the foundation.</w:t>
+        <w:t xml:space="preserve">The data source defines the entities, relationships, and fields involved.</w:t>
       </w:r>
     </w:p>
     <w:p>
@@ -3312,7 +3672,7 @@
           <w:sz w:val="22"/>
           <w:szCs w:val="22"/>
         </w:rPr>
-        <w:t xml:space="preserve">Choose which columns from the data source to include, and set their display order.</w:t>
+        <w:t xml:space="preserve">An AI-assisted process generates an initial detail screen component based on the data source definition.</w:t>
       </w:r>
     </w:p>
     <w:p>
@@ -3330,7 +3690,7 @@
           <w:sz w:val="22"/>
           <w:szCs w:val="22"/>
         </w:rPr>
-        <w:t xml:space="preserve">Define any preset filter conditions.</w:t>
+        <w:t xml:space="preserve">A developer reviews and enhances the generated component for optimal usability and efficiency.</w:t>
       </w:r>
     </w:p>
     <w:p>
@@ -3348,7 +3708,74 @@
           <w:sz w:val="22"/>
           <w:szCs w:val="22"/>
         </w:rPr>
-        <w:t xml:space="preserve">Set the default sort column and direction.</w:t>
+        <w:t xml:space="preserve">The finished component is deployed with the application.</w:t>
+      </w:r>
+    </w:p>
+    <w:p>
+      <w:pPr>
+        <w:spacing w:after="160"/>
+      </w:pPr>
+      <w:r>
+        <w:rPr>
+          <w:rFonts w:ascii="Arial" w:cs="Arial" w:eastAsia="Arial" w:hAnsi="Arial"/>
+          <w:color w:val="000000"/>
+          <w:sz w:val="22"/>
+          <w:szCs w:val="22"/>
+        </w:rPr>
+        <w:t xml:space="preserve">Adding or modifying a detail screen requires a code deployment. Detail screens are not configurable at runtime.</w:t>
+      </w:r>
+    </w:p>
+    <w:p>
+      <w:r>
+        <w:br w:type="page"/>
+      </w:r>
+    </w:p>
+    <w:p>
+      <w:pPr>
+        <w:pStyle w:val="Heading1"/>
+        <w:spacing w:after="200" w:before="360"/>
+      </w:pPr>
+      <w:r>
+        <w:rPr>
+          <w:rFonts w:ascii="Arial" w:cs="Arial" w:eastAsia="Arial" w:hAnsi="Arial"/>
+          <w:b/>
+          <w:bCs/>
+          <w:color w:val="1F3864"/>
+          <w:sz w:val="28"/>
+          <w:szCs w:val="28"/>
+        </w:rPr>
+        <w:t xml:space="preserve">5. Administrator Experience</w:t>
+      </w:r>
+    </w:p>
+    <w:p>
+      <w:pPr>
+        <w:pStyle w:val="Heading2"/>
+        <w:spacing w:after="160" w:before="280"/>
+      </w:pPr>
+      <w:r>
+        <w:rPr>
+          <w:rFonts w:ascii="Arial" w:cs="Arial" w:eastAsia="Arial" w:hAnsi="Arial"/>
+          <w:b/>
+          <w:bCs/>
+          <w:color w:val="1F3864"/>
+          <w:sz w:val="24"/>
+          <w:szCs w:val="24"/>
+        </w:rPr>
+        <w:t xml:space="preserve">5.1 View Management (Admin and Super Admin)</w:t>
+      </w:r>
+    </w:p>
+    <w:p>
+      <w:pPr>
+        <w:spacing w:after="160"/>
+      </w:pPr>
+      <w:r>
+        <w:rPr>
+          <w:rFonts w:ascii="Arial" w:cs="Arial" w:eastAsia="Arial" w:hAnsi="Arial"/>
+          <w:color w:val="000000"/>
+          <w:sz w:val="22"/>
+          <w:szCs w:val="22"/>
+        </w:rPr>
+        <w:t xml:space="preserve">Admins and Super Admins access a dedicated view management screen to create and manage views. The view management workflow:</w:t>
       </w:r>
     </w:p>
     <w:p>
@@ -3366,7 +3793,7 @@
           <w:sz w:val="22"/>
           <w:szCs w:val="22"/>
         </w:rPr>
-        <w:t xml:space="preserve">Configure display options (hierarchy levels visible, default collapsed state).</w:t>
+        <w:t xml:space="preserve">Select an existing active data source as the foundation.</w:t>
       </w:r>
     </w:p>
     <w:p>
@@ -3384,52 +3811,7 @@
           <w:sz w:val="22"/>
           <w:szCs w:val="22"/>
         </w:rPr>
-        <w:t xml:space="preserve">Name and describe the view.</w:t>
-      </w:r>
-    </w:p>
-    <w:p>
-      <w:pPr>
-        <w:spacing w:after="160"/>
-      </w:pPr>
-      <w:r>
-        <w:rPr>
-          <w:rFonts w:ascii="Arial" w:cs="Arial" w:eastAsia="Arial" w:hAnsi="Arial"/>
-          <w:color w:val="000000"/>
-          <w:sz w:val="22"/>
-          <w:szCs w:val="22"/>
-        </w:rPr>
-        <w:t xml:space="preserve">Admins and Super Admins can also edit existing views and set views to Active or Inactive status. Inactive views are hidden from all users but their configuration is preserved. There is no permanent delete for views.</w:t>
-      </w:r>
-    </w:p>
-    <w:p>
-      <w:pPr>
-        <w:pStyle w:val="Heading2"/>
-        <w:spacing w:after="160" w:before="280"/>
-      </w:pPr>
-      <w:r>
-        <w:rPr>
-          <w:rFonts w:ascii="Arial" w:cs="Arial" w:eastAsia="Arial" w:hAnsi="Arial"/>
-          <w:b/>
-          <w:bCs/>
-          <w:color w:val="1F3864"/>
-          <w:sz w:val="24"/>
-          <w:szCs w:val="24"/>
-        </w:rPr>
-        <w:t xml:space="preserve">5.2 Data Source Management (Super Admin Only)</w:t>
-      </w:r>
-    </w:p>
-    <w:p>
-      <w:pPr>
-        <w:spacing w:after="160"/>
-      </w:pPr>
-      <w:r>
-        <w:rPr>
-          <w:rFonts w:ascii="Arial" w:cs="Arial" w:eastAsia="Arial" w:hAnsi="Arial"/>
-          <w:color w:val="000000"/>
-          <w:sz w:val="22"/>
-          <w:szCs w:val="22"/>
-        </w:rPr>
-        <w:t xml:space="preserve">Super Admins access a dedicated data source management screen to create and manage data sources. The data source management workflow:</w:t>
+        <w:t xml:space="preserve">Choose which columns from the data source to include, and set their display order.</w:t>
       </w:r>
     </w:p>
     <w:p>
@@ -3447,7 +3829,7 @@
           <w:sz w:val="22"/>
           <w:szCs w:val="22"/>
         </w:rPr>
-        <w:t xml:space="preserve">Name and describe the data source.</w:t>
+        <w:t xml:space="preserve">Define any preset filter conditions.</w:t>
       </w:r>
     </w:p>
     <w:p>
@@ -3465,7 +3847,7 @@
           <w:sz w:val="22"/>
           <w:szCs w:val="22"/>
         </w:rPr>
-        <w:t xml:space="preserve">Write the SQL query in a text editor.</w:t>
+        <w:t xml:space="preserve">Set the default sort column and direction.</w:t>
       </w:r>
     </w:p>
     <w:p>
@@ -3483,7 +3865,7 @@
           <w:sz w:val="22"/>
           <w:szCs w:val="22"/>
         </w:rPr>
-        <w:t xml:space="preserve">Use the test/preview function to execute the query and review results as a flat table. Test parameter values can be supplied for queries that include named parameters.</w:t>
+        <w:t xml:space="preserve">Configure display options (hierarchy levels visible, default collapsed state).</w:t>
       </w:r>
     </w:p>
     <w:p>
@@ -3501,7 +3883,52 @@
           <w:sz w:val="22"/>
           <w:szCs w:val="22"/>
         </w:rPr>
-        <w:t xml:space="preserve">Define column metadata: logical name, display label, and data type for each column returned by the query.</w:t>
+        <w:t xml:space="preserve">Name and describe the view.</w:t>
+      </w:r>
+    </w:p>
+    <w:p>
+      <w:pPr>
+        <w:spacing w:after="160"/>
+      </w:pPr>
+      <w:r>
+        <w:rPr>
+          <w:rFonts w:ascii="Arial" w:cs="Arial" w:eastAsia="Arial" w:hAnsi="Arial"/>
+          <w:color w:val="000000"/>
+          <w:sz w:val="22"/>
+          <w:szCs w:val="22"/>
+        </w:rPr>
+        <w:t xml:space="preserve">Admins and Super Admins can also edit existing views and set views to Active or Inactive status. Inactive views are hidden from all users but their configuration is preserved. There is no permanent delete for views.</w:t>
+      </w:r>
+    </w:p>
+    <w:p>
+      <w:pPr>
+        <w:pStyle w:val="Heading2"/>
+        <w:spacing w:after="160" w:before="280"/>
+      </w:pPr>
+      <w:r>
+        <w:rPr>
+          <w:rFonts w:ascii="Arial" w:cs="Arial" w:eastAsia="Arial" w:hAnsi="Arial"/>
+          <w:b/>
+          <w:bCs/>
+          <w:color w:val="1F3864"/>
+          <w:sz w:val="24"/>
+          <w:szCs w:val="24"/>
+        </w:rPr>
+        <w:t xml:space="preserve">5.2 Data Source Management (Super Admin Only)</w:t>
+      </w:r>
+    </w:p>
+    <w:p>
+      <w:pPr>
+        <w:spacing w:after="160"/>
+      </w:pPr>
+      <w:r>
+        <w:rPr>
+          <w:rFonts w:ascii="Arial" w:cs="Arial" w:eastAsia="Arial" w:hAnsi="Arial"/>
+          <w:color w:val="000000"/>
+          <w:sz w:val="22"/>
+          <w:szCs w:val="22"/>
+        </w:rPr>
+        <w:t xml:space="preserve">Super Admins access a dedicated data source management screen to create and manage data sources. The data source management workflow:</w:t>
       </w:r>
     </w:p>
     <w:p>
@@ -3519,7 +3946,7 @@
           <w:sz w:val="22"/>
           <w:szCs w:val="22"/>
         </w:rPr>
-        <w:t xml:space="preserve">Define the hierarchy: ordered levels with grouping keys and display columns.</w:t>
+        <w:t xml:space="preserve">Name and describe the data source.</w:t>
       </w:r>
     </w:p>
     <w:p>
@@ -3537,105 +3964,7 @@
           <w:sz w:val="22"/>
           <w:szCs w:val="22"/>
         </w:rPr>
-        <w:t xml:space="preserve">Declare named parameters.</w:t>
-      </w:r>
-    </w:p>
-    <w:p>
-      <w:pPr>
-        <w:spacing w:after="160"/>
-      </w:pPr>
-      <w:r>
-        <w:rPr>
-          <w:rFonts w:ascii="Arial" w:cs="Arial" w:eastAsia="Arial" w:hAnsi="Arial"/>
-          <w:color w:val="000000"/>
-          <w:sz w:val="22"/>
-          <w:szCs w:val="22"/>
-        </w:rPr>
-        <w:t xml:space="preserve">Super Admins can also edit existing data sources and set them to Active or Inactive status. Deactivating a data source automatically makes all dependent views unavailable. The application warns the Super Admin of affected views before confirming the deactivation. There is no permanent delete for data sources.</w:t>
-      </w:r>
-    </w:p>
-    <w:p>
-      <w:pPr>
-        <w:pStyle w:val="Heading2"/>
-        <w:spacing w:after="160" w:before="280"/>
-      </w:pPr>
-      <w:r>
-        <w:rPr>
-          <w:rFonts w:ascii="Arial" w:cs="Arial" w:eastAsia="Arial" w:hAnsi="Arial"/>
-          <w:b/>
-          <w:bCs/>
-          <w:color w:val="1F3864"/>
-          <w:sz w:val="24"/>
-          <w:szCs w:val="24"/>
-        </w:rPr>
-        <w:t xml:space="preserve">5.3 Test/Preview</w:t>
-      </w:r>
-    </w:p>
-    <w:p>
-      <w:pPr>
-        <w:spacing w:after="160"/>
-      </w:pPr>
-      <w:r>
-        <w:rPr>
-          <w:rFonts w:ascii="Arial" w:cs="Arial" w:eastAsia="Arial" w:hAnsi="Arial"/>
-          <w:color w:val="000000"/>
-          <w:sz w:val="22"/>
-          <w:szCs w:val="22"/>
-        </w:rPr>
-        <w:t xml:space="preserve">The data source management screen includes a test/preview function that executes the SQL query against the CRM database and displays the result set as a flat table. This allows the Super Admin to verify that the query returns the expected data before saving the data source definition. The preview does not apply hierarchy grouping — it shows the raw query results. Hierarchy grouping can be verified by creating a view on top of the data source.</w:t>
-      </w:r>
-    </w:p>
-    <w:p>
-      <w:r>
-        <w:br w:type="page"/>
-      </w:r>
-    </w:p>
-    <w:p>
-      <w:pPr>
-        <w:pStyle w:val="Heading1"/>
-        <w:spacing w:after="200" w:before="360"/>
-      </w:pPr>
-      <w:r>
-        <w:rPr>
-          <w:rFonts w:ascii="Arial" w:cs="Arial" w:eastAsia="Arial" w:hAnsi="Arial"/>
-          <w:b/>
-          <w:bCs/>
-          <w:color w:val="1F3864"/>
-          <w:sz w:val="28"/>
-          <w:szCs w:val="28"/>
-        </w:rPr>
-        <w:t xml:space="preserve">6. Data Access Layer</w:t>
-      </w:r>
-    </w:p>
-    <w:p>
-      <w:pPr>
-        <w:pStyle w:val="Heading2"/>
-        <w:spacing w:after="160" w:before="280"/>
-      </w:pPr>
-      <w:r>
-        <w:rPr>
-          <w:rFonts w:ascii="Arial" w:cs="Arial" w:eastAsia="Arial" w:hAnsi="Arial"/>
-          <w:b/>
-          <w:bCs/>
-          <w:color w:val="1F3864"/>
-          <w:sz w:val="24"/>
-          <w:szCs w:val="24"/>
-        </w:rPr>
-        <w:t xml:space="preserve">6.1 Read Path</w:t>
-      </w:r>
-    </w:p>
-    <w:p>
-      <w:pPr>
-        <w:spacing w:after="160"/>
-      </w:pPr>
-      <w:r>
-        <w:rPr>
-          <w:rFonts w:ascii="Arial" w:cs="Arial" w:eastAsia="Arial" w:hAnsi="Arial"/>
-          <w:color w:val="000000"/>
-          <w:sz w:val="22"/>
-          <w:szCs w:val="22"/>
-        </w:rPr>
-        <w:t xml:space="preserve">All read operations execute directly against the CRM database. When a user selects a view, the backend:</w:t>
+        <w:t xml:space="preserve">Write the SQL query in a text editor.</w:t>
       </w:r>
     </w:p>
     <w:p>
@@ -3653,7 +3982,7 @@
           <w:sz w:val="22"/>
           <w:szCs w:val="22"/>
         </w:rPr>
-        <w:t xml:space="preserve">Retrieves the view’s configuration, including its referenced data source.</w:t>
+        <w:t xml:space="preserve">Use the test/preview function to execute the query and review results as a flat table. Test parameter values can be supplied for queries that include named parameters.</w:t>
       </w:r>
     </w:p>
     <w:p>
@@ -3671,7 +4000,7 @@
           <w:sz w:val="22"/>
           <w:szCs w:val="22"/>
         </w:rPr>
-        <w:t xml:space="preserve">Retrieves the data source’s SQL query and parameter definitions.</w:t>
+        <w:t xml:space="preserve">Define column metadata: logical name, display label, and data type for each column returned by the query.</w:t>
       </w:r>
     </w:p>
     <w:p>
@@ -3689,7 +4018,7 @@
           <w:sz w:val="22"/>
           <w:szCs w:val="22"/>
         </w:rPr>
-        <w:t xml:space="preserve">Injects runtime parameter values (current user identity, role-based filter, any view-level filter values).</w:t>
+        <w:t xml:space="preserve">Define the hierarchy: ordered levels with grouping keys and display columns.</w:t>
       </w:r>
     </w:p>
     <w:p>
@@ -3707,7 +4036,105 @@
           <w:sz w:val="22"/>
           <w:szCs w:val="22"/>
         </w:rPr>
-        <w:t xml:space="preserve">Executes the parameterized query against the CRM database with the configured timeout.</w:t>
+        <w:t xml:space="preserve">Declare named parameters.</w:t>
+      </w:r>
+    </w:p>
+    <w:p>
+      <w:pPr>
+        <w:spacing w:after="160"/>
+      </w:pPr>
+      <w:r>
+        <w:rPr>
+          <w:rFonts w:ascii="Arial" w:cs="Arial" w:eastAsia="Arial" w:hAnsi="Arial"/>
+          <w:color w:val="000000"/>
+          <w:sz w:val="22"/>
+          <w:szCs w:val="22"/>
+        </w:rPr>
+        <w:t xml:space="preserve">Super Admins can also edit existing data sources and set them to Active or Inactive status. Deactivating a data source automatically makes all dependent views unavailable. The application warns the Super Admin of affected views before confirming the deactivation. There is no permanent delete for data sources.</w:t>
+      </w:r>
+    </w:p>
+    <w:p>
+      <w:pPr>
+        <w:pStyle w:val="Heading2"/>
+        <w:spacing w:after="160" w:before="280"/>
+      </w:pPr>
+      <w:r>
+        <w:rPr>
+          <w:rFonts w:ascii="Arial" w:cs="Arial" w:eastAsia="Arial" w:hAnsi="Arial"/>
+          <w:b/>
+          <w:bCs/>
+          <w:color w:val="1F3864"/>
+          <w:sz w:val="24"/>
+          <w:szCs w:val="24"/>
+        </w:rPr>
+        <w:t xml:space="preserve">5.3 Test/Preview</w:t>
+      </w:r>
+    </w:p>
+    <w:p>
+      <w:pPr>
+        <w:spacing w:after="160"/>
+      </w:pPr>
+      <w:r>
+        <w:rPr>
+          <w:rFonts w:ascii="Arial" w:cs="Arial" w:eastAsia="Arial" w:hAnsi="Arial"/>
+          <w:color w:val="000000"/>
+          <w:sz w:val="22"/>
+          <w:szCs w:val="22"/>
+        </w:rPr>
+        <w:t xml:space="preserve">The data source management screen includes a test/preview function that executes the SQL query against the CRM database and displays the result set as a flat table. This allows the Super Admin to verify that the query returns the expected data before saving the data source definition. The preview does not apply hierarchy grouping — it shows the raw query results. Hierarchy grouping can be verified by creating a view on top of the data source.</w:t>
+      </w:r>
+    </w:p>
+    <w:p>
+      <w:r>
+        <w:br w:type="page"/>
+      </w:r>
+    </w:p>
+    <w:p>
+      <w:pPr>
+        <w:pStyle w:val="Heading1"/>
+        <w:spacing w:after="200" w:before="360"/>
+      </w:pPr>
+      <w:r>
+        <w:rPr>
+          <w:rFonts w:ascii="Arial" w:cs="Arial" w:eastAsia="Arial" w:hAnsi="Arial"/>
+          <w:b/>
+          <w:bCs/>
+          <w:color w:val="1F3864"/>
+          <w:sz w:val="28"/>
+          <w:szCs w:val="28"/>
+        </w:rPr>
+        <w:t xml:space="preserve">6. Data Access Layer</w:t>
+      </w:r>
+    </w:p>
+    <w:p>
+      <w:pPr>
+        <w:pStyle w:val="Heading2"/>
+        <w:spacing w:after="160" w:before="280"/>
+      </w:pPr>
+      <w:r>
+        <w:rPr>
+          <w:rFonts w:ascii="Arial" w:cs="Arial" w:eastAsia="Arial" w:hAnsi="Arial"/>
+          <w:b/>
+          <w:bCs/>
+          <w:color w:val="1F3864"/>
+          <w:sz w:val="24"/>
+          <w:szCs w:val="24"/>
+        </w:rPr>
+        <w:t xml:space="preserve">6.1 Read Path</w:t>
+      </w:r>
+    </w:p>
+    <w:p>
+      <w:pPr>
+        <w:spacing w:after="160"/>
+      </w:pPr>
+      <w:r>
+        <w:rPr>
+          <w:rFonts w:ascii="Arial" w:cs="Arial" w:eastAsia="Arial" w:hAnsi="Arial"/>
+          <w:color w:val="000000"/>
+          <w:sz w:val="22"/>
+          <w:szCs w:val="22"/>
+        </w:rPr>
+        <w:t xml:space="preserve">All read operations execute directly against the CRM database. When a user selects a view, the backend:</w:t>
       </w:r>
     </w:p>
     <w:p>
@@ -3725,6 +4152,78 @@
           <w:sz w:val="22"/>
           <w:szCs w:val="22"/>
         </w:rPr>
+        <w:t xml:space="preserve">Retrieves the view’s configuration, including its referenced data source.</w:t>
+      </w:r>
+    </w:p>
+    <w:p>
+      <w:pPr>
+        <w:pStyle w:val="ListParagraph"/>
+        <w:numPr>
+          <w:ilvl w:val="0"/>
+          <w:numId w:val="3"/>
+        </w:numPr>
+        <w:spacing w:after="80"/>
+      </w:pPr>
+      <w:r>
+        <w:rPr>
+          <w:rFonts w:ascii="Arial" w:cs="Arial" w:eastAsia="Arial" w:hAnsi="Arial"/>
+          <w:sz w:val="22"/>
+          <w:szCs w:val="22"/>
+        </w:rPr>
+        <w:t xml:space="preserve">Retrieves the data source’s SQL query and parameter definitions.</w:t>
+      </w:r>
+    </w:p>
+    <w:p>
+      <w:pPr>
+        <w:pStyle w:val="ListParagraph"/>
+        <w:numPr>
+          <w:ilvl w:val="0"/>
+          <w:numId w:val="3"/>
+        </w:numPr>
+        <w:spacing w:after="80"/>
+      </w:pPr>
+      <w:r>
+        <w:rPr>
+          <w:rFonts w:ascii="Arial" w:cs="Arial" w:eastAsia="Arial" w:hAnsi="Arial"/>
+          <w:sz w:val="22"/>
+          <w:szCs w:val="22"/>
+        </w:rPr>
+        <w:t xml:space="preserve">Injects runtime parameter values (current user identity, role-based filter, any view-level filter values).</w:t>
+      </w:r>
+    </w:p>
+    <w:p>
+      <w:pPr>
+        <w:pStyle w:val="ListParagraph"/>
+        <w:numPr>
+          <w:ilvl w:val="0"/>
+          <w:numId w:val="3"/>
+        </w:numPr>
+        <w:spacing w:after="80"/>
+      </w:pPr>
+      <w:r>
+        <w:rPr>
+          <w:rFonts w:ascii="Arial" w:cs="Arial" w:eastAsia="Arial" w:hAnsi="Arial"/>
+          <w:sz w:val="22"/>
+          <w:szCs w:val="22"/>
+        </w:rPr>
+        <w:t xml:space="preserve">Executes the parameterized query against the CRM database with the configured timeout.</w:t>
+      </w:r>
+    </w:p>
+    <w:p>
+      <w:pPr>
+        <w:pStyle w:val="ListParagraph"/>
+        <w:numPr>
+          <w:ilvl w:val="0"/>
+          <w:numId w:val="3"/>
+        </w:numPr>
+        <w:spacing w:after="80"/>
+      </w:pPr>
+      <w:r>
+        <w:rPr>
+          <w:rFonts w:ascii="Arial" w:cs="Arial" w:eastAsia="Arial" w:hAnsi="Arial"/>
+          <w:sz w:val="22"/>
+          <w:szCs w:val="22"/>
+        </w:rPr>
         <w:t xml:space="preserve">Returns the result set to the frontend for client-side rendering, filtering, and sorting.</w:t>
       </w:r>
     </w:p>
@@ -3784,7 +4283,7 @@
           <w:sz w:val="22"/>
           <w:szCs w:val="22"/>
         </w:rPr>
-        <w:t xml:space="preserve">Write operations originate from the detail screen:</w:t>
+        <w:t xml:space="preserve">Write operations originate from the detail screen and session form:</w:t>
       </w:r>
     </w:p>
     <w:p>
@@ -3885,7 +4384,38 @@
           <w:sz w:val="24"/>
           <w:szCs w:val="24"/>
         </w:rPr>
-        <w:t xml:space="preserve">6.3 Data Consistency</w:t>
+        <w:t xml:space="preserve">6.3 External Service Path</w:t>
+      </w:r>
+    </w:p>
+    <w:p>
+      <w:pPr>
+        <w:spacing w:after="160"/>
+      </w:pPr>
+      <w:r>
+        <w:rPr>
+          <w:rFonts w:ascii="Arial" w:cs="Arial" w:eastAsia="Arial" w:hAnsi="Arial"/>
+          <w:color w:val="000000"/>
+          <w:sz w:val="22"/>
+          <w:szCs w:val="22"/>
+        </w:rPr>
+        <w:t xml:space="preserve">Calendar and email operations are routed through the Google Workspace APIs using the authenticated user’s OAuth credentials. The backend acts as the intermediary, holding the user’s OAuth tokens and making API calls on their behalf. These operations do not touch the CRM database or CRM API.</w:t>
+      </w:r>
+    </w:p>
+    <w:p>
+      <w:pPr>
+        <w:pStyle w:val="Heading2"/>
+        <w:spacing w:after="160" w:before="280"/>
+      </w:pPr>
+      <w:r>
+        <w:rPr>
+          <w:rFonts w:ascii="Arial" w:cs="Arial" w:eastAsia="Arial" w:hAnsi="Arial"/>
+          <w:b/>
+          <w:bCs/>
+          <w:color w:val="1F3864"/>
+          <w:sz w:val="24"/>
+          <w:szCs w:val="24"/>
+        </w:rPr>
+        <w:t xml:space="preserve">6.4 Data Consistency</w:t>
       </w:r>
     </w:p>
     <w:p>
@@ -3970,408 +4500,6 @@
           <w:szCs w:val="24"/>
         </w:rPr>
         <w:t xml:space="preserve">7.2 Authentication Endpoints</w:t>
-      </w:r>
-    </w:p>
-    <w:tbl>
-      <w:tblPr>
-        <w:tblW w:type="dxa" w:w="9360"/>
-        <w:tblBorders>
-          <w:top w:val="single" w:color="auto" w:sz="4"/>
-          <w:left w:val="single" w:color="auto" w:sz="4"/>
-          <w:bottom w:val="single" w:color="auto" w:sz="4"/>
-          <w:right w:val="single" w:color="auto" w:sz="4"/>
-          <w:insideH w:val="single" w:color="auto" w:sz="4"/>
-          <w:insideV w:val="single" w:color="auto" w:sz="4"/>
-        </w:tblBorders>
-      </w:tblPr>
-      <w:tblGrid>
-        <w:gridCol w:w="1800"/>
-        <w:gridCol w:w="2200"/>
-        <w:gridCol w:w="5360"/>
-      </w:tblGrid>
-      <w:tr>
-        <w:trPr>
-          <w:tblHeader/>
-        </w:trPr>
-        <w:tc>
-          <w:tcPr>
-            <w:tcW w:type="dxa" w:w="1800"/>
-            <w:tcBorders>
-              <w:top w:val="single" w:color="AAAAAA" w:sz="1"/>
-              <w:left w:val="single" w:color="AAAAAA" w:sz="1"/>
-              <w:bottom w:val="single" w:color="AAAAAA" w:sz="1"/>
-              <w:right w:val="single" w:color="AAAAAA" w:sz="1"/>
-            </w:tcBorders>
-            <w:shd w:fill="1F3864" w:val="clear"/>
-            <w:tcMar>
-              <w:top w:type="dxa" w:w="80"/>
-              <w:left w:type="dxa" w:w="120"/>
-              <w:bottom w:type="dxa" w:w="80"/>
-              <w:right w:type="dxa" w:w="120"/>
-            </w:tcMar>
-            <w:vAlign w:val="center"/>
-          </w:tcPr>
-          <w:p>
-            <w:r>
-              <w:rPr>
-                <w:rFonts w:ascii="Arial" w:cs="Arial" w:eastAsia="Arial" w:hAnsi="Arial"/>
-                <w:b/>
-                <w:bCs/>
-                <w:color w:val="FFFFFF"/>
-                <w:sz w:val="22"/>
-                <w:szCs w:val="22"/>
-              </w:rPr>
-              <w:t xml:space="preserve">Method</w:t>
-            </w:r>
-          </w:p>
-        </w:tc>
-        <w:tc>
-          <w:tcPr>
-            <w:tcW w:type="dxa" w:w="2200"/>
-            <w:tcBorders>
-              <w:top w:val="single" w:color="AAAAAA" w:sz="1"/>
-              <w:left w:val="single" w:color="AAAAAA" w:sz="1"/>
-              <w:bottom w:val="single" w:color="AAAAAA" w:sz="1"/>
-              <w:right w:val="single" w:color="AAAAAA" w:sz="1"/>
-            </w:tcBorders>
-            <w:shd w:fill="1F3864" w:val="clear"/>
-            <w:tcMar>
-              <w:top w:type="dxa" w:w="80"/>
-              <w:left w:type="dxa" w:w="120"/>
-              <w:bottom w:type="dxa" w:w="80"/>
-              <w:right w:type="dxa" w:w="120"/>
-            </w:tcMar>
-            <w:vAlign w:val="center"/>
-          </w:tcPr>
-          <w:p>
-            <w:r>
-              <w:rPr>
-                <w:rFonts w:ascii="Arial" w:cs="Arial" w:eastAsia="Arial" w:hAnsi="Arial"/>
-                <w:b/>
-                <w:bCs/>
-                <w:color w:val="FFFFFF"/>
-                <w:sz w:val="22"/>
-                <w:szCs w:val="22"/>
-              </w:rPr>
-              <w:t xml:space="preserve">Endpoint</w:t>
-            </w:r>
-          </w:p>
-        </w:tc>
-        <w:tc>
-          <w:tcPr>
-            <w:tcW w:type="dxa" w:w="5360"/>
-            <w:tcBorders>
-              <w:top w:val="single" w:color="AAAAAA" w:sz="1"/>
-              <w:left w:val="single" w:color="AAAAAA" w:sz="1"/>
-              <w:bottom w:val="single" w:color="AAAAAA" w:sz="1"/>
-              <w:right w:val="single" w:color="AAAAAA" w:sz="1"/>
-            </w:tcBorders>
-            <w:shd w:fill="1F3864" w:val="clear"/>
-            <w:tcMar>
-              <w:top w:type="dxa" w:w="80"/>
-              <w:left w:type="dxa" w:w="120"/>
-              <w:bottom w:type="dxa" w:w="80"/>
-              <w:right w:type="dxa" w:w="120"/>
-            </w:tcMar>
-            <w:vAlign w:val="center"/>
-          </w:tcPr>
-          <w:p>
-            <w:r>
-              <w:rPr>
-                <w:rFonts w:ascii="Arial" w:cs="Arial" w:eastAsia="Arial" w:hAnsi="Arial"/>
-                <w:b/>
-                <w:bCs/>
-                <w:color w:val="FFFFFF"/>
-                <w:sz w:val="22"/>
-                <w:szCs w:val="22"/>
-              </w:rPr>
-              <w:t xml:space="preserve">Description</w:t>
-            </w:r>
-          </w:p>
-        </w:tc>
-      </w:tr>
-      <w:tr>
-        <w:tc>
-          <w:tcPr>
-            <w:tcW w:type="dxa" w:w="1800"/>
-            <w:tcBorders>
-              <w:top w:val="single" w:color="AAAAAA" w:sz="1"/>
-              <w:left w:val="single" w:color="AAAAAA" w:sz="1"/>
-              <w:bottom w:val="single" w:color="AAAAAA" w:sz="1"/>
-              <w:right w:val="single" w:color="AAAAAA" w:sz="1"/>
-            </w:tcBorders>
-            <w:tcMar>
-              <w:top w:type="dxa" w:w="80"/>
-              <w:left w:type="dxa" w:w="120"/>
-              <w:bottom w:type="dxa" w:w="80"/>
-              <w:right w:type="dxa" w:w="120"/>
-            </w:tcMar>
-            <w:vAlign w:val="top"/>
-          </w:tcPr>
-          <w:p>
-            <w:r>
-              <w:rPr>
-                <w:rFonts w:ascii="Arial" w:cs="Arial" w:eastAsia="Arial" w:hAnsi="Arial"/>
-                <w:sz w:val="22"/>
-                <w:szCs w:val="22"/>
-              </w:rPr>
-              <w:t xml:space="preserve">POST</w:t>
-            </w:r>
-          </w:p>
-        </w:tc>
-        <w:tc>
-          <w:tcPr>
-            <w:tcW w:type="dxa" w:w="2200"/>
-            <w:tcBorders>
-              <w:top w:val="single" w:color="AAAAAA" w:sz="1"/>
-              <w:left w:val="single" w:color="AAAAAA" w:sz="1"/>
-              <w:bottom w:val="single" w:color="AAAAAA" w:sz="1"/>
-              <w:right w:val="single" w:color="AAAAAA" w:sz="1"/>
-            </w:tcBorders>
-            <w:tcMar>
-              <w:top w:type="dxa" w:w="80"/>
-              <w:left w:type="dxa" w:w="120"/>
-              <w:bottom w:type="dxa" w:w="80"/>
-              <w:right w:type="dxa" w:w="120"/>
-            </w:tcMar>
-            <w:vAlign w:val="top"/>
-          </w:tcPr>
-          <w:p>
-            <w:r>
-              <w:rPr>
-                <w:rFonts w:ascii="Arial" w:cs="Arial" w:eastAsia="Arial" w:hAnsi="Arial"/>
-                <w:sz w:val="22"/>
-                <w:szCs w:val="22"/>
-              </w:rPr>
-              <w:t xml:space="preserve">/auth/login</w:t>
-            </w:r>
-          </w:p>
-        </w:tc>
-        <w:tc>
-          <w:tcPr>
-            <w:tcW w:type="dxa" w:w="5360"/>
-            <w:tcBorders>
-              <w:top w:val="single" w:color="AAAAAA" w:sz="1"/>
-              <w:left w:val="single" w:color="AAAAAA" w:sz="1"/>
-              <w:bottom w:val="single" w:color="AAAAAA" w:sz="1"/>
-              <w:right w:val="single" w:color="AAAAAA" w:sz="1"/>
-            </w:tcBorders>
-            <w:tcMar>
-              <w:top w:type="dxa" w:w="80"/>
-              <w:left w:type="dxa" w:w="120"/>
-              <w:bottom w:type="dxa" w:w="80"/>
-              <w:right w:type="dxa" w:w="120"/>
-            </w:tcMar>
-            <w:vAlign w:val="top"/>
-          </w:tcPr>
-          <w:p>
-            <w:r>
-              <w:rPr>
-                <w:rFonts w:ascii="Arial" w:cs="Arial" w:eastAsia="Arial" w:hAnsi="Arial"/>
-                <w:sz w:val="22"/>
-                <w:szCs w:val="22"/>
-              </w:rPr>
-              <w:t xml:space="preserve">Authenticate with CRM credentials. Returns an access token and the user’s application role.</w:t>
-            </w:r>
-          </w:p>
-        </w:tc>
-      </w:tr>
-      <w:tr>
-        <w:tc>
-          <w:tcPr>
-            <w:tcW w:type="dxa" w:w="1800"/>
-            <w:tcBorders>
-              <w:top w:val="single" w:color="AAAAAA" w:sz="1"/>
-              <w:left w:val="single" w:color="AAAAAA" w:sz="1"/>
-              <w:bottom w:val="single" w:color="AAAAAA" w:sz="1"/>
-              <w:right w:val="single" w:color="AAAAAA" w:sz="1"/>
-            </w:tcBorders>
-            <w:shd w:fill="F2F7FB" w:val="clear"/>
-            <w:tcMar>
-              <w:top w:type="dxa" w:w="80"/>
-              <w:left w:type="dxa" w:w="120"/>
-              <w:bottom w:type="dxa" w:w="80"/>
-              <w:right w:type="dxa" w:w="120"/>
-            </w:tcMar>
-            <w:vAlign w:val="top"/>
-          </w:tcPr>
-          <w:p>
-            <w:r>
-              <w:rPr>
-                <w:rFonts w:ascii="Arial" w:cs="Arial" w:eastAsia="Arial" w:hAnsi="Arial"/>
-                <w:sz w:val="22"/>
-                <w:szCs w:val="22"/>
-              </w:rPr>
-              <w:t xml:space="preserve">POST</w:t>
-            </w:r>
-          </w:p>
-        </w:tc>
-        <w:tc>
-          <w:tcPr>
-            <w:tcW w:type="dxa" w:w="2200"/>
-            <w:tcBorders>
-              <w:top w:val="single" w:color="AAAAAA" w:sz="1"/>
-              <w:left w:val="single" w:color="AAAAAA" w:sz="1"/>
-              <w:bottom w:val="single" w:color="AAAAAA" w:sz="1"/>
-              <w:right w:val="single" w:color="AAAAAA" w:sz="1"/>
-            </w:tcBorders>
-            <w:shd w:fill="F2F7FB" w:val="clear"/>
-            <w:tcMar>
-              <w:top w:type="dxa" w:w="80"/>
-              <w:left w:type="dxa" w:w="120"/>
-              <w:bottom w:type="dxa" w:w="80"/>
-              <w:right w:type="dxa" w:w="120"/>
-            </w:tcMar>
-            <w:vAlign w:val="top"/>
-          </w:tcPr>
-          <w:p>
-            <w:r>
-              <w:rPr>
-                <w:rFonts w:ascii="Arial" w:cs="Arial" w:eastAsia="Arial" w:hAnsi="Arial"/>
-                <w:sz w:val="22"/>
-                <w:szCs w:val="22"/>
-              </w:rPr>
-              <w:t xml:space="preserve">/auth/logout</w:t>
-            </w:r>
-          </w:p>
-        </w:tc>
-        <w:tc>
-          <w:tcPr>
-            <w:tcW w:type="dxa" w:w="5360"/>
-            <w:tcBorders>
-              <w:top w:val="single" w:color="AAAAAA" w:sz="1"/>
-              <w:left w:val="single" w:color="AAAAAA" w:sz="1"/>
-              <w:bottom w:val="single" w:color="AAAAAA" w:sz="1"/>
-              <w:right w:val="single" w:color="AAAAAA" w:sz="1"/>
-            </w:tcBorders>
-            <w:shd w:fill="F2F7FB" w:val="clear"/>
-            <w:tcMar>
-              <w:top w:type="dxa" w:w="80"/>
-              <w:left w:type="dxa" w:w="120"/>
-              <w:bottom w:type="dxa" w:w="80"/>
-              <w:right w:type="dxa" w:w="120"/>
-            </w:tcMar>
-            <w:vAlign w:val="top"/>
-          </w:tcPr>
-          <w:p>
-            <w:r>
-              <w:rPr>
-                <w:rFonts w:ascii="Arial" w:cs="Arial" w:eastAsia="Arial" w:hAnsi="Arial"/>
-                <w:sz w:val="22"/>
-                <w:szCs w:val="22"/>
-              </w:rPr>
-              <w:t xml:space="preserve">Invalidate the current token.</w:t>
-            </w:r>
-          </w:p>
-        </w:tc>
-      </w:tr>
-      <w:tr>
-        <w:tc>
-          <w:tcPr>
-            <w:tcW w:type="dxa" w:w="1800"/>
-            <w:tcBorders>
-              <w:top w:val="single" w:color="AAAAAA" w:sz="1"/>
-              <w:left w:val="single" w:color="AAAAAA" w:sz="1"/>
-              <w:bottom w:val="single" w:color="AAAAAA" w:sz="1"/>
-              <w:right w:val="single" w:color="AAAAAA" w:sz="1"/>
-            </w:tcBorders>
-            <w:tcMar>
-              <w:top w:type="dxa" w:w="80"/>
-              <w:left w:type="dxa" w:w="120"/>
-              <w:bottom w:type="dxa" w:w="80"/>
-              <w:right w:type="dxa" w:w="120"/>
-            </w:tcMar>
-            <w:vAlign w:val="top"/>
-          </w:tcPr>
-          <w:p>
-            <w:r>
-              <w:rPr>
-                <w:rFonts w:ascii="Arial" w:cs="Arial" w:eastAsia="Arial" w:hAnsi="Arial"/>
-                <w:sz w:val="22"/>
-                <w:szCs w:val="22"/>
-              </w:rPr>
-              <w:t xml:space="preserve">GET</w:t>
-            </w:r>
-          </w:p>
-        </w:tc>
-        <w:tc>
-          <w:tcPr>
-            <w:tcW w:type="dxa" w:w="2200"/>
-            <w:tcBorders>
-              <w:top w:val="single" w:color="AAAAAA" w:sz="1"/>
-              <w:left w:val="single" w:color="AAAAAA" w:sz="1"/>
-              <w:bottom w:val="single" w:color="AAAAAA" w:sz="1"/>
-              <w:right w:val="single" w:color="AAAAAA" w:sz="1"/>
-            </w:tcBorders>
-            <w:tcMar>
-              <w:top w:type="dxa" w:w="80"/>
-              <w:left w:type="dxa" w:w="120"/>
-              <w:bottom w:type="dxa" w:w="80"/>
-              <w:right w:type="dxa" w:w="120"/>
-            </w:tcMar>
-            <w:vAlign w:val="top"/>
-          </w:tcPr>
-          <w:p>
-            <w:r>
-              <w:rPr>
-                <w:rFonts w:ascii="Arial" w:cs="Arial" w:eastAsia="Arial" w:hAnsi="Arial"/>
-                <w:sz w:val="22"/>
-                <w:szCs w:val="22"/>
-              </w:rPr>
-              <w:t xml:space="preserve">/auth/me</w:t>
-            </w:r>
-          </w:p>
-        </w:tc>
-        <w:tc>
-          <w:tcPr>
-            <w:tcW w:type="dxa" w:w="5360"/>
-            <w:tcBorders>
-              <w:top w:val="single" w:color="AAAAAA" w:sz="1"/>
-              <w:left w:val="single" w:color="AAAAAA" w:sz="1"/>
-              <w:bottom w:val="single" w:color="AAAAAA" w:sz="1"/>
-              <w:right w:val="single" w:color="AAAAAA" w:sz="1"/>
-            </w:tcBorders>
-            <w:tcMar>
-              <w:top w:type="dxa" w:w="80"/>
-              <w:left w:type="dxa" w:w="120"/>
-              <w:bottom w:type="dxa" w:w="80"/>
-              <w:right w:type="dxa" w:w="120"/>
-            </w:tcMar>
-            <w:vAlign w:val="top"/>
-          </w:tcPr>
-          <w:p>
-            <w:r>
-              <w:rPr>
-                <w:rFonts w:ascii="Arial" w:cs="Arial" w:eastAsia="Arial" w:hAnsi="Arial"/>
-                <w:sz w:val="22"/>
-                <w:szCs w:val="22"/>
-              </w:rPr>
-              <w:t xml:space="preserve">Return the current user’s profile, role, and token expiry.</w:t>
-            </w:r>
-          </w:p>
-        </w:tc>
-      </w:tr>
-    </w:tbl>
-    <w:p>
-      <w:pPr>
-        <w:spacing w:after="160"/>
-      </w:pPr>
-    </w:p>
-    <w:p>
-      <w:pPr>
-        <w:pStyle w:val="Heading2"/>
-        <w:spacing w:after="160" w:before="280"/>
-      </w:pPr>
-      <w:r>
-        <w:rPr>
-          <w:rFonts w:ascii="Arial" w:cs="Arial" w:eastAsia="Arial" w:hAnsi="Arial"/>
-          <w:b/>
-          <w:bCs/>
-          <w:color w:val="1F3864"/>
-          <w:sz w:val="24"/>
-          <w:szCs w:val="24"/>
-        </w:rPr>
-        <w:t xml:space="preserve">7.3 View Endpoints</w:t>
       </w:r>
     </w:p>
     <w:tbl>
@@ -4517,7 +4645,7 @@
                 <w:sz w:val="22"/>
                 <w:szCs w:val="22"/>
               </w:rPr>
-              <w:t xml:space="preserve">GET</w:t>
+              <w:t xml:space="preserve">POST</w:t>
             </w:r>
           </w:p>
         </w:tc>
@@ -4545,7 +4673,7 @@
                 <w:sz w:val="22"/>
                 <w:szCs w:val="22"/>
               </w:rPr>
-              <w:t xml:space="preserve">/views</w:t>
+              <w:t xml:space="preserve">/auth/login</w:t>
             </w:r>
           </w:p>
         </w:tc>
@@ -4573,7 +4701,7 @@
                 <w:sz w:val="22"/>
                 <w:szCs w:val="22"/>
               </w:rPr>
-              <w:t xml:space="preserve">List all active views available to the current user.</w:t>
+              <w:t xml:space="preserve">Authenticate with CRM credentials. Returns an access token and the user’s application role.</w:t>
             </w:r>
           </w:p>
         </w:tc>
@@ -4604,6 +4732,94 @@
                 <w:sz w:val="22"/>
                 <w:szCs w:val="22"/>
               </w:rPr>
+              <w:t xml:space="preserve">POST</w:t>
+            </w:r>
+          </w:p>
+        </w:tc>
+        <w:tc>
+          <w:tcPr>
+            <w:tcW w:type="dxa" w:w="2800"/>
+            <w:tcBorders>
+              <w:top w:val="single" w:color="AAAAAA" w:sz="1"/>
+              <w:left w:val="single" w:color="AAAAAA" w:sz="1"/>
+              <w:bottom w:val="single" w:color="AAAAAA" w:sz="1"/>
+              <w:right w:val="single" w:color="AAAAAA" w:sz="1"/>
+            </w:tcBorders>
+            <w:shd w:fill="F2F7FB" w:val="clear"/>
+            <w:tcMar>
+              <w:top w:type="dxa" w:w="80"/>
+              <w:left w:type="dxa" w:w="120"/>
+              <w:bottom w:type="dxa" w:w="80"/>
+              <w:right w:type="dxa" w:w="120"/>
+            </w:tcMar>
+            <w:vAlign w:val="top"/>
+          </w:tcPr>
+          <w:p>
+            <w:r>
+              <w:rPr>
+                <w:rFonts w:ascii="Arial" w:cs="Arial" w:eastAsia="Arial" w:hAnsi="Arial"/>
+                <w:sz w:val="22"/>
+                <w:szCs w:val="22"/>
+              </w:rPr>
+              <w:t xml:space="preserve">/auth/logout</w:t>
+            </w:r>
+          </w:p>
+        </w:tc>
+        <w:tc>
+          <w:tcPr>
+            <w:tcW w:type="dxa" w:w="4760"/>
+            <w:tcBorders>
+              <w:top w:val="single" w:color="AAAAAA" w:sz="1"/>
+              <w:left w:val="single" w:color="AAAAAA" w:sz="1"/>
+              <w:bottom w:val="single" w:color="AAAAAA" w:sz="1"/>
+              <w:right w:val="single" w:color="AAAAAA" w:sz="1"/>
+            </w:tcBorders>
+            <w:shd w:fill="F2F7FB" w:val="clear"/>
+            <w:tcMar>
+              <w:top w:type="dxa" w:w="80"/>
+              <w:left w:type="dxa" w:w="120"/>
+              <w:bottom w:type="dxa" w:w="80"/>
+              <w:right w:type="dxa" w:w="120"/>
+            </w:tcMar>
+            <w:vAlign w:val="top"/>
+          </w:tcPr>
+          <w:p>
+            <w:r>
+              <w:rPr>
+                <w:rFonts w:ascii="Arial" w:cs="Arial" w:eastAsia="Arial" w:hAnsi="Arial"/>
+                <w:sz w:val="22"/>
+                <w:szCs w:val="22"/>
+              </w:rPr>
+              <w:t xml:space="preserve">Invalidate the current token.</w:t>
+            </w:r>
+          </w:p>
+        </w:tc>
+      </w:tr>
+      <w:tr>
+        <w:tc>
+          <w:tcPr>
+            <w:tcW w:type="dxa" w:w="1800"/>
+            <w:tcBorders>
+              <w:top w:val="single" w:color="AAAAAA" w:sz="1"/>
+              <w:left w:val="single" w:color="AAAAAA" w:sz="1"/>
+              <w:bottom w:val="single" w:color="AAAAAA" w:sz="1"/>
+              <w:right w:val="single" w:color="AAAAAA" w:sz="1"/>
+            </w:tcBorders>
+            <w:tcMar>
+              <w:top w:type="dxa" w:w="80"/>
+              <w:left w:type="dxa" w:w="120"/>
+              <w:bottom w:type="dxa" w:w="80"/>
+              <w:right w:type="dxa" w:w="120"/>
+            </w:tcMar>
+            <w:vAlign w:val="top"/>
+          </w:tcPr>
+          <w:p>
+            <w:r>
+              <w:rPr>
+                <w:rFonts w:ascii="Arial" w:cs="Arial" w:eastAsia="Arial" w:hAnsi="Arial"/>
+                <w:sz w:val="22"/>
+                <w:szCs w:val="22"/>
+              </w:rPr>
               <w:t xml:space="preserve">GET</w:t>
             </w:r>
           </w:p>
@@ -4617,6 +4833,64 @@
               <w:bottom w:val="single" w:color="AAAAAA" w:sz="1"/>
               <w:right w:val="single" w:color="AAAAAA" w:sz="1"/>
             </w:tcBorders>
+            <w:tcMar>
+              <w:top w:type="dxa" w:w="80"/>
+              <w:left w:type="dxa" w:w="120"/>
+              <w:bottom w:type="dxa" w:w="80"/>
+              <w:right w:type="dxa" w:w="120"/>
+            </w:tcMar>
+            <w:vAlign w:val="top"/>
+          </w:tcPr>
+          <w:p>
+            <w:r>
+              <w:rPr>
+                <w:rFonts w:ascii="Arial" w:cs="Arial" w:eastAsia="Arial" w:hAnsi="Arial"/>
+                <w:sz w:val="22"/>
+                <w:szCs w:val="22"/>
+              </w:rPr>
+              <w:t xml:space="preserve">/auth/me</w:t>
+            </w:r>
+          </w:p>
+        </w:tc>
+        <w:tc>
+          <w:tcPr>
+            <w:tcW w:type="dxa" w:w="4760"/>
+            <w:tcBorders>
+              <w:top w:val="single" w:color="AAAAAA" w:sz="1"/>
+              <w:left w:val="single" w:color="AAAAAA" w:sz="1"/>
+              <w:bottom w:val="single" w:color="AAAAAA" w:sz="1"/>
+              <w:right w:val="single" w:color="AAAAAA" w:sz="1"/>
+            </w:tcBorders>
+            <w:tcMar>
+              <w:top w:type="dxa" w:w="80"/>
+              <w:left w:type="dxa" w:w="120"/>
+              <w:bottom w:type="dxa" w:w="80"/>
+              <w:right w:type="dxa" w:w="120"/>
+            </w:tcMar>
+            <w:vAlign w:val="top"/>
+          </w:tcPr>
+          <w:p>
+            <w:r>
+              <w:rPr>
+                <w:rFonts w:ascii="Arial" w:cs="Arial" w:eastAsia="Arial" w:hAnsi="Arial"/>
+                <w:sz w:val="22"/>
+                <w:szCs w:val="22"/>
+              </w:rPr>
+              <w:t xml:space="preserve">Return the current user’s profile, role, and token expiry.</w:t>
+            </w:r>
+          </w:p>
+        </w:tc>
+      </w:tr>
+      <w:tr>
+        <w:tc>
+          <w:tcPr>
+            <w:tcW w:type="dxa" w:w="1800"/>
+            <w:tcBorders>
+              <w:top w:val="single" w:color="AAAAAA" w:sz="1"/>
+              <w:left w:val="single" w:color="AAAAAA" w:sz="1"/>
+              <w:bottom w:val="single" w:color="AAAAAA" w:sz="1"/>
+              <w:right w:val="single" w:color="AAAAAA" w:sz="1"/>
+            </w:tcBorders>
             <w:shd w:fill="F2F7FB" w:val="clear"/>
             <w:tcMar>
               <w:top w:type="dxa" w:w="80"/>
@@ -4633,7 +4907,36 @@
                 <w:sz w:val="22"/>
                 <w:szCs w:val="22"/>
               </w:rPr>
-              <w:t xml:space="preserve">/views/:id/data</w:t>
+              <w:t xml:space="preserve">GET</w:t>
+            </w:r>
+          </w:p>
+        </w:tc>
+        <w:tc>
+          <w:tcPr>
+            <w:tcW w:type="dxa" w:w="2800"/>
+            <w:tcBorders>
+              <w:top w:val="single" w:color="AAAAAA" w:sz="1"/>
+              <w:left w:val="single" w:color="AAAAAA" w:sz="1"/>
+              <w:bottom w:val="single" w:color="AAAAAA" w:sz="1"/>
+              <w:right w:val="single" w:color="AAAAAA" w:sz="1"/>
+            </w:tcBorders>
+            <w:shd w:fill="F2F7FB" w:val="clear"/>
+            <w:tcMar>
+              <w:top w:type="dxa" w:w="80"/>
+              <w:left w:type="dxa" w:w="120"/>
+              <w:bottom w:type="dxa" w:w="80"/>
+              <w:right w:type="dxa" w:w="120"/>
+            </w:tcMar>
+            <w:vAlign w:val="top"/>
+          </w:tcPr>
+          <w:p>
+            <w:r>
+              <w:rPr>
+                <w:rFonts w:ascii="Arial" w:cs="Arial" w:eastAsia="Arial" w:hAnsi="Arial"/>
+                <w:sz w:val="22"/>
+                <w:szCs w:val="22"/>
+              </w:rPr>
+              <w:t xml:space="preserve">/auth/google</w:t>
             </w:r>
           </w:p>
         </w:tc>
@@ -4662,7 +4965,93 @@
                 <w:sz w:val="22"/>
                 <w:szCs w:val="22"/>
               </w:rPr>
-              <w:t xml:space="preserve">Execute the view’s underlying data source query with role-based parameters and view-level filters. Returns the full result set.</w:t>
+              <w:t xml:space="preserve">Initiate Google Workspace OAuth flow. Redirects the user to Google’s consent screen.</w:t>
+            </w:r>
+          </w:p>
+        </w:tc>
+      </w:tr>
+      <w:tr>
+        <w:tc>
+          <w:tcPr>
+            <w:tcW w:type="dxa" w:w="1800"/>
+            <w:tcBorders>
+              <w:top w:val="single" w:color="AAAAAA" w:sz="1"/>
+              <w:left w:val="single" w:color="AAAAAA" w:sz="1"/>
+              <w:bottom w:val="single" w:color="AAAAAA" w:sz="1"/>
+              <w:right w:val="single" w:color="AAAAAA" w:sz="1"/>
+            </w:tcBorders>
+            <w:tcMar>
+              <w:top w:type="dxa" w:w="80"/>
+              <w:left w:type="dxa" w:w="120"/>
+              <w:bottom w:type="dxa" w:w="80"/>
+              <w:right w:type="dxa" w:w="120"/>
+            </w:tcMar>
+            <w:vAlign w:val="top"/>
+          </w:tcPr>
+          <w:p>
+            <w:r>
+              <w:rPr>
+                <w:rFonts w:ascii="Arial" w:cs="Arial" w:eastAsia="Arial" w:hAnsi="Arial"/>
+                <w:sz w:val="22"/>
+                <w:szCs w:val="22"/>
+              </w:rPr>
+              <w:t xml:space="preserve">GET</w:t>
+            </w:r>
+          </w:p>
+        </w:tc>
+        <w:tc>
+          <w:tcPr>
+            <w:tcW w:type="dxa" w:w="2800"/>
+            <w:tcBorders>
+              <w:top w:val="single" w:color="AAAAAA" w:sz="1"/>
+              <w:left w:val="single" w:color="AAAAAA" w:sz="1"/>
+              <w:bottom w:val="single" w:color="AAAAAA" w:sz="1"/>
+              <w:right w:val="single" w:color="AAAAAA" w:sz="1"/>
+            </w:tcBorders>
+            <w:tcMar>
+              <w:top w:type="dxa" w:w="80"/>
+              <w:left w:type="dxa" w:w="120"/>
+              <w:bottom w:type="dxa" w:w="80"/>
+              <w:right w:type="dxa" w:w="120"/>
+            </w:tcMar>
+            <w:vAlign w:val="top"/>
+          </w:tcPr>
+          <w:p>
+            <w:r>
+              <w:rPr>
+                <w:rFonts w:ascii="Arial" w:cs="Arial" w:eastAsia="Arial" w:hAnsi="Arial"/>
+                <w:sz w:val="22"/>
+                <w:szCs w:val="22"/>
+              </w:rPr>
+              <w:t xml:space="preserve">/auth/google/callback</w:t>
+            </w:r>
+          </w:p>
+        </w:tc>
+        <w:tc>
+          <w:tcPr>
+            <w:tcW w:type="dxa" w:w="4760"/>
+            <w:tcBorders>
+              <w:top w:val="single" w:color="AAAAAA" w:sz="1"/>
+              <w:left w:val="single" w:color="AAAAAA" w:sz="1"/>
+              <w:bottom w:val="single" w:color="AAAAAA" w:sz="1"/>
+              <w:right w:val="single" w:color="AAAAAA" w:sz="1"/>
+            </w:tcBorders>
+            <w:tcMar>
+              <w:top w:type="dxa" w:w="80"/>
+              <w:left w:type="dxa" w:w="120"/>
+              <w:bottom w:type="dxa" w:w="80"/>
+              <w:right w:type="dxa" w:w="120"/>
+            </w:tcMar>
+            <w:vAlign w:val="top"/>
+          </w:tcPr>
+          <w:p>
+            <w:r>
+              <w:rPr>
+                <w:rFonts w:ascii="Arial" w:cs="Arial" w:eastAsia="Arial" w:hAnsi="Arial"/>
+                <w:sz w:val="22"/>
+                <w:szCs w:val="22"/>
+              </w:rPr>
+              <w:t xml:space="preserve">Handle the OAuth callback from Google. Stores the user’s OAuth tokens.</w:t>
             </w:r>
           </w:p>
         </w:tc>
@@ -4687,7 +5076,7 @@
           <w:sz w:val="24"/>
           <w:szCs w:val="24"/>
         </w:rPr>
-        <w:t xml:space="preserve">7.4 View Management Endpoints (Admin and Super Admin)</w:t>
+        <w:t xml:space="preserve">7.3 View Endpoints</w:t>
       </w:r>
     </w:p>
     <w:tbl>
@@ -4833,6 +5222,322 @@
                 <w:sz w:val="22"/>
                 <w:szCs w:val="22"/>
               </w:rPr>
+              <w:t xml:space="preserve">GET</w:t>
+            </w:r>
+          </w:p>
+        </w:tc>
+        <w:tc>
+          <w:tcPr>
+            <w:tcW w:type="dxa" w:w="2800"/>
+            <w:tcBorders>
+              <w:top w:val="single" w:color="AAAAAA" w:sz="1"/>
+              <w:left w:val="single" w:color="AAAAAA" w:sz="1"/>
+              <w:bottom w:val="single" w:color="AAAAAA" w:sz="1"/>
+              <w:right w:val="single" w:color="AAAAAA" w:sz="1"/>
+            </w:tcBorders>
+            <w:tcMar>
+              <w:top w:type="dxa" w:w="80"/>
+              <w:left w:type="dxa" w:w="120"/>
+              <w:bottom w:type="dxa" w:w="80"/>
+              <w:right w:type="dxa" w:w="120"/>
+            </w:tcMar>
+            <w:vAlign w:val="top"/>
+          </w:tcPr>
+          <w:p>
+            <w:r>
+              <w:rPr>
+                <w:rFonts w:ascii="Arial" w:cs="Arial" w:eastAsia="Arial" w:hAnsi="Arial"/>
+                <w:sz w:val="22"/>
+                <w:szCs w:val="22"/>
+              </w:rPr>
+              <w:t xml:space="preserve">/views</w:t>
+            </w:r>
+          </w:p>
+        </w:tc>
+        <w:tc>
+          <w:tcPr>
+            <w:tcW w:type="dxa" w:w="4760"/>
+            <w:tcBorders>
+              <w:top w:val="single" w:color="AAAAAA" w:sz="1"/>
+              <w:left w:val="single" w:color="AAAAAA" w:sz="1"/>
+              <w:bottom w:val="single" w:color="AAAAAA" w:sz="1"/>
+              <w:right w:val="single" w:color="AAAAAA" w:sz="1"/>
+            </w:tcBorders>
+            <w:tcMar>
+              <w:top w:type="dxa" w:w="80"/>
+              <w:left w:type="dxa" w:w="120"/>
+              <w:bottom w:type="dxa" w:w="80"/>
+              <w:right w:type="dxa" w:w="120"/>
+            </w:tcMar>
+            <w:vAlign w:val="top"/>
+          </w:tcPr>
+          <w:p>
+            <w:r>
+              <w:rPr>
+                <w:rFonts w:ascii="Arial" w:cs="Arial" w:eastAsia="Arial" w:hAnsi="Arial"/>
+                <w:sz w:val="22"/>
+                <w:szCs w:val="22"/>
+              </w:rPr>
+              <w:t xml:space="preserve">List all active views available to the current user.</w:t>
+            </w:r>
+          </w:p>
+        </w:tc>
+      </w:tr>
+      <w:tr>
+        <w:tc>
+          <w:tcPr>
+            <w:tcW w:type="dxa" w:w="1800"/>
+            <w:tcBorders>
+              <w:top w:val="single" w:color="AAAAAA" w:sz="1"/>
+              <w:left w:val="single" w:color="AAAAAA" w:sz="1"/>
+              <w:bottom w:val="single" w:color="AAAAAA" w:sz="1"/>
+              <w:right w:val="single" w:color="AAAAAA" w:sz="1"/>
+            </w:tcBorders>
+            <w:shd w:fill="F2F7FB" w:val="clear"/>
+            <w:tcMar>
+              <w:top w:type="dxa" w:w="80"/>
+              <w:left w:type="dxa" w:w="120"/>
+              <w:bottom w:type="dxa" w:w="80"/>
+              <w:right w:type="dxa" w:w="120"/>
+            </w:tcMar>
+            <w:vAlign w:val="top"/>
+          </w:tcPr>
+          <w:p>
+            <w:r>
+              <w:rPr>
+                <w:rFonts w:ascii="Arial" w:cs="Arial" w:eastAsia="Arial" w:hAnsi="Arial"/>
+                <w:sz w:val="22"/>
+                <w:szCs w:val="22"/>
+              </w:rPr>
+              <w:t xml:space="preserve">GET</w:t>
+            </w:r>
+          </w:p>
+        </w:tc>
+        <w:tc>
+          <w:tcPr>
+            <w:tcW w:type="dxa" w:w="2800"/>
+            <w:tcBorders>
+              <w:top w:val="single" w:color="AAAAAA" w:sz="1"/>
+              <w:left w:val="single" w:color="AAAAAA" w:sz="1"/>
+              <w:bottom w:val="single" w:color="AAAAAA" w:sz="1"/>
+              <w:right w:val="single" w:color="AAAAAA" w:sz="1"/>
+            </w:tcBorders>
+            <w:shd w:fill="F2F7FB" w:val="clear"/>
+            <w:tcMar>
+              <w:top w:type="dxa" w:w="80"/>
+              <w:left w:type="dxa" w:w="120"/>
+              <w:bottom w:type="dxa" w:w="80"/>
+              <w:right w:type="dxa" w:w="120"/>
+            </w:tcMar>
+            <w:vAlign w:val="top"/>
+          </w:tcPr>
+          <w:p>
+            <w:r>
+              <w:rPr>
+                <w:rFonts w:ascii="Arial" w:cs="Arial" w:eastAsia="Arial" w:hAnsi="Arial"/>
+                <w:sz w:val="22"/>
+                <w:szCs w:val="22"/>
+              </w:rPr>
+              <w:t xml:space="preserve">/views/:id/data</w:t>
+            </w:r>
+          </w:p>
+        </w:tc>
+        <w:tc>
+          <w:tcPr>
+            <w:tcW w:type="dxa" w:w="4760"/>
+            <w:tcBorders>
+              <w:top w:val="single" w:color="AAAAAA" w:sz="1"/>
+              <w:left w:val="single" w:color="AAAAAA" w:sz="1"/>
+              <w:bottom w:val="single" w:color="AAAAAA" w:sz="1"/>
+              <w:right w:val="single" w:color="AAAAAA" w:sz="1"/>
+            </w:tcBorders>
+            <w:shd w:fill="F2F7FB" w:val="clear"/>
+            <w:tcMar>
+              <w:top w:type="dxa" w:w="80"/>
+              <w:left w:type="dxa" w:w="120"/>
+              <w:bottom w:type="dxa" w:w="80"/>
+              <w:right w:type="dxa" w:w="120"/>
+            </w:tcMar>
+            <w:vAlign w:val="top"/>
+          </w:tcPr>
+          <w:p>
+            <w:r>
+              <w:rPr>
+                <w:rFonts w:ascii="Arial" w:cs="Arial" w:eastAsia="Arial" w:hAnsi="Arial"/>
+                <w:sz w:val="22"/>
+                <w:szCs w:val="22"/>
+              </w:rPr>
+              <w:t xml:space="preserve">Execute the view’s underlying data source query with role-based parameters and view-level filters. Returns the full result set.</w:t>
+            </w:r>
+          </w:p>
+        </w:tc>
+      </w:tr>
+    </w:tbl>
+    <w:p>
+      <w:pPr>
+        <w:spacing w:after="160"/>
+      </w:pPr>
+    </w:p>
+    <w:p>
+      <w:pPr>
+        <w:pStyle w:val="Heading2"/>
+        <w:spacing w:after="160" w:before="280"/>
+      </w:pPr>
+      <w:r>
+        <w:rPr>
+          <w:rFonts w:ascii="Arial" w:cs="Arial" w:eastAsia="Arial" w:hAnsi="Arial"/>
+          <w:b/>
+          <w:bCs/>
+          <w:color w:val="1F3864"/>
+          <w:sz w:val="24"/>
+          <w:szCs w:val="24"/>
+        </w:rPr>
+        <w:t xml:space="preserve">7.4 View Management Endpoints (Admin and Super Admin)</w:t>
+      </w:r>
+    </w:p>
+    <w:tbl>
+      <w:tblPr>
+        <w:tblW w:type="dxa" w:w="9360"/>
+        <w:tblBorders>
+          <w:top w:val="single" w:color="auto" w:sz="4"/>
+          <w:left w:val="single" w:color="auto" w:sz="4"/>
+          <w:bottom w:val="single" w:color="auto" w:sz="4"/>
+          <w:right w:val="single" w:color="auto" w:sz="4"/>
+          <w:insideH w:val="single" w:color="auto" w:sz="4"/>
+          <w:insideV w:val="single" w:color="auto" w:sz="4"/>
+        </w:tblBorders>
+      </w:tblPr>
+      <w:tblGrid>
+        <w:gridCol w:w="1800"/>
+        <w:gridCol w:w="2800"/>
+        <w:gridCol w:w="4760"/>
+      </w:tblGrid>
+      <w:tr>
+        <w:trPr>
+          <w:tblHeader/>
+        </w:trPr>
+        <w:tc>
+          <w:tcPr>
+            <w:tcW w:type="dxa" w:w="1800"/>
+            <w:tcBorders>
+              <w:top w:val="single" w:color="AAAAAA" w:sz="1"/>
+              <w:left w:val="single" w:color="AAAAAA" w:sz="1"/>
+              <w:bottom w:val="single" w:color="AAAAAA" w:sz="1"/>
+              <w:right w:val="single" w:color="AAAAAA" w:sz="1"/>
+            </w:tcBorders>
+            <w:shd w:fill="1F3864" w:val="clear"/>
+            <w:tcMar>
+              <w:top w:type="dxa" w:w="80"/>
+              <w:left w:type="dxa" w:w="120"/>
+              <w:bottom w:type="dxa" w:w="80"/>
+              <w:right w:type="dxa" w:w="120"/>
+            </w:tcMar>
+            <w:vAlign w:val="center"/>
+          </w:tcPr>
+          <w:p>
+            <w:r>
+              <w:rPr>
+                <w:rFonts w:ascii="Arial" w:cs="Arial" w:eastAsia="Arial" w:hAnsi="Arial"/>
+                <w:b/>
+                <w:bCs/>
+                <w:color w:val="FFFFFF"/>
+                <w:sz w:val="22"/>
+                <w:szCs w:val="22"/>
+              </w:rPr>
+              <w:t xml:space="preserve">Method</w:t>
+            </w:r>
+          </w:p>
+        </w:tc>
+        <w:tc>
+          <w:tcPr>
+            <w:tcW w:type="dxa" w:w="2800"/>
+            <w:tcBorders>
+              <w:top w:val="single" w:color="AAAAAA" w:sz="1"/>
+              <w:left w:val="single" w:color="AAAAAA" w:sz="1"/>
+              <w:bottom w:val="single" w:color="AAAAAA" w:sz="1"/>
+              <w:right w:val="single" w:color="AAAAAA" w:sz="1"/>
+            </w:tcBorders>
+            <w:shd w:fill="1F3864" w:val="clear"/>
+            <w:tcMar>
+              <w:top w:type="dxa" w:w="80"/>
+              <w:left w:type="dxa" w:w="120"/>
+              <w:bottom w:type="dxa" w:w="80"/>
+              <w:right w:type="dxa" w:w="120"/>
+            </w:tcMar>
+            <w:vAlign w:val="center"/>
+          </w:tcPr>
+          <w:p>
+            <w:r>
+              <w:rPr>
+                <w:rFonts w:ascii="Arial" w:cs="Arial" w:eastAsia="Arial" w:hAnsi="Arial"/>
+                <w:b/>
+                <w:bCs/>
+                <w:color w:val="FFFFFF"/>
+                <w:sz w:val="22"/>
+                <w:szCs w:val="22"/>
+              </w:rPr>
+              <w:t xml:space="preserve">Endpoint</w:t>
+            </w:r>
+          </w:p>
+        </w:tc>
+        <w:tc>
+          <w:tcPr>
+            <w:tcW w:type="dxa" w:w="4760"/>
+            <w:tcBorders>
+              <w:top w:val="single" w:color="AAAAAA" w:sz="1"/>
+              <w:left w:val="single" w:color="AAAAAA" w:sz="1"/>
+              <w:bottom w:val="single" w:color="AAAAAA" w:sz="1"/>
+              <w:right w:val="single" w:color="AAAAAA" w:sz="1"/>
+            </w:tcBorders>
+            <w:shd w:fill="1F3864" w:val="clear"/>
+            <w:tcMar>
+              <w:top w:type="dxa" w:w="80"/>
+              <w:left w:type="dxa" w:w="120"/>
+              <w:bottom w:type="dxa" w:w="80"/>
+              <w:right w:type="dxa" w:w="120"/>
+            </w:tcMar>
+            <w:vAlign w:val="center"/>
+          </w:tcPr>
+          <w:p>
+            <w:r>
+              <w:rPr>
+                <w:rFonts w:ascii="Arial" w:cs="Arial" w:eastAsia="Arial" w:hAnsi="Arial"/>
+                <w:b/>
+                <w:bCs/>
+                <w:color w:val="FFFFFF"/>
+                <w:sz w:val="22"/>
+                <w:szCs w:val="22"/>
+              </w:rPr>
+              <w:t xml:space="preserve">Description</w:t>
+            </w:r>
+          </w:p>
+        </w:tc>
+      </w:tr>
+      <w:tr>
+        <w:tc>
+          <w:tcPr>
+            <w:tcW w:type="dxa" w:w="1800"/>
+            <w:tcBorders>
+              <w:top w:val="single" w:color="AAAAAA" w:sz="1"/>
+              <w:left w:val="single" w:color="AAAAAA" w:sz="1"/>
+              <w:bottom w:val="single" w:color="AAAAAA" w:sz="1"/>
+              <w:right w:val="single" w:color="AAAAAA" w:sz="1"/>
+            </w:tcBorders>
+            <w:tcMar>
+              <w:top w:type="dxa" w:w="80"/>
+              <w:left w:type="dxa" w:w="120"/>
+              <w:bottom w:type="dxa" w:w="80"/>
+              <w:right w:type="dxa" w:w="120"/>
+            </w:tcMar>
+            <w:vAlign w:val="top"/>
+          </w:tcPr>
+          <w:p>
+            <w:r>
+              <w:rPr>
+                <w:rFonts w:ascii="Arial" w:cs="Arial" w:eastAsia="Arial" w:hAnsi="Arial"/>
+                <w:sz w:val="22"/>
+                <w:szCs w:val="22"/>
+              </w:rPr>
               <w:t xml:space="preserve">POST</w:t>
             </w:r>
           </w:p>
@@ -6068,13 +6773,329 @@
           <w:sz w:val="24"/>
           <w:szCs w:val="24"/>
         </w:rPr>
-        <w:t xml:space="preserve">7.7 Error Handling</w:t>
-      </w:r>
-    </w:p>
+        <w:t xml:space="preserve">7.7 Google Workspace Endpoints (All Roles)</w:t>
+      </w:r>
+    </w:p>
+    <w:tbl>
+      <w:tblPr>
+        <w:tblW w:type="dxa" w:w="9360"/>
+        <w:tblBorders>
+          <w:top w:val="single" w:color="auto" w:sz="4"/>
+          <w:left w:val="single" w:color="auto" w:sz="4"/>
+          <w:bottom w:val="single" w:color="auto" w:sz="4"/>
+          <w:right w:val="single" w:color="auto" w:sz="4"/>
+          <w:insideH w:val="single" w:color="auto" w:sz="4"/>
+          <w:insideV w:val="single" w:color="auto" w:sz="4"/>
+        </w:tblBorders>
+      </w:tblPr>
+      <w:tblGrid>
+        <w:gridCol w:w="1800"/>
+        <w:gridCol w:w="3200"/>
+        <w:gridCol w:w="4360"/>
+      </w:tblGrid>
+      <w:tr>
+        <w:trPr>
+          <w:tblHeader/>
+        </w:trPr>
+        <w:tc>
+          <w:tcPr>
+            <w:tcW w:type="dxa" w:w="1800"/>
+            <w:tcBorders>
+              <w:top w:val="single" w:color="AAAAAA" w:sz="1"/>
+              <w:left w:val="single" w:color="AAAAAA" w:sz="1"/>
+              <w:bottom w:val="single" w:color="AAAAAA" w:sz="1"/>
+              <w:right w:val="single" w:color="AAAAAA" w:sz="1"/>
+            </w:tcBorders>
+            <w:shd w:fill="1F3864" w:val="clear"/>
+            <w:tcMar>
+              <w:top w:type="dxa" w:w="80"/>
+              <w:left w:type="dxa" w:w="120"/>
+              <w:bottom w:type="dxa" w:w="80"/>
+              <w:right w:type="dxa" w:w="120"/>
+            </w:tcMar>
+            <w:vAlign w:val="center"/>
+          </w:tcPr>
+          <w:p>
+            <w:r>
+              <w:rPr>
+                <w:rFonts w:ascii="Arial" w:cs="Arial" w:eastAsia="Arial" w:hAnsi="Arial"/>
+                <w:b/>
+                <w:bCs/>
+                <w:color w:val="FFFFFF"/>
+                <w:sz w:val="22"/>
+                <w:szCs w:val="22"/>
+              </w:rPr>
+              <w:t xml:space="preserve">Method</w:t>
+            </w:r>
+          </w:p>
+        </w:tc>
+        <w:tc>
+          <w:tcPr>
+            <w:tcW w:type="dxa" w:w="3200"/>
+            <w:tcBorders>
+              <w:top w:val="single" w:color="AAAAAA" w:sz="1"/>
+              <w:left w:val="single" w:color="AAAAAA" w:sz="1"/>
+              <w:bottom w:val="single" w:color="AAAAAA" w:sz="1"/>
+              <w:right w:val="single" w:color="AAAAAA" w:sz="1"/>
+            </w:tcBorders>
+            <w:shd w:fill="1F3864" w:val="clear"/>
+            <w:tcMar>
+              <w:top w:type="dxa" w:w="80"/>
+              <w:left w:type="dxa" w:w="120"/>
+              <w:bottom w:type="dxa" w:w="80"/>
+              <w:right w:type="dxa" w:w="120"/>
+            </w:tcMar>
+            <w:vAlign w:val="center"/>
+          </w:tcPr>
+          <w:p>
+            <w:r>
+              <w:rPr>
+                <w:rFonts w:ascii="Arial" w:cs="Arial" w:eastAsia="Arial" w:hAnsi="Arial"/>
+                <w:b/>
+                <w:bCs/>
+                <w:color w:val="FFFFFF"/>
+                <w:sz w:val="22"/>
+                <w:szCs w:val="22"/>
+              </w:rPr>
+              <w:t xml:space="preserve">Endpoint</w:t>
+            </w:r>
+          </w:p>
+        </w:tc>
+        <w:tc>
+          <w:tcPr>
+            <w:tcW w:type="dxa" w:w="4360"/>
+            <w:tcBorders>
+              <w:top w:val="single" w:color="AAAAAA" w:sz="1"/>
+              <w:left w:val="single" w:color="AAAAAA" w:sz="1"/>
+              <w:bottom w:val="single" w:color="AAAAAA" w:sz="1"/>
+              <w:right w:val="single" w:color="AAAAAA" w:sz="1"/>
+            </w:tcBorders>
+            <w:shd w:fill="1F3864" w:val="clear"/>
+            <w:tcMar>
+              <w:top w:type="dxa" w:w="80"/>
+              <w:left w:type="dxa" w:w="120"/>
+              <w:bottom w:type="dxa" w:w="80"/>
+              <w:right w:type="dxa" w:w="120"/>
+            </w:tcMar>
+            <w:vAlign w:val="center"/>
+          </w:tcPr>
+          <w:p>
+            <w:r>
+              <w:rPr>
+                <w:rFonts w:ascii="Arial" w:cs="Arial" w:eastAsia="Arial" w:hAnsi="Arial"/>
+                <w:b/>
+                <w:bCs/>
+                <w:color w:val="FFFFFF"/>
+                <w:sz w:val="22"/>
+                <w:szCs w:val="22"/>
+              </w:rPr>
+              <w:t xml:space="preserve">Description</w:t>
+            </w:r>
+          </w:p>
+        </w:tc>
+      </w:tr>
+      <w:tr>
+        <w:tc>
+          <w:tcPr>
+            <w:tcW w:type="dxa" w:w="1800"/>
+            <w:tcBorders>
+              <w:top w:val="single" w:color="AAAAAA" w:sz="1"/>
+              <w:left w:val="single" w:color="AAAAAA" w:sz="1"/>
+              <w:bottom w:val="single" w:color="AAAAAA" w:sz="1"/>
+              <w:right w:val="single" w:color="AAAAAA" w:sz="1"/>
+            </w:tcBorders>
+            <w:tcMar>
+              <w:top w:type="dxa" w:w="80"/>
+              <w:left w:type="dxa" w:w="120"/>
+              <w:bottom w:type="dxa" w:w="80"/>
+              <w:right w:type="dxa" w:w="120"/>
+            </w:tcMar>
+            <w:vAlign w:val="top"/>
+          </w:tcPr>
+          <w:p>
+            <w:r>
+              <w:rPr>
+                <w:rFonts w:ascii="Arial" w:cs="Arial" w:eastAsia="Arial" w:hAnsi="Arial"/>
+                <w:sz w:val="22"/>
+                <w:szCs w:val="22"/>
+              </w:rPr>
+              <w:t xml:space="preserve">POST</w:t>
+            </w:r>
+          </w:p>
+        </w:tc>
+        <w:tc>
+          <w:tcPr>
+            <w:tcW w:type="dxa" w:w="3200"/>
+            <w:tcBorders>
+              <w:top w:val="single" w:color="AAAAAA" w:sz="1"/>
+              <w:left w:val="single" w:color="AAAAAA" w:sz="1"/>
+              <w:bottom w:val="single" w:color="AAAAAA" w:sz="1"/>
+              <w:right w:val="single" w:color="AAAAAA" w:sz="1"/>
+            </w:tcBorders>
+            <w:tcMar>
+              <w:top w:type="dxa" w:w="80"/>
+              <w:left w:type="dxa" w:w="120"/>
+              <w:bottom w:type="dxa" w:w="80"/>
+              <w:right w:type="dxa" w:w="120"/>
+            </w:tcMar>
+            <w:vAlign w:val="top"/>
+          </w:tcPr>
+          <w:p>
+            <w:r>
+              <w:rPr>
+                <w:rFonts w:ascii="Arial" w:cs="Arial" w:eastAsia="Arial" w:hAnsi="Arial"/>
+                <w:sz w:val="22"/>
+                <w:szCs w:val="22"/>
+              </w:rPr>
+              <w:t xml:space="preserve">/calendar/events</w:t>
+            </w:r>
+          </w:p>
+        </w:tc>
+        <w:tc>
+          <w:tcPr>
+            <w:tcW w:type="dxa" w:w="4360"/>
+            <w:tcBorders>
+              <w:top w:val="single" w:color="AAAAAA" w:sz="1"/>
+              <w:left w:val="single" w:color="AAAAAA" w:sz="1"/>
+              <w:bottom w:val="single" w:color="AAAAAA" w:sz="1"/>
+              <w:right w:val="single" w:color="AAAAAA" w:sz="1"/>
+            </w:tcBorders>
+            <w:tcMar>
+              <w:top w:type="dxa" w:w="80"/>
+              <w:left w:type="dxa" w:w="120"/>
+              <w:bottom w:type="dxa" w:w="80"/>
+              <w:right w:type="dxa" w:w="120"/>
+            </w:tcMar>
+            <w:vAlign w:val="top"/>
+          </w:tcPr>
+          <w:p>
+            <w:r>
+              <w:rPr>
+                <w:rFonts w:ascii="Arial" w:cs="Arial" w:eastAsia="Arial" w:hAnsi="Arial"/>
+                <w:sz w:val="22"/>
+                <w:szCs w:val="22"/>
+              </w:rPr>
+              <w:t xml:space="preserve">Create a Google Calendar event for the next session. Includes attendees from the engagement. Returns the event ID.</w:t>
+            </w:r>
+          </w:p>
+        </w:tc>
+      </w:tr>
+      <w:tr>
+        <w:tc>
+          <w:tcPr>
+            <w:tcW w:type="dxa" w:w="1800"/>
+            <w:tcBorders>
+              <w:top w:val="single" w:color="AAAAAA" w:sz="1"/>
+              <w:left w:val="single" w:color="AAAAAA" w:sz="1"/>
+              <w:bottom w:val="single" w:color="AAAAAA" w:sz="1"/>
+              <w:right w:val="single" w:color="AAAAAA" w:sz="1"/>
+            </w:tcBorders>
+            <w:shd w:fill="F2F7FB" w:val="clear"/>
+            <w:tcMar>
+              <w:top w:type="dxa" w:w="80"/>
+              <w:left w:type="dxa" w:w="120"/>
+              <w:bottom w:type="dxa" w:w="80"/>
+              <w:right w:type="dxa" w:w="120"/>
+            </w:tcMar>
+            <w:vAlign w:val="top"/>
+          </w:tcPr>
+          <w:p>
+            <w:r>
+              <w:rPr>
+                <w:rFonts w:ascii="Arial" w:cs="Arial" w:eastAsia="Arial" w:hAnsi="Arial"/>
+                <w:sz w:val="22"/>
+                <w:szCs w:val="22"/>
+              </w:rPr>
+              <w:t xml:space="preserve">POST</w:t>
+            </w:r>
+          </w:p>
+        </w:tc>
+        <w:tc>
+          <w:tcPr>
+            <w:tcW w:type="dxa" w:w="3200"/>
+            <w:tcBorders>
+              <w:top w:val="single" w:color="AAAAAA" w:sz="1"/>
+              <w:left w:val="single" w:color="AAAAAA" w:sz="1"/>
+              <w:bottom w:val="single" w:color="AAAAAA" w:sz="1"/>
+              <w:right w:val="single" w:color="AAAAAA" w:sz="1"/>
+            </w:tcBorders>
+            <w:shd w:fill="F2F7FB" w:val="clear"/>
+            <w:tcMar>
+              <w:top w:type="dxa" w:w="80"/>
+              <w:left w:type="dxa" w:w="120"/>
+              <w:bottom w:type="dxa" w:w="80"/>
+              <w:right w:type="dxa" w:w="120"/>
+            </w:tcMar>
+            <w:vAlign w:val="top"/>
+          </w:tcPr>
+          <w:p>
+            <w:r>
+              <w:rPr>
+                <w:rFonts w:ascii="Arial" w:cs="Arial" w:eastAsia="Arial" w:hAnsi="Arial"/>
+                <w:sz w:val="22"/>
+                <w:szCs w:val="22"/>
+              </w:rPr>
+              <w:t xml:space="preserve">/email/send</w:t>
+            </w:r>
+          </w:p>
+        </w:tc>
+        <w:tc>
+          <w:tcPr>
+            <w:tcW w:type="dxa" w:w="4360"/>
+            <w:tcBorders>
+              <w:top w:val="single" w:color="AAAAAA" w:sz="1"/>
+              <w:left w:val="single" w:color="AAAAAA" w:sz="1"/>
+              <w:bottom w:val="single" w:color="AAAAAA" w:sz="1"/>
+              <w:right w:val="single" w:color="AAAAAA" w:sz="1"/>
+            </w:tcBorders>
+            <w:shd w:fill="F2F7FB" w:val="clear"/>
+            <w:tcMar>
+              <w:top w:type="dxa" w:w="80"/>
+              <w:left w:type="dxa" w:w="120"/>
+              <w:bottom w:type="dxa" w:w="80"/>
+              <w:right w:type="dxa" w:w="120"/>
+            </w:tcMar>
+            <w:vAlign w:val="top"/>
+          </w:tcPr>
+          <w:p>
+            <w:r>
+              <w:rPr>
+                <w:rFonts w:ascii="Arial" w:cs="Arial" w:eastAsia="Arial" w:hAnsi="Arial"/>
+                <w:sz w:val="22"/>
+                <w:szCs w:val="22"/>
+              </w:rPr>
+              <w:t xml:space="preserve">Send a session summary email via Gmail API. Accepts recipients, subject, and body content. Returns send confirmation.</w:t>
+            </w:r>
+          </w:p>
+        </w:tc>
+      </w:tr>
+    </w:tbl>
     <w:p>
       <w:pPr>
         <w:spacing w:after="160"/>
       </w:pPr>
+    </w:p>
+    <w:p>
+      <w:pPr>
+        <w:pStyle w:val="Heading2"/>
+        <w:spacing w:after="160" w:before="280"/>
+      </w:pPr>
+      <w:r>
+        <w:rPr>
+          <w:rFonts w:ascii="Arial" w:cs="Arial" w:eastAsia="Arial" w:hAnsi="Arial"/>
+          <w:b/>
+          <w:bCs/>
+          <w:color w:val="1F3864"/>
+          <w:sz w:val="24"/>
+          <w:szCs w:val="24"/>
+        </w:rPr>
+        <w:t xml:space="preserve">7.8 Error Handling</w:t>
+      </w:r>
+    </w:p>
+    <w:p>
+      <w:pPr>
+        <w:spacing w:after="160"/>
+      </w:pPr>
       <w:r>
         <w:rPr>
           <w:rFonts w:ascii="Arial" w:cs="Arial" w:eastAsia="Arial" w:hAnsi="Arial"/>
@@ -6082,7 +7103,7 @@
           <w:sz w:val="22"/>
           <w:szCs w:val="22"/>
         </w:rPr>
-        <w:t xml:space="preserve">All API responses use standard HTTP status codes. Error responses include a JSON body with an error code and a human-readable message. CRM API errors encountered during write operations are translated into application-level error responses and returned to the frontend for display to the user.</w:t>
+        <w:t xml:space="preserve">All API responses use standard HTTP status codes. Error responses include a JSON body with an error code and a human-readable message. CRM API errors encountered during write operations are translated into application-level error responses and returned to the frontend for display to the user. Google Workspace API errors (for example, calendar permission issues or email send failures) are similarly translated and surfaced to the user.</w:t>
       </w:r>
     </w:p>
     <w:p>
@@ -6301,7 +7322,7 @@
           <w:sz w:val="22"/>
           <w:szCs w:val="22"/>
         </w:rPr>
-        <w:t xml:space="preserve">Mentor: access to view endpoints, view data endpoints, write endpoints, and own-user profile.</w:t>
+        <w:t xml:space="preserve">Mentor: access to view endpoints, view data endpoints, write endpoints, Google Workspace endpoints, and own-user profile.</w:t>
       </w:r>
     </w:p>
     <w:p>
@@ -6390,7 +7411,7 @@
           <w:sz w:val="28"/>
           <w:szCs w:val="28"/>
         </w:rPr>
-        <w:t xml:space="preserve">9. Deployment and Infrastructure</w:t>
+        <w:t xml:space="preserve">9. Google Workspace Integration</w:t>
       </w:r>
     </w:p>
     <w:p>
@@ -6407,7 +7428,7 @@
           <w:sz w:val="24"/>
           <w:szCs w:val="24"/>
         </w:rPr>
-        <w:t xml:space="preserve">9.1 Deployment Model</w:t>
+        <w:t xml:space="preserve">9.1 Overview</w:t>
       </w:r>
     </w:p>
     <w:p>
@@ -6421,7 +7442,7 @@
           <w:sz w:val="22"/>
           <w:szCs w:val="22"/>
         </w:rPr>
-        <w:t xml:space="preserve">The application is deployed as a Docker container on the same server as the CRM, running alongside the CRM’s Docker containers. The application container joins the CRM’s Docker network, providing direct network access to the CRM database and CRM API without exposing either to the public internet.</w:t>
+        <w:t xml:space="preserve">The application integrates with Google Workspace to provide calendar event creation and email sending capabilities. Both services are accessed through Google APIs using OAuth 2.0 authentication, allowing the application to act on behalf of the authenticated user.</w:t>
       </w:r>
     </w:p>
     <w:p>
@@ -6438,7 +7459,7 @@
           <w:sz w:val="24"/>
           <w:szCs w:val="24"/>
         </w:rPr>
-        <w:t xml:space="preserve">9.2 Network Configuration</w:t>
+        <w:t xml:space="preserve">9.2 OAuth 2.0 Authorization</w:t>
       </w:r>
     </w:p>
     <w:p>
@@ -6452,7 +7473,57 @@
           <w:sz w:val="22"/>
           <w:szCs w:val="22"/>
         </w:rPr>
-        <w:t xml:space="preserve">The application is served on its own subdomain with its own SSL certificate. Users access the application via the subdomain URL in a standard web browser. The CRM database and CRM API are accessible to the application container via the Docker internal network and are not exposed on the subdomain.</w:t>
+        <w:t xml:space="preserve">On first login (or when Google authorization has expired or been revoked), the application prompts the user to authorize access to their Google account. The OAuth consent flow requests the following scopes:</w:t>
+      </w:r>
+    </w:p>
+    <w:p>
+      <w:pPr>
+        <w:pStyle w:val="ListParagraph"/>
+        <w:numPr>
+          <w:ilvl w:val="0"/>
+          <w:numId w:val="2"/>
+        </w:numPr>
+        <w:spacing w:after="80"/>
+      </w:pPr>
+      <w:r>
+        <w:rPr>
+          <w:rFonts w:ascii="Arial" w:cs="Arial" w:eastAsia="Arial" w:hAnsi="Arial"/>
+          <w:sz w:val="22"/>
+          <w:szCs w:val="22"/>
+        </w:rPr>
+        <w:t xml:space="preserve">Google Calendar: permission to create events on the user’s calendar.</w:t>
+      </w:r>
+    </w:p>
+    <w:p>
+      <w:pPr>
+        <w:pStyle w:val="ListParagraph"/>
+        <w:numPr>
+          <w:ilvl w:val="0"/>
+          <w:numId w:val="2"/>
+        </w:numPr>
+        <w:spacing w:after="80"/>
+      </w:pPr>
+      <w:r>
+        <w:rPr>
+          <w:rFonts w:ascii="Arial" w:cs="Arial" w:eastAsia="Arial" w:hAnsi="Arial"/>
+          <w:sz w:val="22"/>
+          <w:szCs w:val="22"/>
+        </w:rPr>
+        <w:t xml:space="preserve">Gmail: permission to send email on the user’s behalf.</w:t>
+      </w:r>
+    </w:p>
+    <w:p>
+      <w:pPr>
+        <w:spacing w:after="160"/>
+      </w:pPr>
+      <w:r>
+        <w:rPr>
+          <w:rFonts w:ascii="Arial" w:cs="Arial" w:eastAsia="Arial" w:hAnsi="Arial"/>
+          <w:color w:val="000000"/>
+          <w:sz w:val="22"/>
+          <w:szCs w:val="22"/>
+        </w:rPr>
+        <w:t xml:space="preserve">The user’s OAuth tokens (access token and refresh token) are stored securely by the backend in the application’s dedicated database tables. Tokens are refreshed automatically when they expire. If a refresh fails (for example, the user revokes access), the application prompts the user to re-authorize.</w:t>
       </w:r>
     </w:p>
     <w:p>
@@ -6469,7 +7540,7 @@
           <w:sz w:val="24"/>
           <w:szCs w:val="24"/>
         </w:rPr>
-        <w:t xml:space="preserve">9.3 Dedicated Database Tables</w:t>
+        <w:t xml:space="preserve">9.3 Google Calendar Integration</w:t>
       </w:r>
     </w:p>
     <w:p>
@@ -6483,7 +7554,93 @@
           <w:sz w:val="22"/>
           <w:szCs w:val="22"/>
         </w:rPr>
-        <w:t xml:space="preserve">The application stores its configuration data (data source definitions, view definitions, role mappings, user preferences such as last-selected view) in dedicated tables within the CRM’s database. These tables use a distinct table prefix to avoid collisions with CRM schema. The application never modifies CRM-owned tables directly.</w:t>
+        <w:t xml:space="preserve">When a mentor enters a next session date and time in the session form, the application creates a Google Calendar event with the following properties:</w:t>
+      </w:r>
+    </w:p>
+    <w:p>
+      <w:pPr>
+        <w:pStyle w:val="ListParagraph"/>
+        <w:numPr>
+          <w:ilvl w:val="0"/>
+          <w:numId w:val="2"/>
+        </w:numPr>
+        <w:spacing w:after="80"/>
+      </w:pPr>
+      <w:r>
+        <w:rPr>
+          <w:rFonts w:ascii="Arial" w:cs="Arial" w:eastAsia="Arial" w:hAnsi="Arial"/>
+          <w:sz w:val="22"/>
+          <w:szCs w:val="22"/>
+        </w:rPr>
+        <w:t xml:space="preserve">The event is created on the mentor’s Google Calendar.</w:t>
+      </w:r>
+    </w:p>
+    <w:p>
+      <w:pPr>
+        <w:pStyle w:val="ListParagraph"/>
+        <w:numPr>
+          <w:ilvl w:val="0"/>
+          <w:numId w:val="2"/>
+        </w:numPr>
+        <w:spacing w:after="80"/>
+      </w:pPr>
+      <w:r>
+        <w:rPr>
+          <w:rFonts w:ascii="Arial" w:cs="Arial" w:eastAsia="Arial" w:hAnsi="Arial"/>
+          <w:sz w:val="22"/>
+          <w:szCs w:val="22"/>
+        </w:rPr>
+        <w:t xml:space="preserve">The event title, date, time, and duration are derived from the session form data.</w:t>
+      </w:r>
+    </w:p>
+    <w:p>
+      <w:pPr>
+        <w:pStyle w:val="ListParagraph"/>
+        <w:numPr>
+          <w:ilvl w:val="0"/>
+          <w:numId w:val="2"/>
+        </w:numPr>
+        <w:spacing w:after="80"/>
+      </w:pPr>
+      <w:r>
+        <w:rPr>
+          <w:rFonts w:ascii="Arial" w:cs="Arial" w:eastAsia="Arial" w:hAnsi="Arial"/>
+          <w:sz w:val="22"/>
+          <w:szCs w:val="22"/>
+        </w:rPr>
+        <w:t xml:space="preserve">All engagement contacts and co-mentors/SMEs are added as event attendees.</w:t>
+      </w:r>
+    </w:p>
+    <w:p>
+      <w:pPr>
+        <w:pStyle w:val="ListParagraph"/>
+        <w:numPr>
+          <w:ilvl w:val="0"/>
+          <w:numId w:val="2"/>
+        </w:numPr>
+        <w:spacing w:after="80"/>
+      </w:pPr>
+      <w:r>
+        <w:rPr>
+          <w:rFonts w:ascii="Arial" w:cs="Arial" w:eastAsia="Arial" w:hAnsi="Arial"/>
+          <w:sz w:val="22"/>
+          <w:szCs w:val="22"/>
+        </w:rPr>
+        <w:t xml:space="preserve">Google Calendar automatically sends invite emails to all attendees.</w:t>
+      </w:r>
+    </w:p>
+    <w:p>
+      <w:pPr>
+        <w:spacing w:after="160"/>
+      </w:pPr>
+      <w:r>
+        <w:rPr>
+          <w:rFonts w:ascii="Arial" w:cs="Arial" w:eastAsia="Arial" w:hAnsi="Arial"/>
+          <w:color w:val="000000"/>
+          <w:sz w:val="22"/>
+          <w:szCs w:val="22"/>
+        </w:rPr>
+        <w:t xml:space="preserve">The calendar event ID is stored on the session record in the CRM for reference.</w:t>
       </w:r>
     </w:p>
     <w:p>
@@ -6500,7 +7657,7 @@
           <w:sz w:val="24"/>
           <w:szCs w:val="24"/>
         </w:rPr>
-        <w:t xml:space="preserve">9.4 Deployment Management</w:t>
+        <w:t xml:space="preserve">9.4 Gmail Integration</w:t>
       </w:r>
     </w:p>
     <w:p>
@@ -6514,7 +7671,79 @@
           <w:sz w:val="22"/>
           <w:szCs w:val="22"/>
         </w:rPr>
-        <w:t xml:space="preserve">Deployment, updates, and operational management of the application are handled by CRM Builder as part of its existing CRM deployment pipeline. This includes initial deployment, configuration, and subsequent updates.</w:t>
+        <w:t xml:space="preserve">When a mentor completes a session and chooses to send a summary email, the application sends the email via the Gmail API with the following behavior:</w:t>
+      </w:r>
+    </w:p>
+    <w:p>
+      <w:pPr>
+        <w:pStyle w:val="ListParagraph"/>
+        <w:numPr>
+          <w:ilvl w:val="0"/>
+          <w:numId w:val="2"/>
+        </w:numPr>
+        <w:spacing w:after="80"/>
+      </w:pPr>
+      <w:r>
+        <w:rPr>
+          <w:rFonts w:ascii="Arial" w:cs="Arial" w:eastAsia="Arial" w:hAnsi="Arial"/>
+          <w:sz w:val="22"/>
+          <w:szCs w:val="22"/>
+        </w:rPr>
+        <w:t xml:space="preserve">The email is sent from the mentor’s Gmail account (their address appears as the sender).</w:t>
+      </w:r>
+    </w:p>
+    <w:p>
+      <w:pPr>
+        <w:pStyle w:val="ListParagraph"/>
+        <w:numPr>
+          <w:ilvl w:val="0"/>
+          <w:numId w:val="2"/>
+        </w:numPr>
+        <w:spacing w:after="80"/>
+      </w:pPr>
+      <w:r>
+        <w:rPr>
+          <w:rFonts w:ascii="Arial" w:cs="Arial" w:eastAsia="Arial" w:hAnsi="Arial"/>
+          <w:sz w:val="22"/>
+          <w:szCs w:val="22"/>
+        </w:rPr>
+        <w:t xml:space="preserve">The email body is pre-populated with the session notes and next steps from the session form.</w:t>
+      </w:r>
+    </w:p>
+    <w:p>
+      <w:pPr>
+        <w:pStyle w:val="ListParagraph"/>
+        <w:numPr>
+          <w:ilvl w:val="0"/>
+          <w:numId w:val="2"/>
+        </w:numPr>
+        <w:spacing w:after="80"/>
+      </w:pPr>
+      <w:r>
+        <w:rPr>
+          <w:rFonts w:ascii="Arial" w:cs="Arial" w:eastAsia="Arial" w:hAnsi="Arial"/>
+          <w:sz w:val="22"/>
+          <w:szCs w:val="22"/>
+        </w:rPr>
+        <w:t xml:space="preserve">The mentor can edit the email content and adjust the recipient list before sending.</w:t>
+      </w:r>
+    </w:p>
+    <w:p>
+      <w:pPr>
+        <w:pStyle w:val="ListParagraph"/>
+        <w:numPr>
+          <w:ilvl w:val="0"/>
+          <w:numId w:val="2"/>
+        </w:numPr>
+        <w:spacing w:after="80"/>
+      </w:pPr>
+      <w:r>
+        <w:rPr>
+          <w:rFonts w:ascii="Arial" w:cs="Arial" w:eastAsia="Arial" w:hAnsi="Arial"/>
+          <w:sz w:val="22"/>
+          <w:szCs w:val="22"/>
+        </w:rPr>
+        <w:t xml:space="preserve">The sent email appears in the mentor’s Gmail Sent folder.</w:t>
       </w:r>
     </w:p>
     <w:p>
@@ -6536,7 +7765,1219 @@
           <w:sz w:val="28"/>
           <w:szCs w:val="28"/>
         </w:rPr>
-        <w:t xml:space="preserve">10. Open Issues and Decisions</w:t>
+        <w:t xml:space="preserve">10. Deployment and Infrastructure</w:t>
+      </w:r>
+    </w:p>
+    <w:p>
+      <w:pPr>
+        <w:pStyle w:val="Heading2"/>
+        <w:spacing w:after="160" w:before="280"/>
+      </w:pPr>
+      <w:r>
+        <w:rPr>
+          <w:rFonts w:ascii="Arial" w:cs="Arial" w:eastAsia="Arial" w:hAnsi="Arial"/>
+          <w:b/>
+          <w:bCs/>
+          <w:color w:val="1F3864"/>
+          <w:sz w:val="24"/>
+          <w:szCs w:val="24"/>
+        </w:rPr>
+        <w:t xml:space="preserve">10.1 Deployment Model</w:t>
+      </w:r>
+    </w:p>
+    <w:p>
+      <w:pPr>
+        <w:spacing w:after="160"/>
+      </w:pPr>
+      <w:r>
+        <w:rPr>
+          <w:rFonts w:ascii="Arial" w:cs="Arial" w:eastAsia="Arial" w:hAnsi="Arial"/>
+          <w:color w:val="000000"/>
+          <w:sz w:val="22"/>
+          <w:szCs w:val="22"/>
+        </w:rPr>
+        <w:t xml:space="preserve">The application is deployed as a Docker container on the same server as the CRM, running alongside the CRM’s Docker containers. The application container joins the CRM’s Docker network, providing direct network access to the CRM database and CRM API without exposing either to the public internet.</w:t>
+      </w:r>
+    </w:p>
+    <w:p>
+      <w:pPr>
+        <w:pStyle w:val="Heading2"/>
+        <w:spacing w:after="160" w:before="280"/>
+      </w:pPr>
+      <w:r>
+        <w:rPr>
+          <w:rFonts w:ascii="Arial" w:cs="Arial" w:eastAsia="Arial" w:hAnsi="Arial"/>
+          <w:b/>
+          <w:bCs/>
+          <w:color w:val="1F3864"/>
+          <w:sz w:val="24"/>
+          <w:szCs w:val="24"/>
+        </w:rPr>
+        <w:t xml:space="preserve">10.2 Network Configuration</w:t>
+      </w:r>
+    </w:p>
+    <w:p>
+      <w:pPr>
+        <w:spacing w:after="160"/>
+      </w:pPr>
+      <w:r>
+        <w:rPr>
+          <w:rFonts w:ascii="Arial" w:cs="Arial" w:eastAsia="Arial" w:hAnsi="Arial"/>
+          <w:color w:val="000000"/>
+          <w:sz w:val="22"/>
+          <w:szCs w:val="22"/>
+        </w:rPr>
+        <w:t xml:space="preserve">The application is served on its own subdomain with its own SSL certificate. Users access the application via the subdomain URL in a standard web browser. The CRM database and CRM API are accessible to the application container via the Docker internal network and are not exposed on the subdomain.</w:t>
+      </w:r>
+    </w:p>
+    <w:p>
+      <w:pPr>
+        <w:pStyle w:val="Heading2"/>
+        <w:spacing w:after="160" w:before="280"/>
+      </w:pPr>
+      <w:r>
+        <w:rPr>
+          <w:rFonts w:ascii="Arial" w:cs="Arial" w:eastAsia="Arial" w:hAnsi="Arial"/>
+          <w:b/>
+          <w:bCs/>
+          <w:color w:val="1F3864"/>
+          <w:sz w:val="24"/>
+          <w:szCs w:val="24"/>
+        </w:rPr>
+        <w:t xml:space="preserve">10.3 Dedicated Database Tables</w:t>
+      </w:r>
+    </w:p>
+    <w:p>
+      <w:pPr>
+        <w:spacing w:after="160"/>
+      </w:pPr>
+      <w:r>
+        <w:rPr>
+          <w:rFonts w:ascii="Arial" w:cs="Arial" w:eastAsia="Arial" w:hAnsi="Arial"/>
+          <w:color w:val="000000"/>
+          <w:sz w:val="22"/>
+          <w:szCs w:val="22"/>
+        </w:rPr>
+        <w:t xml:space="preserve">The application stores its configuration data (data source definitions, view definitions, role mappings, user preferences such as last-selected view, and Google OAuth tokens) in dedicated tables within the CRM’s database. These tables use a distinct table prefix to avoid collisions with CRM schema. The application never modifies CRM-owned tables directly.</w:t>
+      </w:r>
+    </w:p>
+    <w:p>
+      <w:pPr>
+        <w:pStyle w:val="Heading2"/>
+        <w:spacing w:after="160" w:before="280"/>
+      </w:pPr>
+      <w:r>
+        <w:rPr>
+          <w:rFonts w:ascii="Arial" w:cs="Arial" w:eastAsia="Arial" w:hAnsi="Arial"/>
+          <w:b/>
+          <w:bCs/>
+          <w:color w:val="1F3864"/>
+          <w:sz w:val="24"/>
+          <w:szCs w:val="24"/>
+        </w:rPr>
+        <w:t xml:space="preserve">10.4 Deployment Management</w:t>
+      </w:r>
+    </w:p>
+    <w:p>
+      <w:pPr>
+        <w:spacing w:after="160"/>
+      </w:pPr>
+      <w:r>
+        <w:rPr>
+          <w:rFonts w:ascii="Arial" w:cs="Arial" w:eastAsia="Arial" w:hAnsi="Arial"/>
+          <w:color w:val="000000"/>
+          <w:sz w:val="22"/>
+          <w:szCs w:val="22"/>
+        </w:rPr>
+        <w:t xml:space="preserve">Deployment, updates, and operational management of the application are handled by CRM Builder as part of its existing CRM deployment pipeline. This includes initial deployment, configuration, and subsequent updates.</w:t>
+      </w:r>
+    </w:p>
+    <w:p>
+      <w:r>
+        <w:br w:type="page"/>
+      </w:r>
+    </w:p>
+    <w:p>
+      <w:pPr>
+        <w:pStyle w:val="Heading1"/>
+        <w:spacing w:after="200" w:before="360"/>
+      </w:pPr>
+      <w:r>
+        <w:rPr>
+          <w:rFonts w:ascii="Arial" w:cs="Arial" w:eastAsia="Arial" w:hAnsi="Arial"/>
+          <w:b/>
+          <w:bCs/>
+          <w:color w:val="1F3864"/>
+          <w:sz w:val="28"/>
+          <w:szCs w:val="28"/>
+        </w:rPr>
+        <w:t xml:space="preserve">11. Initial Implementation — CBM Proof of Concept</w:t>
+      </w:r>
+    </w:p>
+    <w:p>
+      <w:pPr>
+        <w:pStyle w:val="Heading2"/>
+        <w:spacing w:after="160" w:before="280"/>
+      </w:pPr>
+      <w:r>
+        <w:rPr>
+          <w:rFonts w:ascii="Arial" w:cs="Arial" w:eastAsia="Arial" w:hAnsi="Arial"/>
+          <w:b/>
+          <w:bCs/>
+          <w:color w:val="1F3864"/>
+          <w:sz w:val="24"/>
+          <w:szCs w:val="24"/>
+        </w:rPr>
+        <w:t xml:space="preserve">11.1 Overview</w:t>
+      </w:r>
+    </w:p>
+    <w:p>
+      <w:pPr>
+        <w:spacing w:after="160"/>
+      </w:pPr>
+      <w:r>
+        <w:rPr>
+          <w:rFonts w:ascii="Arial" w:cs="Arial" w:eastAsia="Arial" w:hAnsi="Arial"/>
+          <w:color w:val="000000"/>
+          <w:sz w:val="22"/>
+          <w:szCs w:val="22"/>
+        </w:rPr>
+        <w:t xml:space="preserve">The initial proof of concept implements one data source, one view, and the complete engagement/session workflow for the Cleveland Business Mentors (CBM) program. This scope is sufficient to validate the application’s core architecture and provide immediate value to CBM volunteer mentors.</w:t>
+      </w:r>
+    </w:p>
+    <w:p>
+      <w:pPr>
+        <w:pStyle w:val="Heading2"/>
+        <w:spacing w:after="160" w:before="280"/>
+      </w:pPr>
+      <w:r>
+        <w:rPr>
+          <w:rFonts w:ascii="Arial" w:cs="Arial" w:eastAsia="Arial" w:hAnsi="Arial"/>
+          <w:b/>
+          <w:bCs/>
+          <w:color w:val="1F3864"/>
+          <w:sz w:val="24"/>
+          <w:szCs w:val="24"/>
+        </w:rPr>
+        <w:t xml:space="preserve">11.2 Data Source: Engagement Summary</w:t>
+      </w:r>
+    </w:p>
+    <w:p>
+      <w:pPr>
+        <w:spacing w:after="160"/>
+      </w:pPr>
+      <w:r>
+        <w:rPr>
+          <w:rFonts w:ascii="Arial" w:cs="Arial" w:eastAsia="Arial" w:hAnsi="Arial"/>
+          <w:color w:val="000000"/>
+          <w:sz w:val="22"/>
+          <w:szCs w:val="22"/>
+        </w:rPr>
+        <w:t xml:space="preserve">A single data source named “Engagement Summary” provides the foundation for the proof-of-concept view. The data source query joins across the following CRM entities:</w:t>
+      </w:r>
+    </w:p>
+    <w:p>
+      <w:pPr>
+        <w:pStyle w:val="ListParagraph"/>
+        <w:numPr>
+          <w:ilvl w:val="0"/>
+          <w:numId w:val="2"/>
+        </w:numPr>
+        <w:spacing w:after="80"/>
+      </w:pPr>
+      <w:r>
+        <w:rPr>
+          <w:rFonts w:ascii="Arial" w:cs="Arial" w:eastAsia="Arial" w:hAnsi="Arial"/>
+          <w:sz w:val="22"/>
+          <w:szCs w:val="22"/>
+        </w:rPr>
+        <w:t xml:space="preserve">Contact (client and mentor records)</w:t>
+      </w:r>
+    </w:p>
+    <w:p>
+      <w:pPr>
+        <w:pStyle w:val="ListParagraph"/>
+        <w:numPr>
+          <w:ilvl w:val="0"/>
+          <w:numId w:val="2"/>
+        </w:numPr>
+        <w:spacing w:after="80"/>
+      </w:pPr>
+      <w:r>
+        <w:rPr>
+          <w:rFonts w:ascii="Arial" w:cs="Arial" w:eastAsia="Arial" w:hAnsi="Arial"/>
+          <w:sz w:val="22"/>
+          <w:szCs w:val="22"/>
+        </w:rPr>
+        <w:t xml:space="preserve">Account (company/organization)</w:t>
+      </w:r>
+    </w:p>
+    <w:p>
+      <w:pPr>
+        <w:pStyle w:val="ListParagraph"/>
+        <w:numPr>
+          <w:ilvl w:val="0"/>
+          <w:numId w:val="2"/>
+        </w:numPr>
+        <w:spacing w:after="80"/>
+      </w:pPr>
+      <w:r>
+        <w:rPr>
+          <w:rFonts w:ascii="Arial" w:cs="Arial" w:eastAsia="Arial" w:hAnsi="Arial"/>
+          <w:sz w:val="22"/>
+          <w:szCs w:val="22"/>
+        </w:rPr>
+        <w:t xml:space="preserve">Engagement</w:t>
+      </w:r>
+    </w:p>
+    <w:p>
+      <w:pPr>
+        <w:pStyle w:val="ListParagraph"/>
+        <w:numPr>
+          <w:ilvl w:val="0"/>
+          <w:numId w:val="2"/>
+        </w:numPr>
+        <w:spacing w:after="80"/>
+      </w:pPr>
+      <w:r>
+        <w:rPr>
+          <w:rFonts w:ascii="Arial" w:cs="Arial" w:eastAsia="Arial" w:hAnsi="Arial"/>
+          <w:sz w:val="22"/>
+          <w:szCs w:val="22"/>
+        </w:rPr>
+        <w:t xml:space="preserve">Session</w:t>
+      </w:r>
+    </w:p>
+    <w:p>
+      <w:pPr>
+        <w:spacing w:after="160"/>
+      </w:pPr>
+      <w:r>
+        <w:rPr>
+          <w:rFonts w:ascii="Arial" w:cs="Arial" w:eastAsia="Arial" w:hAnsi="Arial"/>
+          <w:color w:val="000000"/>
+          <w:sz w:val="22"/>
+          <w:szCs w:val="22"/>
+        </w:rPr>
+        <w:t xml:space="preserve">The query returns a flat result set that includes fields from all four entities. The hierarchy definition organizes results by engagement as the top level, with sessions as the child level.</w:t>
+      </w:r>
+    </w:p>
+    <w:p>
+      <w:pPr>
+        <w:spacing w:after="160"/>
+      </w:pPr>
+      <w:r>
+        <w:rPr>
+          <w:rFonts w:ascii="Arial" w:cs="Arial" w:eastAsia="Arial" w:hAnsi="Arial"/>
+          <w:color w:val="000000"/>
+          <w:sz w:val="22"/>
+          <w:szCs w:val="22"/>
+        </w:rPr>
+        <w:t xml:space="preserve">Named parameters include the current user’s ID for mentor-based filtering.</w:t>
+      </w:r>
+    </w:p>
+    <w:p>
+      <w:pPr>
+        <w:pStyle w:val="Heading2"/>
+        <w:spacing w:after="160" w:before="280"/>
+      </w:pPr>
+      <w:r>
+        <w:rPr>
+          <w:rFonts w:ascii="Arial" w:cs="Arial" w:eastAsia="Arial" w:hAnsi="Arial"/>
+          <w:b/>
+          <w:bCs/>
+          <w:color w:val="1F3864"/>
+          <w:sz w:val="24"/>
+          <w:szCs w:val="24"/>
+        </w:rPr>
+        <w:t xml:space="preserve">11.3 View: My Active Engagements</w:t>
+      </w:r>
+    </w:p>
+    <w:p>
+      <w:pPr>
+        <w:spacing w:after="160"/>
+      </w:pPr>
+      <w:r>
+        <w:rPr>
+          <w:rFonts w:ascii="Arial" w:cs="Arial" w:eastAsia="Arial" w:hAnsi="Arial"/>
+          <w:color w:val="000000"/>
+          <w:sz w:val="22"/>
+          <w:szCs w:val="22"/>
+        </w:rPr>
+        <w:t xml:space="preserve">A single view named “My Active Engagements” is built on the Engagement Summary data source. The view displays the following columns:</w:t>
+      </w:r>
+    </w:p>
+    <w:tbl>
+      <w:tblPr>
+        <w:tblW w:type="dxa" w:w="9360"/>
+        <w:tblBorders>
+          <w:top w:val="single" w:color="auto" w:sz="4"/>
+          <w:left w:val="single" w:color="auto" w:sz="4"/>
+          <w:bottom w:val="single" w:color="auto" w:sz="4"/>
+          <w:right w:val="single" w:color="auto" w:sz="4"/>
+          <w:insideH w:val="single" w:color="auto" w:sz="4"/>
+          <w:insideV w:val="single" w:color="auto" w:sz="4"/>
+        </w:tblBorders>
+      </w:tblPr>
+      <w:tblGrid>
+        <w:gridCol w:w="2800"/>
+        <w:gridCol w:w="6560"/>
+      </w:tblGrid>
+      <w:tr>
+        <w:trPr>
+          <w:tblHeader/>
+        </w:trPr>
+        <w:tc>
+          <w:tcPr>
+            <w:tcW w:type="dxa" w:w="2800"/>
+            <w:tcBorders>
+              <w:top w:val="single" w:color="AAAAAA" w:sz="1"/>
+              <w:left w:val="single" w:color="AAAAAA" w:sz="1"/>
+              <w:bottom w:val="single" w:color="AAAAAA" w:sz="1"/>
+              <w:right w:val="single" w:color="AAAAAA" w:sz="1"/>
+            </w:tcBorders>
+            <w:shd w:fill="1F3864" w:val="clear"/>
+            <w:tcMar>
+              <w:top w:type="dxa" w:w="80"/>
+              <w:left w:type="dxa" w:w="120"/>
+              <w:bottom w:type="dxa" w:w="80"/>
+              <w:right w:type="dxa" w:w="120"/>
+            </w:tcMar>
+            <w:vAlign w:val="center"/>
+          </w:tcPr>
+          <w:p>
+            <w:r>
+              <w:rPr>
+                <w:rFonts w:ascii="Arial" w:cs="Arial" w:eastAsia="Arial" w:hAnsi="Arial"/>
+                <w:b/>
+                <w:bCs/>
+                <w:color w:val="FFFFFF"/>
+                <w:sz w:val="22"/>
+                <w:szCs w:val="22"/>
+              </w:rPr>
+              <w:t xml:space="preserve">Column</w:t>
+            </w:r>
+          </w:p>
+        </w:tc>
+        <w:tc>
+          <w:tcPr>
+            <w:tcW w:type="dxa" w:w="6560"/>
+            <w:tcBorders>
+              <w:top w:val="single" w:color="AAAAAA" w:sz="1"/>
+              <w:left w:val="single" w:color="AAAAAA" w:sz="1"/>
+              <w:bottom w:val="single" w:color="AAAAAA" w:sz="1"/>
+              <w:right w:val="single" w:color="AAAAAA" w:sz="1"/>
+            </w:tcBorders>
+            <w:shd w:fill="1F3864" w:val="clear"/>
+            <w:tcMar>
+              <w:top w:type="dxa" w:w="80"/>
+              <w:left w:type="dxa" w:w="120"/>
+              <w:bottom w:type="dxa" w:w="80"/>
+              <w:right w:type="dxa" w:w="120"/>
+            </w:tcMar>
+            <w:vAlign w:val="center"/>
+          </w:tcPr>
+          <w:p>
+            <w:r>
+              <w:rPr>
+                <w:rFonts w:ascii="Arial" w:cs="Arial" w:eastAsia="Arial" w:hAnsi="Arial"/>
+                <w:b/>
+                <w:bCs/>
+                <w:color w:val="FFFFFF"/>
+                <w:sz w:val="22"/>
+                <w:szCs w:val="22"/>
+              </w:rPr>
+              <w:t xml:space="preserve">Source</w:t>
+            </w:r>
+          </w:p>
+        </w:tc>
+      </w:tr>
+      <w:tr>
+        <w:tc>
+          <w:tcPr>
+            <w:tcW w:type="dxa" w:w="2800"/>
+            <w:tcBorders>
+              <w:top w:val="single" w:color="AAAAAA" w:sz="1"/>
+              <w:left w:val="single" w:color="AAAAAA" w:sz="1"/>
+              <w:bottom w:val="single" w:color="AAAAAA" w:sz="1"/>
+              <w:right w:val="single" w:color="AAAAAA" w:sz="1"/>
+            </w:tcBorders>
+            <w:tcMar>
+              <w:top w:type="dxa" w:w="80"/>
+              <w:left w:type="dxa" w:w="120"/>
+              <w:bottom w:type="dxa" w:w="80"/>
+              <w:right w:type="dxa" w:w="120"/>
+            </w:tcMar>
+            <w:vAlign w:val="top"/>
+          </w:tcPr>
+          <w:p>
+            <w:r>
+              <w:rPr>
+                <w:rFonts w:ascii="Arial" w:cs="Arial" w:eastAsia="Arial" w:hAnsi="Arial"/>
+                <w:sz w:val="22"/>
+                <w:szCs w:val="22"/>
+              </w:rPr>
+              <w:t xml:space="preserve">Client Name</w:t>
+            </w:r>
+          </w:p>
+        </w:tc>
+        <w:tc>
+          <w:tcPr>
+            <w:tcW w:type="dxa" w:w="6560"/>
+            <w:tcBorders>
+              <w:top w:val="single" w:color="AAAAAA" w:sz="1"/>
+              <w:left w:val="single" w:color="AAAAAA" w:sz="1"/>
+              <w:bottom w:val="single" w:color="AAAAAA" w:sz="1"/>
+              <w:right w:val="single" w:color="AAAAAA" w:sz="1"/>
+            </w:tcBorders>
+            <w:tcMar>
+              <w:top w:type="dxa" w:w="80"/>
+              <w:left w:type="dxa" w:w="120"/>
+              <w:bottom w:type="dxa" w:w="80"/>
+              <w:right w:type="dxa" w:w="120"/>
+            </w:tcMar>
+            <w:vAlign w:val="top"/>
+          </w:tcPr>
+          <w:p>
+            <w:r>
+              <w:rPr>
+                <w:rFonts w:ascii="Arial" w:cs="Arial" w:eastAsia="Arial" w:hAnsi="Arial"/>
+                <w:sz w:val="22"/>
+                <w:szCs w:val="22"/>
+              </w:rPr>
+              <w:t xml:space="preserve">Contact entity (client)</w:t>
+            </w:r>
+          </w:p>
+        </w:tc>
+      </w:tr>
+      <w:tr>
+        <w:tc>
+          <w:tcPr>
+            <w:tcW w:type="dxa" w:w="2800"/>
+            <w:tcBorders>
+              <w:top w:val="single" w:color="AAAAAA" w:sz="1"/>
+              <w:left w:val="single" w:color="AAAAAA" w:sz="1"/>
+              <w:bottom w:val="single" w:color="AAAAAA" w:sz="1"/>
+              <w:right w:val="single" w:color="AAAAAA" w:sz="1"/>
+            </w:tcBorders>
+            <w:shd w:fill="F2F7FB" w:val="clear"/>
+            <w:tcMar>
+              <w:top w:type="dxa" w:w="80"/>
+              <w:left w:type="dxa" w:w="120"/>
+              <w:bottom w:type="dxa" w:w="80"/>
+              <w:right w:type="dxa" w:w="120"/>
+            </w:tcMar>
+            <w:vAlign w:val="top"/>
+          </w:tcPr>
+          <w:p>
+            <w:r>
+              <w:rPr>
+                <w:rFonts w:ascii="Arial" w:cs="Arial" w:eastAsia="Arial" w:hAnsi="Arial"/>
+                <w:sz w:val="22"/>
+                <w:szCs w:val="22"/>
+              </w:rPr>
+              <w:t xml:space="preserve">Company</w:t>
+            </w:r>
+          </w:p>
+        </w:tc>
+        <w:tc>
+          <w:tcPr>
+            <w:tcW w:type="dxa" w:w="6560"/>
+            <w:tcBorders>
+              <w:top w:val="single" w:color="AAAAAA" w:sz="1"/>
+              <w:left w:val="single" w:color="AAAAAA" w:sz="1"/>
+              <w:bottom w:val="single" w:color="AAAAAA" w:sz="1"/>
+              <w:right w:val="single" w:color="AAAAAA" w:sz="1"/>
+            </w:tcBorders>
+            <w:shd w:fill="F2F7FB" w:val="clear"/>
+            <w:tcMar>
+              <w:top w:type="dxa" w:w="80"/>
+              <w:left w:type="dxa" w:w="120"/>
+              <w:bottom w:type="dxa" w:w="80"/>
+              <w:right w:type="dxa" w:w="120"/>
+            </w:tcMar>
+            <w:vAlign w:val="top"/>
+          </w:tcPr>
+          <w:p>
+            <w:r>
+              <w:rPr>
+                <w:rFonts w:ascii="Arial" w:cs="Arial" w:eastAsia="Arial" w:hAnsi="Arial"/>
+                <w:sz w:val="22"/>
+                <w:szCs w:val="22"/>
+              </w:rPr>
+              <w:t xml:space="preserve">Account entity</w:t>
+            </w:r>
+          </w:p>
+        </w:tc>
+      </w:tr>
+      <w:tr>
+        <w:tc>
+          <w:tcPr>
+            <w:tcW w:type="dxa" w:w="2800"/>
+            <w:tcBorders>
+              <w:top w:val="single" w:color="AAAAAA" w:sz="1"/>
+              <w:left w:val="single" w:color="AAAAAA" w:sz="1"/>
+              <w:bottom w:val="single" w:color="AAAAAA" w:sz="1"/>
+              <w:right w:val="single" w:color="AAAAAA" w:sz="1"/>
+            </w:tcBorders>
+            <w:tcMar>
+              <w:top w:type="dxa" w:w="80"/>
+              <w:left w:type="dxa" w:w="120"/>
+              <w:bottom w:type="dxa" w:w="80"/>
+              <w:right w:type="dxa" w:w="120"/>
+            </w:tcMar>
+            <w:vAlign w:val="top"/>
+          </w:tcPr>
+          <w:p>
+            <w:r>
+              <w:rPr>
+                <w:rFonts w:ascii="Arial" w:cs="Arial" w:eastAsia="Arial" w:hAnsi="Arial"/>
+                <w:sz w:val="22"/>
+                <w:szCs w:val="22"/>
+              </w:rPr>
+              <w:t xml:space="preserve">Engagement Start Date</w:t>
+            </w:r>
+          </w:p>
+        </w:tc>
+        <w:tc>
+          <w:tcPr>
+            <w:tcW w:type="dxa" w:w="6560"/>
+            <w:tcBorders>
+              <w:top w:val="single" w:color="AAAAAA" w:sz="1"/>
+              <w:left w:val="single" w:color="AAAAAA" w:sz="1"/>
+              <w:bottom w:val="single" w:color="AAAAAA" w:sz="1"/>
+              <w:right w:val="single" w:color="AAAAAA" w:sz="1"/>
+            </w:tcBorders>
+            <w:tcMar>
+              <w:top w:type="dxa" w:w="80"/>
+              <w:left w:type="dxa" w:w="120"/>
+              <w:bottom w:type="dxa" w:w="80"/>
+              <w:right w:type="dxa" w:w="120"/>
+            </w:tcMar>
+            <w:vAlign w:val="top"/>
+          </w:tcPr>
+          <w:p>
+            <w:r>
+              <w:rPr>
+                <w:rFonts w:ascii="Arial" w:cs="Arial" w:eastAsia="Arial" w:hAnsi="Arial"/>
+                <w:sz w:val="22"/>
+                <w:szCs w:val="22"/>
+              </w:rPr>
+              <w:t xml:space="preserve">Engagement entity</w:t>
+            </w:r>
+          </w:p>
+        </w:tc>
+      </w:tr>
+      <w:tr>
+        <w:tc>
+          <w:tcPr>
+            <w:tcW w:type="dxa" w:w="2800"/>
+            <w:tcBorders>
+              <w:top w:val="single" w:color="AAAAAA" w:sz="1"/>
+              <w:left w:val="single" w:color="AAAAAA" w:sz="1"/>
+              <w:bottom w:val="single" w:color="AAAAAA" w:sz="1"/>
+              <w:right w:val="single" w:color="AAAAAA" w:sz="1"/>
+            </w:tcBorders>
+            <w:shd w:fill="F2F7FB" w:val="clear"/>
+            <w:tcMar>
+              <w:top w:type="dxa" w:w="80"/>
+              <w:left w:type="dxa" w:w="120"/>
+              <w:bottom w:type="dxa" w:w="80"/>
+              <w:right w:type="dxa" w:w="120"/>
+            </w:tcMar>
+            <w:vAlign w:val="top"/>
+          </w:tcPr>
+          <w:p>
+            <w:r>
+              <w:rPr>
+                <w:rFonts w:ascii="Arial" w:cs="Arial" w:eastAsia="Arial" w:hAnsi="Arial"/>
+                <w:sz w:val="22"/>
+                <w:szCs w:val="22"/>
+              </w:rPr>
+              <w:t xml:space="preserve">Engagement Status</w:t>
+            </w:r>
+          </w:p>
+        </w:tc>
+        <w:tc>
+          <w:tcPr>
+            <w:tcW w:type="dxa" w:w="6560"/>
+            <w:tcBorders>
+              <w:top w:val="single" w:color="AAAAAA" w:sz="1"/>
+              <w:left w:val="single" w:color="AAAAAA" w:sz="1"/>
+              <w:bottom w:val="single" w:color="AAAAAA" w:sz="1"/>
+              <w:right w:val="single" w:color="AAAAAA" w:sz="1"/>
+            </w:tcBorders>
+            <w:shd w:fill="F2F7FB" w:val="clear"/>
+            <w:tcMar>
+              <w:top w:type="dxa" w:w="80"/>
+              <w:left w:type="dxa" w:w="120"/>
+              <w:bottom w:type="dxa" w:w="80"/>
+              <w:right w:type="dxa" w:w="120"/>
+            </w:tcMar>
+            <w:vAlign w:val="top"/>
+          </w:tcPr>
+          <w:p>
+            <w:r>
+              <w:rPr>
+                <w:rFonts w:ascii="Arial" w:cs="Arial" w:eastAsia="Arial" w:hAnsi="Arial"/>
+                <w:sz w:val="22"/>
+                <w:szCs w:val="22"/>
+              </w:rPr>
+              <w:t xml:space="preserve">Engagement entity</w:t>
+            </w:r>
+          </w:p>
+        </w:tc>
+      </w:tr>
+      <w:tr>
+        <w:tc>
+          <w:tcPr>
+            <w:tcW w:type="dxa" w:w="2800"/>
+            <w:tcBorders>
+              <w:top w:val="single" w:color="AAAAAA" w:sz="1"/>
+              <w:left w:val="single" w:color="AAAAAA" w:sz="1"/>
+              <w:bottom w:val="single" w:color="AAAAAA" w:sz="1"/>
+              <w:right w:val="single" w:color="AAAAAA" w:sz="1"/>
+            </w:tcBorders>
+            <w:tcMar>
+              <w:top w:type="dxa" w:w="80"/>
+              <w:left w:type="dxa" w:w="120"/>
+              <w:bottom w:type="dxa" w:w="80"/>
+              <w:right w:type="dxa" w:w="120"/>
+            </w:tcMar>
+            <w:vAlign w:val="top"/>
+          </w:tcPr>
+          <w:p>
+            <w:r>
+              <w:rPr>
+                <w:rFonts w:ascii="Arial" w:cs="Arial" w:eastAsia="Arial" w:hAnsi="Arial"/>
+                <w:sz w:val="22"/>
+                <w:szCs w:val="22"/>
+              </w:rPr>
+              <w:t xml:space="preserve">Sessions Completed</w:t>
+            </w:r>
+          </w:p>
+        </w:tc>
+        <w:tc>
+          <w:tcPr>
+            <w:tcW w:type="dxa" w:w="6560"/>
+            <w:tcBorders>
+              <w:top w:val="single" w:color="AAAAAA" w:sz="1"/>
+              <w:left w:val="single" w:color="AAAAAA" w:sz="1"/>
+              <w:bottom w:val="single" w:color="AAAAAA" w:sz="1"/>
+              <w:right w:val="single" w:color="AAAAAA" w:sz="1"/>
+            </w:tcBorders>
+            <w:tcMar>
+              <w:top w:type="dxa" w:w="80"/>
+              <w:left w:type="dxa" w:w="120"/>
+              <w:bottom w:type="dxa" w:w="80"/>
+              <w:right w:type="dxa" w:w="120"/>
+            </w:tcMar>
+            <w:vAlign w:val="top"/>
+          </w:tcPr>
+          <w:p>
+            <w:r>
+              <w:rPr>
+                <w:rFonts w:ascii="Arial" w:cs="Arial" w:eastAsia="Arial" w:hAnsi="Arial"/>
+                <w:sz w:val="22"/>
+                <w:szCs w:val="22"/>
+              </w:rPr>
+              <w:t xml:space="preserve">Computed: count of sessions with Completed status</w:t>
+            </w:r>
+          </w:p>
+        </w:tc>
+      </w:tr>
+      <w:tr>
+        <w:tc>
+          <w:tcPr>
+            <w:tcW w:type="dxa" w:w="2800"/>
+            <w:tcBorders>
+              <w:top w:val="single" w:color="AAAAAA" w:sz="1"/>
+              <w:left w:val="single" w:color="AAAAAA" w:sz="1"/>
+              <w:bottom w:val="single" w:color="AAAAAA" w:sz="1"/>
+              <w:right w:val="single" w:color="AAAAAA" w:sz="1"/>
+            </w:tcBorders>
+            <w:shd w:fill="F2F7FB" w:val="clear"/>
+            <w:tcMar>
+              <w:top w:type="dxa" w:w="80"/>
+              <w:left w:type="dxa" w:w="120"/>
+              <w:bottom w:type="dxa" w:w="80"/>
+              <w:right w:type="dxa" w:w="120"/>
+            </w:tcMar>
+            <w:vAlign w:val="top"/>
+          </w:tcPr>
+          <w:p>
+            <w:r>
+              <w:rPr>
+                <w:rFonts w:ascii="Arial" w:cs="Arial" w:eastAsia="Arial" w:hAnsi="Arial"/>
+                <w:sz w:val="22"/>
+                <w:szCs w:val="22"/>
+              </w:rPr>
+              <w:t xml:space="preserve">Last Session Date</w:t>
+            </w:r>
+          </w:p>
+        </w:tc>
+        <w:tc>
+          <w:tcPr>
+            <w:tcW w:type="dxa" w:w="6560"/>
+            <w:tcBorders>
+              <w:top w:val="single" w:color="AAAAAA" w:sz="1"/>
+              <w:left w:val="single" w:color="AAAAAA" w:sz="1"/>
+              <w:bottom w:val="single" w:color="AAAAAA" w:sz="1"/>
+              <w:right w:val="single" w:color="AAAAAA" w:sz="1"/>
+            </w:tcBorders>
+            <w:shd w:fill="F2F7FB" w:val="clear"/>
+            <w:tcMar>
+              <w:top w:type="dxa" w:w="80"/>
+              <w:left w:type="dxa" w:w="120"/>
+              <w:bottom w:type="dxa" w:w="80"/>
+              <w:right w:type="dxa" w:w="120"/>
+            </w:tcMar>
+            <w:vAlign w:val="top"/>
+          </w:tcPr>
+          <w:p>
+            <w:r>
+              <w:rPr>
+                <w:rFonts w:ascii="Arial" w:cs="Arial" w:eastAsia="Arial" w:hAnsi="Arial"/>
+                <w:sz w:val="22"/>
+                <w:szCs w:val="22"/>
+              </w:rPr>
+              <w:t xml:space="preserve">Computed: most recent session date with Completed status</w:t>
+            </w:r>
+          </w:p>
+        </w:tc>
+      </w:tr>
+      <w:tr>
+        <w:tc>
+          <w:tcPr>
+            <w:tcW w:type="dxa" w:w="2800"/>
+            <w:tcBorders>
+              <w:top w:val="single" w:color="AAAAAA" w:sz="1"/>
+              <w:left w:val="single" w:color="AAAAAA" w:sz="1"/>
+              <w:bottom w:val="single" w:color="AAAAAA" w:sz="1"/>
+              <w:right w:val="single" w:color="AAAAAA" w:sz="1"/>
+            </w:tcBorders>
+            <w:tcMar>
+              <w:top w:type="dxa" w:w="80"/>
+              <w:left w:type="dxa" w:w="120"/>
+              <w:bottom w:type="dxa" w:w="80"/>
+              <w:right w:type="dxa" w:w="120"/>
+            </w:tcMar>
+            <w:vAlign w:val="top"/>
+          </w:tcPr>
+          <w:p>
+            <w:r>
+              <w:rPr>
+                <w:rFonts w:ascii="Arial" w:cs="Arial" w:eastAsia="Arial" w:hAnsi="Arial"/>
+                <w:sz w:val="22"/>
+                <w:szCs w:val="22"/>
+              </w:rPr>
+              <w:t xml:space="preserve">Next Scheduled Session</w:t>
+            </w:r>
+          </w:p>
+        </w:tc>
+        <w:tc>
+          <w:tcPr>
+            <w:tcW w:type="dxa" w:w="6560"/>
+            <w:tcBorders>
+              <w:top w:val="single" w:color="AAAAAA" w:sz="1"/>
+              <w:left w:val="single" w:color="AAAAAA" w:sz="1"/>
+              <w:bottom w:val="single" w:color="AAAAAA" w:sz="1"/>
+              <w:right w:val="single" w:color="AAAAAA" w:sz="1"/>
+            </w:tcBorders>
+            <w:tcMar>
+              <w:top w:type="dxa" w:w="80"/>
+              <w:left w:type="dxa" w:w="120"/>
+              <w:bottom w:type="dxa" w:w="80"/>
+              <w:right w:type="dxa" w:w="120"/>
+            </w:tcMar>
+            <w:vAlign w:val="top"/>
+          </w:tcPr>
+          <w:p>
+            <w:r>
+              <w:rPr>
+                <w:rFonts w:ascii="Arial" w:cs="Arial" w:eastAsia="Arial" w:hAnsi="Arial"/>
+                <w:sz w:val="22"/>
+                <w:szCs w:val="22"/>
+              </w:rPr>
+              <w:t xml:space="preserve">Computed: earliest session date with Scheduled status</w:t>
+            </w:r>
+          </w:p>
+        </w:tc>
+      </w:tr>
+      <w:tr>
+        <w:tc>
+          <w:tcPr>
+            <w:tcW w:type="dxa" w:w="2800"/>
+            <w:tcBorders>
+              <w:top w:val="single" w:color="AAAAAA" w:sz="1"/>
+              <w:left w:val="single" w:color="AAAAAA" w:sz="1"/>
+              <w:bottom w:val="single" w:color="AAAAAA" w:sz="1"/>
+              <w:right w:val="single" w:color="AAAAAA" w:sz="1"/>
+            </w:tcBorders>
+            <w:shd w:fill="F2F7FB" w:val="clear"/>
+            <w:tcMar>
+              <w:top w:type="dxa" w:w="80"/>
+              <w:left w:type="dxa" w:w="120"/>
+              <w:bottom w:type="dxa" w:w="80"/>
+              <w:right w:type="dxa" w:w="120"/>
+            </w:tcMar>
+            <w:vAlign w:val="top"/>
+          </w:tcPr>
+          <w:p>
+            <w:r>
+              <w:rPr>
+                <w:rFonts w:ascii="Arial" w:cs="Arial" w:eastAsia="Arial" w:hAnsi="Arial"/>
+                <w:sz w:val="22"/>
+                <w:szCs w:val="22"/>
+              </w:rPr>
+              <w:t xml:space="preserve">Co-Mentors / SMEs</w:t>
+            </w:r>
+          </w:p>
+        </w:tc>
+        <w:tc>
+          <w:tcPr>
+            <w:tcW w:type="dxa" w:w="6560"/>
+            <w:tcBorders>
+              <w:top w:val="single" w:color="AAAAAA" w:sz="1"/>
+              <w:left w:val="single" w:color="AAAAAA" w:sz="1"/>
+              <w:bottom w:val="single" w:color="AAAAAA" w:sz="1"/>
+              <w:right w:val="single" w:color="AAAAAA" w:sz="1"/>
+            </w:tcBorders>
+            <w:shd w:fill="F2F7FB" w:val="clear"/>
+            <w:tcMar>
+              <w:top w:type="dxa" w:w="80"/>
+              <w:left w:type="dxa" w:w="120"/>
+              <w:bottom w:type="dxa" w:w="80"/>
+              <w:right w:type="dxa" w:w="120"/>
+            </w:tcMar>
+            <w:vAlign w:val="top"/>
+          </w:tcPr>
+          <w:p>
+            <w:r>
+              <w:rPr>
+                <w:rFonts w:ascii="Arial" w:cs="Arial" w:eastAsia="Arial" w:hAnsi="Arial"/>
+                <w:sz w:val="22"/>
+                <w:szCs w:val="22"/>
+              </w:rPr>
+              <w:t xml:space="preserve">Engagement relationships (Additional Mentors)</w:t>
+            </w:r>
+          </w:p>
+        </w:tc>
+      </w:tr>
+      <w:tr>
+        <w:tc>
+          <w:tcPr>
+            <w:tcW w:type="dxa" w:w="2800"/>
+            <w:tcBorders>
+              <w:top w:val="single" w:color="AAAAAA" w:sz="1"/>
+              <w:left w:val="single" w:color="AAAAAA" w:sz="1"/>
+              <w:bottom w:val="single" w:color="AAAAAA" w:sz="1"/>
+              <w:right w:val="single" w:color="AAAAAA" w:sz="1"/>
+            </w:tcBorders>
+            <w:tcMar>
+              <w:top w:type="dxa" w:w="80"/>
+              <w:left w:type="dxa" w:w="120"/>
+              <w:bottom w:type="dxa" w:w="80"/>
+              <w:right w:type="dxa" w:w="120"/>
+            </w:tcMar>
+            <w:vAlign w:val="top"/>
+          </w:tcPr>
+          <w:p>
+            <w:r>
+              <w:rPr>
+                <w:rFonts w:ascii="Arial" w:cs="Arial" w:eastAsia="Arial" w:hAnsi="Arial"/>
+                <w:sz w:val="22"/>
+                <w:szCs w:val="22"/>
+              </w:rPr>
+              <w:t xml:space="preserve">QuickNote</w:t>
+            </w:r>
+          </w:p>
+        </w:tc>
+        <w:tc>
+          <w:tcPr>
+            <w:tcW w:type="dxa" w:w="6560"/>
+            <w:tcBorders>
+              <w:top w:val="single" w:color="AAAAAA" w:sz="1"/>
+              <w:left w:val="single" w:color="AAAAAA" w:sz="1"/>
+              <w:bottom w:val="single" w:color="AAAAAA" w:sz="1"/>
+              <w:right w:val="single" w:color="AAAAAA" w:sz="1"/>
+            </w:tcBorders>
+            <w:tcMar>
+              <w:top w:type="dxa" w:w="80"/>
+              <w:left w:type="dxa" w:w="120"/>
+              <w:bottom w:type="dxa" w:w="80"/>
+              <w:right w:type="dxa" w:w="120"/>
+            </w:tcMar>
+            <w:vAlign w:val="top"/>
+          </w:tcPr>
+          <w:p>
+            <w:r>
+              <w:rPr>
+                <w:rFonts w:ascii="Arial" w:cs="Arial" w:eastAsia="Arial" w:hAnsi="Arial"/>
+                <w:sz w:val="22"/>
+                <w:szCs w:val="22"/>
+              </w:rPr>
+              <w:t xml:space="preserve">Engagement entity (editable in grid via detail screen)</w:t>
+            </w:r>
+          </w:p>
+        </w:tc>
+      </w:tr>
+    </w:tbl>
+    <w:p>
+      <w:pPr>
+        <w:spacing w:after="160"/>
+      </w:pPr>
+    </w:p>
+    <w:p>
+      <w:pPr>
+        <w:spacing w:after="160"/>
+      </w:pPr>
+      <w:r>
+        <w:rPr>
+          <w:rFonts w:ascii="Arial" w:cs="Arial" w:eastAsia="Arial" w:hAnsi="Arial"/>
+          <w:color w:val="000000"/>
+          <w:sz w:val="22"/>
+          <w:szCs w:val="22"/>
+        </w:rPr>
+        <w:t xml:space="preserve">The view applies a preset filter for active engagements only. For Mentors, the role-based parameter further filters to only their assigned engagements. Default sort is by Next Scheduled Session ascending (soonest first).</w:t>
+      </w:r>
+    </w:p>
+    <w:p>
+      <w:pPr>
+        <w:pStyle w:val="Heading2"/>
+        <w:spacing w:after="160" w:before="280"/>
+      </w:pPr>
+      <w:r>
+        <w:rPr>
+          <w:rFonts w:ascii="Arial" w:cs="Arial" w:eastAsia="Arial" w:hAnsi="Arial"/>
+          <w:b/>
+          <w:bCs/>
+          <w:color w:val="1F3864"/>
+          <w:sz w:val="24"/>
+          <w:szCs w:val="24"/>
+        </w:rPr>
+        <w:t xml:space="preserve">11.4 Engagement Detail Screen</w:t>
+      </w:r>
+    </w:p>
+    <w:p>
+      <w:pPr>
+        <w:spacing w:after="160"/>
+      </w:pPr>
+      <w:r>
+        <w:rPr>
+          <w:rFonts w:ascii="Arial" w:cs="Arial" w:eastAsia="Arial" w:hAnsi="Arial"/>
+          <w:color w:val="000000"/>
+          <w:sz w:val="22"/>
+          <w:szCs w:val="22"/>
+        </w:rPr>
+        <w:t xml:space="preserve">Selecting an engagement from the grid opens the engagement detail screen, which displays:</w:t>
+      </w:r>
+    </w:p>
+    <w:p>
+      <w:pPr>
+        <w:pStyle w:val="ListParagraph"/>
+        <w:numPr>
+          <w:ilvl w:val="0"/>
+          <w:numId w:val="2"/>
+        </w:numPr>
+        <w:spacing w:after="80"/>
+      </w:pPr>
+      <w:r>
+        <w:rPr>
+          <w:rFonts w:ascii="Arial" w:cs="Arial" w:eastAsia="Arial" w:hAnsi="Arial"/>
+          <w:sz w:val="22"/>
+          <w:szCs w:val="22"/>
+        </w:rPr>
+        <w:t xml:space="preserve">Client contact details: name, phone, email</w:t>
+      </w:r>
+    </w:p>
+    <w:p>
+      <w:pPr>
+        <w:pStyle w:val="ListParagraph"/>
+        <w:numPr>
+          <w:ilvl w:val="0"/>
+          <w:numId w:val="2"/>
+        </w:numPr>
+        <w:spacing w:after="80"/>
+      </w:pPr>
+      <w:r>
+        <w:rPr>
+          <w:rFonts w:ascii="Arial" w:cs="Arial" w:eastAsia="Arial" w:hAnsi="Arial"/>
+          <w:sz w:val="22"/>
+          <w:szCs w:val="22"/>
+        </w:rPr>
+        <w:t xml:space="preserve">Company details</w:t>
+      </w:r>
+    </w:p>
+    <w:p>
+      <w:pPr>
+        <w:pStyle w:val="ListParagraph"/>
+        <w:numPr>
+          <w:ilvl w:val="0"/>
+          <w:numId w:val="2"/>
+        </w:numPr>
+        <w:spacing w:after="80"/>
+      </w:pPr>
+      <w:r>
+        <w:rPr>
+          <w:rFonts w:ascii="Arial" w:cs="Arial" w:eastAsia="Arial" w:hAnsi="Arial"/>
+          <w:sz w:val="22"/>
+          <w:szCs w:val="22"/>
+        </w:rPr>
+        <w:t xml:space="preserve">Engagement metadata: start date, status, meeting cadence</w:t>
+      </w:r>
+    </w:p>
+    <w:p>
+      <w:pPr>
+        <w:pStyle w:val="ListParagraph"/>
+        <w:numPr>
+          <w:ilvl w:val="0"/>
+          <w:numId w:val="2"/>
+        </w:numPr>
+        <w:spacing w:after="80"/>
+      </w:pPr>
+      <w:r>
+        <w:rPr>
+          <w:rFonts w:ascii="Arial" w:cs="Arial" w:eastAsia="Arial" w:hAnsi="Arial"/>
+          <w:sz w:val="22"/>
+          <w:szCs w:val="22"/>
+        </w:rPr>
+        <w:t xml:space="preserve">Co-mentors and SMEs assigned</w:t>
+      </w:r>
+    </w:p>
+    <w:p>
+      <w:pPr>
+        <w:pStyle w:val="ListParagraph"/>
+        <w:numPr>
+          <w:ilvl w:val="0"/>
+          <w:numId w:val="2"/>
+        </w:numPr>
+        <w:spacing w:after="80"/>
+      </w:pPr>
+      <w:r>
+        <w:rPr>
+          <w:rFonts w:ascii="Arial" w:cs="Arial" w:eastAsia="Arial" w:hAnsi="Arial"/>
+          <w:sz w:val="22"/>
+          <w:szCs w:val="22"/>
+        </w:rPr>
+        <w:t xml:space="preserve">QuickNote (editable)</w:t>
+      </w:r>
+    </w:p>
+    <w:p>
+      <w:pPr>
+        <w:pStyle w:val="ListParagraph"/>
+        <w:numPr>
+          <w:ilvl w:val="0"/>
+          <w:numId w:val="2"/>
+        </w:numPr>
+        <w:spacing w:after="80"/>
+      </w:pPr>
+      <w:r>
+        <w:rPr>
+          <w:rFonts w:ascii="Arial" w:cs="Arial" w:eastAsia="Arial" w:hAnsi="Arial"/>
+          <w:sz w:val="22"/>
+          <w:szCs w:val="22"/>
+        </w:rPr>
+        <w:t xml:space="preserve">Engagement Notes</w:t>
+      </w:r>
+    </w:p>
+    <w:p>
+      <w:pPr>
+        <w:pStyle w:val="ListParagraph"/>
+        <w:numPr>
+          <w:ilvl w:val="0"/>
+          <w:numId w:val="2"/>
+        </w:numPr>
+        <w:spacing w:after="80"/>
+      </w:pPr>
+      <w:r>
+        <w:rPr>
+          <w:rFonts w:ascii="Arial" w:cs="Arial" w:eastAsia="Arial" w:hAnsi="Arial"/>
+          <w:sz w:val="22"/>
+          <w:szCs w:val="22"/>
+        </w:rPr>
+        <w:t xml:space="preserve">Session history: all sessions with date, status, and session notes</w:t>
+      </w:r>
+    </w:p>
+    <w:p>
+      <w:pPr>
+        <w:spacing w:after="160"/>
+      </w:pPr>
+      <w:r>
+        <w:rPr>
+          <w:rFonts w:ascii="Arial" w:cs="Arial" w:eastAsia="Arial" w:hAnsi="Arial"/>
+          <w:color w:val="000000"/>
+          <w:sz w:val="22"/>
+          <w:szCs w:val="22"/>
+        </w:rPr>
+        <w:t xml:space="preserve">All fields are editable with auto-save. The mentor can add co-mentors/SMEs via the relationship addition feature.</w:t>
+      </w:r>
+    </w:p>
+    <w:p>
+      <w:pPr>
+        <w:pStyle w:val="Heading2"/>
+        <w:spacing w:after="160" w:before="280"/>
+      </w:pPr>
+      <w:r>
+        <w:rPr>
+          <w:rFonts w:ascii="Arial" w:cs="Arial" w:eastAsia="Arial" w:hAnsi="Arial"/>
+          <w:b/>
+          <w:bCs/>
+          <w:color w:val="1F3864"/>
+          <w:sz w:val="24"/>
+          <w:szCs w:val="24"/>
+        </w:rPr>
+        <w:t xml:space="preserve">11.5 Session Workflow</w:t>
+      </w:r>
+    </w:p>
+    <w:p>
+      <w:pPr>
+        <w:spacing w:after="160"/>
+      </w:pPr>
+      <w:r>
+        <w:rPr>
+          <w:rFonts w:ascii="Arial" w:cs="Arial" w:eastAsia="Arial" w:hAnsi="Arial"/>
+          <w:color w:val="000000"/>
+          <w:sz w:val="22"/>
+          <w:szCs w:val="22"/>
+        </w:rPr>
+        <w:t xml:space="preserve">From the engagement detail screen, the mentor selects an existing scheduled session or creates a new one. The session form captures: date/time, duration, attendees, status, session notes, topics discussed, and next session date/time.</w:t>
+      </w:r>
+    </w:p>
+    <w:p>
+      <w:pPr>
+        <w:spacing w:after="160"/>
+      </w:pPr>
+      <w:r>
+        <w:rPr>
+          <w:rFonts w:ascii="Arial" w:cs="Arial" w:eastAsia="Arial" w:hAnsi="Arial"/>
+          <w:color w:val="000000"/>
+          <w:sz w:val="22"/>
+          <w:szCs w:val="22"/>
+        </w:rPr>
+        <w:t xml:space="preserve">Entering a next session date/time triggers Google Calendar event creation with all engagement contacts and co-mentors/SMEs as attendees. Pressing Done presents the session summary email workflow, pre-populated with session notes and next steps, with recipients defaulting to all engagement contacts.</w:t>
+      </w:r>
+    </w:p>
+    <w:p>
+      <w:r>
+        <w:br w:type="page"/>
+      </w:r>
+    </w:p>
+    <w:p>
+      <w:pPr>
+        <w:pStyle w:val="Heading1"/>
+        <w:spacing w:after="200" w:before="360"/>
+      </w:pPr>
+      <w:r>
+        <w:rPr>
+          <w:rFonts w:ascii="Arial" w:cs="Arial" w:eastAsia="Arial" w:hAnsi="Arial"/>
+          <w:b/>
+          <w:bCs/>
+          <w:color w:val="1F3864"/>
+          <w:sz w:val="28"/>
+          <w:szCs w:val="28"/>
+        </w:rPr>
+        <w:t xml:space="preserve">12. Open Issues and Decisions</w:t>
       </w:r>
     </w:p>
     <w:tbl>
@@ -7148,7 +9589,7 @@
                 <w:sz w:val="22"/>
                 <w:szCs w:val="22"/>
               </w:rPr>
-              <w:t xml:space="preserve">Initial CBM data sources and views</w:t>
+              <w:t xml:space="preserve">CRM schema change management</w:t>
             </w:r>
           </w:p>
         </w:tc>
@@ -7177,7 +9618,7 @@
                 <w:sz w:val="22"/>
                 <w:szCs w:val="22"/>
               </w:rPr>
-              <w:t xml:space="preserve">The specific data sources and views for the Cleveland Business Mentors proof of concept need to be defined based on the CBM program workflows and mentor needs.</w:t>
+              <w:t xml:space="preserve">Data source queries reference CRM database tables directly. A process for validating data sources after CRM upgrades needs to be defined to prevent broken views.</w:t>
             </w:r>
           </w:p>
         </w:tc>
@@ -7235,7 +9676,7 @@
                 <w:sz w:val="22"/>
                 <w:szCs w:val="22"/>
               </w:rPr>
-              <w:t xml:space="preserve">CRM schema change management</w:t>
+              <w:t xml:space="preserve">Google Workspace OAuth configuration</w:t>
             </w:r>
           </w:p>
         </w:tc>
@@ -7263,7 +9704,271 @@
                 <w:sz w:val="22"/>
                 <w:szCs w:val="22"/>
               </w:rPr>
-              <w:t xml:space="preserve">Data source queries reference CRM database tables directly. A process for validating data sources after CRM upgrades needs to be defined to prevent broken views.</w:t>
+              <w:t xml:space="preserve">The Google Cloud project, OAuth client credentials, authorized redirect URIs, and scope approvals need to be configured for the production environment.</w:t>
+            </w:r>
+          </w:p>
+        </w:tc>
+      </w:tr>
+      <w:tr>
+        <w:tc>
+          <w:tcPr>
+            <w:tcW w:type="dxa" w:w="600"/>
+            <w:tcBorders>
+              <w:top w:val="single" w:color="AAAAAA" w:sz="1"/>
+              <w:left w:val="single" w:color="AAAAAA" w:sz="1"/>
+              <w:bottom w:val="single" w:color="AAAAAA" w:sz="1"/>
+              <w:right w:val="single" w:color="AAAAAA" w:sz="1"/>
+            </w:tcBorders>
+            <w:shd w:fill="F2F7FB" w:val="clear"/>
+            <w:tcMar>
+              <w:top w:type="dxa" w:w="80"/>
+              <w:left w:type="dxa" w:w="120"/>
+              <w:bottom w:type="dxa" w:w="80"/>
+              <w:right w:type="dxa" w:w="120"/>
+            </w:tcMar>
+            <w:vAlign w:val="top"/>
+          </w:tcPr>
+          <w:p>
+            <w:r>
+              <w:rPr>
+                <w:rFonts w:ascii="Arial" w:cs="Arial" w:eastAsia="Arial" w:hAnsi="Arial"/>
+                <w:sz w:val="22"/>
+                <w:szCs w:val="22"/>
+              </w:rPr>
+              <w:t xml:space="preserve">8</w:t>
+            </w:r>
+          </w:p>
+        </w:tc>
+        <w:tc>
+          <w:tcPr>
+            <w:tcW w:type="dxa" w:w="3200"/>
+            <w:tcBorders>
+              <w:top w:val="single" w:color="AAAAAA" w:sz="1"/>
+              <w:left w:val="single" w:color="AAAAAA" w:sz="1"/>
+              <w:bottom w:val="single" w:color="AAAAAA" w:sz="1"/>
+              <w:right w:val="single" w:color="AAAAAA" w:sz="1"/>
+            </w:tcBorders>
+            <w:shd w:fill="F2F7FB" w:val="clear"/>
+            <w:tcMar>
+              <w:top w:type="dxa" w:w="80"/>
+              <w:left w:type="dxa" w:w="120"/>
+              <w:bottom w:type="dxa" w:w="80"/>
+              <w:right w:type="dxa" w:w="120"/>
+            </w:tcMar>
+            <w:vAlign w:val="top"/>
+          </w:tcPr>
+          <w:p>
+            <w:r>
+              <w:rPr>
+                <w:rFonts w:ascii="Arial" w:cs="Arial" w:eastAsia="Arial" w:hAnsi="Arial"/>
+                <w:sz w:val="22"/>
+                <w:szCs w:val="22"/>
+              </w:rPr>
+              <w:t xml:space="preserve">Calendar event update and cancellation</w:t>
+            </w:r>
+          </w:p>
+        </w:tc>
+        <w:tc>
+          <w:tcPr>
+            <w:tcW w:type="dxa" w:w="5560"/>
+            <w:tcBorders>
+              <w:top w:val="single" w:color="AAAAAA" w:sz="1"/>
+              <w:left w:val="single" w:color="AAAAAA" w:sz="1"/>
+              <w:bottom w:val="single" w:color="AAAAAA" w:sz="1"/>
+              <w:right w:val="single" w:color="AAAAAA" w:sz="1"/>
+            </w:tcBorders>
+            <w:shd w:fill="F2F7FB" w:val="clear"/>
+            <w:tcMar>
+              <w:top w:type="dxa" w:w="80"/>
+              <w:left w:type="dxa" w:w="120"/>
+              <w:bottom w:type="dxa" w:w="80"/>
+              <w:right w:type="dxa" w:w="120"/>
+            </w:tcMar>
+            <w:vAlign w:val="top"/>
+          </w:tcPr>
+          <w:p>
+            <w:r>
+              <w:rPr>
+                <w:rFonts w:ascii="Arial" w:cs="Arial" w:eastAsia="Arial" w:hAnsi="Arial"/>
+                <w:sz w:val="22"/>
+                <w:szCs w:val="22"/>
+              </w:rPr>
+              <w:t xml:space="preserve">The current specification creates calendar events but does not address updating or canceling events when sessions are rescheduled or canceled. This workflow should be defined.</w:t>
+            </w:r>
+          </w:p>
+        </w:tc>
+      </w:tr>
+      <w:tr>
+        <w:tc>
+          <w:tcPr>
+            <w:tcW w:type="dxa" w:w="600"/>
+            <w:tcBorders>
+              <w:top w:val="single" w:color="AAAAAA" w:sz="1"/>
+              <w:left w:val="single" w:color="AAAAAA" w:sz="1"/>
+              <w:bottom w:val="single" w:color="AAAAAA" w:sz="1"/>
+              <w:right w:val="single" w:color="AAAAAA" w:sz="1"/>
+            </w:tcBorders>
+            <w:tcMar>
+              <w:top w:type="dxa" w:w="80"/>
+              <w:left w:type="dxa" w:w="120"/>
+              <w:bottom w:type="dxa" w:w="80"/>
+              <w:right w:type="dxa" w:w="120"/>
+            </w:tcMar>
+            <w:vAlign w:val="top"/>
+          </w:tcPr>
+          <w:p>
+            <w:r>
+              <w:rPr>
+                <w:rFonts w:ascii="Arial" w:cs="Arial" w:eastAsia="Arial" w:hAnsi="Arial"/>
+                <w:sz w:val="22"/>
+                <w:szCs w:val="22"/>
+              </w:rPr>
+              <w:t xml:space="preserve">9</w:t>
+            </w:r>
+          </w:p>
+        </w:tc>
+        <w:tc>
+          <w:tcPr>
+            <w:tcW w:type="dxa" w:w="3200"/>
+            <w:tcBorders>
+              <w:top w:val="single" w:color="AAAAAA" w:sz="1"/>
+              <w:left w:val="single" w:color="AAAAAA" w:sz="1"/>
+              <w:bottom w:val="single" w:color="AAAAAA" w:sz="1"/>
+              <w:right w:val="single" w:color="AAAAAA" w:sz="1"/>
+            </w:tcBorders>
+            <w:tcMar>
+              <w:top w:type="dxa" w:w="80"/>
+              <w:left w:type="dxa" w:w="120"/>
+              <w:bottom w:type="dxa" w:w="80"/>
+              <w:right w:type="dxa" w:w="120"/>
+            </w:tcMar>
+            <w:vAlign w:val="top"/>
+          </w:tcPr>
+          <w:p>
+            <w:r>
+              <w:rPr>
+                <w:rFonts w:ascii="Arial" w:cs="Arial" w:eastAsia="Arial" w:hAnsi="Arial"/>
+                <w:sz w:val="22"/>
+                <w:szCs w:val="22"/>
+              </w:rPr>
+              <w:t xml:space="preserve">Session summary email template</w:t>
+            </w:r>
+          </w:p>
+        </w:tc>
+        <w:tc>
+          <w:tcPr>
+            <w:tcW w:type="dxa" w:w="5560"/>
+            <w:tcBorders>
+              <w:top w:val="single" w:color="AAAAAA" w:sz="1"/>
+              <w:left w:val="single" w:color="AAAAAA" w:sz="1"/>
+              <w:bottom w:val="single" w:color="AAAAAA" w:sz="1"/>
+              <w:right w:val="single" w:color="AAAAAA" w:sz="1"/>
+            </w:tcBorders>
+            <w:tcMar>
+              <w:top w:type="dxa" w:w="80"/>
+              <w:left w:type="dxa" w:w="120"/>
+              <w:bottom w:type="dxa" w:w="80"/>
+              <w:right w:type="dxa" w:w="120"/>
+            </w:tcMar>
+            <w:vAlign w:val="top"/>
+          </w:tcPr>
+          <w:p>
+            <w:r>
+              <w:rPr>
+                <w:rFonts w:ascii="Arial" w:cs="Arial" w:eastAsia="Arial" w:hAnsi="Arial"/>
+                <w:sz w:val="22"/>
+                <w:szCs w:val="22"/>
+              </w:rPr>
+              <w:t xml:space="preserve">The pre-populated email format (subject line, body structure, signature) should be defined and made configurable.</w:t>
+            </w:r>
+          </w:p>
+        </w:tc>
+      </w:tr>
+      <w:tr>
+        <w:tc>
+          <w:tcPr>
+            <w:tcW w:type="dxa" w:w="600"/>
+            <w:tcBorders>
+              <w:top w:val="single" w:color="AAAAAA" w:sz="1"/>
+              <w:left w:val="single" w:color="AAAAAA" w:sz="1"/>
+              <w:bottom w:val="single" w:color="AAAAAA" w:sz="1"/>
+              <w:right w:val="single" w:color="AAAAAA" w:sz="1"/>
+            </w:tcBorders>
+            <w:shd w:fill="F2F7FB" w:val="clear"/>
+            <w:tcMar>
+              <w:top w:type="dxa" w:w="80"/>
+              <w:left w:type="dxa" w:w="120"/>
+              <w:bottom w:type="dxa" w:w="80"/>
+              <w:right w:type="dxa" w:w="120"/>
+            </w:tcMar>
+            <w:vAlign w:val="top"/>
+          </w:tcPr>
+          <w:p>
+            <w:r>
+              <w:rPr>
+                <w:rFonts w:ascii="Arial" w:cs="Arial" w:eastAsia="Arial" w:hAnsi="Arial"/>
+                <w:sz w:val="22"/>
+                <w:szCs w:val="22"/>
+              </w:rPr>
+              <w:t xml:space="preserve">10</w:t>
+            </w:r>
+          </w:p>
+        </w:tc>
+        <w:tc>
+          <w:tcPr>
+            <w:tcW w:type="dxa" w:w="3200"/>
+            <w:tcBorders>
+              <w:top w:val="single" w:color="AAAAAA" w:sz="1"/>
+              <w:left w:val="single" w:color="AAAAAA" w:sz="1"/>
+              <w:bottom w:val="single" w:color="AAAAAA" w:sz="1"/>
+              <w:right w:val="single" w:color="AAAAAA" w:sz="1"/>
+            </w:tcBorders>
+            <w:shd w:fill="F2F7FB" w:val="clear"/>
+            <w:tcMar>
+              <w:top w:type="dxa" w:w="80"/>
+              <w:left w:type="dxa" w:w="120"/>
+              <w:bottom w:type="dxa" w:w="80"/>
+              <w:right w:type="dxa" w:w="120"/>
+            </w:tcMar>
+            <w:vAlign w:val="top"/>
+          </w:tcPr>
+          <w:p>
+            <w:r>
+              <w:rPr>
+                <w:rFonts w:ascii="Arial" w:cs="Arial" w:eastAsia="Arial" w:hAnsi="Arial"/>
+                <w:sz w:val="22"/>
+                <w:szCs w:val="22"/>
+              </w:rPr>
+              <w:t xml:space="preserve">Engagement Summary data source SQL</w:t>
+            </w:r>
+          </w:p>
+        </w:tc>
+        <w:tc>
+          <w:tcPr>
+            <w:tcW w:type="dxa" w:w="5560"/>
+            <w:tcBorders>
+              <w:top w:val="single" w:color="AAAAAA" w:sz="1"/>
+              <w:left w:val="single" w:color="AAAAAA" w:sz="1"/>
+              <w:bottom w:val="single" w:color="AAAAAA" w:sz="1"/>
+              <w:right w:val="single" w:color="AAAAAA" w:sz="1"/>
+            </w:tcBorders>
+            <w:shd w:fill="F2F7FB" w:val="clear"/>
+            <w:tcMar>
+              <w:top w:type="dxa" w:w="80"/>
+              <w:left w:type="dxa" w:w="120"/>
+              <w:bottom w:type="dxa" w:w="80"/>
+              <w:right w:type="dxa" w:w="120"/>
+            </w:tcMar>
+            <w:vAlign w:val="top"/>
+          </w:tcPr>
+          <w:p>
+            <w:r>
+              <w:rPr>
+                <w:rFonts w:ascii="Arial" w:cs="Arial" w:eastAsia="Arial" w:hAnsi="Arial"/>
+                <w:sz w:val="22"/>
+                <w:szCs w:val="22"/>
+              </w:rPr>
+              <w:t xml:space="preserve">The specific SQL query for the CBM Engagement Summary data source needs to be authored once the CRM schema is deployed.</w:t>
             </w:r>
           </w:p>
         </w:tc>
@@ -7293,7 +9998,7 @@
           <w:sz w:val="28"/>
           <w:szCs w:val="28"/>
         </w:rPr>
-        <w:t xml:space="preserve">11. Glossary</w:t>
+        <w:t xml:space="preserve">13. Glossary</w:t>
       </w:r>
     </w:p>
     <w:tbl>
@@ -7760,7 +10465,7 @@
                 <w:sz w:val="22"/>
                 <w:szCs w:val="22"/>
               </w:rPr>
-              <w:t xml:space="preserve">Role-Mapping Table</w:t>
+              <w:t xml:space="preserve">OAuth 2.0</w:t>
             </w:r>
           </w:p>
         </w:tc>
@@ -7788,7 +10493,7 @@
                 <w:sz w:val="22"/>
                 <w:szCs w:val="22"/>
               </w:rPr>
-              <w:t xml:space="preserve">A configuration table that maps CRM security team memberships to application roles (Mentor, Admin, Super Admin).</w:t>
+              <w:t xml:space="preserve">An authorization framework that allows the application to access Google Workspace services (Calendar, Gmail) on behalf of the user without storing their Google password.</w:t>
             </w:r>
           </w:p>
         </w:tc>
@@ -7819,7 +10524,7 @@
                 <w:sz w:val="22"/>
                 <w:szCs w:val="22"/>
               </w:rPr>
-              <w:t xml:space="preserve">Super Admin</w:t>
+              <w:t xml:space="preserve">QuickNote</w:t>
             </w:r>
           </w:p>
         </w:tc>
@@ -7848,7 +10553,7 @@
                 <w:sz w:val="22"/>
                 <w:szCs w:val="22"/>
               </w:rPr>
-              <w:t xml:space="preserve">An application role with full access: all Admin capabilities plus data source management and role-mapping configuration.</w:t>
+              <w:t xml:space="preserve">A short-form text field on the engagement record that is visible in the grid view, allowing mentors to see brief status notes without opening the detail screen.</w:t>
             </w:r>
           </w:p>
         </w:tc>
@@ -7878,6 +10583,183 @@
                 <w:sz w:val="22"/>
                 <w:szCs w:val="22"/>
               </w:rPr>
+              <w:t xml:space="preserve">Role-Mapping Table</w:t>
+            </w:r>
+          </w:p>
+        </w:tc>
+        <w:tc>
+          <w:tcPr>
+            <w:tcW w:type="dxa" w:w="6560"/>
+            <w:tcBorders>
+              <w:top w:val="single" w:color="AAAAAA" w:sz="1"/>
+              <w:left w:val="single" w:color="AAAAAA" w:sz="1"/>
+              <w:bottom w:val="single" w:color="AAAAAA" w:sz="1"/>
+              <w:right w:val="single" w:color="AAAAAA" w:sz="1"/>
+            </w:tcBorders>
+            <w:tcMar>
+              <w:top w:type="dxa" w:w="80"/>
+              <w:left w:type="dxa" w:w="120"/>
+              <w:bottom w:type="dxa" w:w="80"/>
+              <w:right w:type="dxa" w:w="120"/>
+            </w:tcMar>
+            <w:vAlign w:val="top"/>
+          </w:tcPr>
+          <w:p>
+            <w:r>
+              <w:rPr>
+                <w:rFonts w:ascii="Arial" w:cs="Arial" w:eastAsia="Arial" w:hAnsi="Arial"/>
+                <w:sz w:val="22"/>
+                <w:szCs w:val="22"/>
+              </w:rPr>
+              <w:t xml:space="preserve">A configuration table that maps CRM security team memberships to application roles (Mentor, Admin, Super Admin).</w:t>
+            </w:r>
+          </w:p>
+        </w:tc>
+      </w:tr>
+      <w:tr>
+        <w:tc>
+          <w:tcPr>
+            <w:tcW w:type="dxa" w:w="2800"/>
+            <w:tcBorders>
+              <w:top w:val="single" w:color="AAAAAA" w:sz="1"/>
+              <w:left w:val="single" w:color="AAAAAA" w:sz="1"/>
+              <w:bottom w:val="single" w:color="AAAAAA" w:sz="1"/>
+              <w:right w:val="single" w:color="AAAAAA" w:sz="1"/>
+            </w:tcBorders>
+            <w:shd w:fill="F2F7FB" w:val="clear"/>
+            <w:tcMar>
+              <w:top w:type="dxa" w:w="80"/>
+              <w:left w:type="dxa" w:w="120"/>
+              <w:bottom w:type="dxa" w:w="80"/>
+              <w:right w:type="dxa" w:w="120"/>
+            </w:tcMar>
+            <w:vAlign w:val="top"/>
+          </w:tcPr>
+          <w:p>
+            <w:r>
+              <w:rPr>
+                <w:rFonts w:ascii="Arial" w:cs="Arial" w:eastAsia="Arial" w:hAnsi="Arial"/>
+                <w:sz w:val="22"/>
+                <w:szCs w:val="22"/>
+              </w:rPr>
+              <w:t xml:space="preserve">Session Form</w:t>
+            </w:r>
+          </w:p>
+        </w:tc>
+        <w:tc>
+          <w:tcPr>
+            <w:tcW w:type="dxa" w:w="6560"/>
+            <w:tcBorders>
+              <w:top w:val="single" w:color="AAAAAA" w:sz="1"/>
+              <w:left w:val="single" w:color="AAAAAA" w:sz="1"/>
+              <w:bottom w:val="single" w:color="AAAAAA" w:sz="1"/>
+              <w:right w:val="single" w:color="AAAAAA" w:sz="1"/>
+            </w:tcBorders>
+            <w:shd w:fill="F2F7FB" w:val="clear"/>
+            <w:tcMar>
+              <w:top w:type="dxa" w:w="80"/>
+              <w:left w:type="dxa" w:w="120"/>
+              <w:bottom w:type="dxa" w:w="80"/>
+              <w:right w:type="dxa" w:w="120"/>
+            </w:tcMar>
+            <w:vAlign w:val="top"/>
+          </w:tcPr>
+          <w:p>
+            <w:r>
+              <w:rPr>
+                <w:rFonts w:ascii="Arial" w:cs="Arial" w:eastAsia="Arial" w:hAnsi="Arial"/>
+                <w:sz w:val="22"/>
+                <w:szCs w:val="22"/>
+              </w:rPr>
+              <w:t xml:space="preserve">The data entry interface for capturing session details including date, duration, attendees, notes, topics, and next session scheduling.</w:t>
+            </w:r>
+          </w:p>
+        </w:tc>
+      </w:tr>
+      <w:tr>
+        <w:tc>
+          <w:tcPr>
+            <w:tcW w:type="dxa" w:w="2800"/>
+            <w:tcBorders>
+              <w:top w:val="single" w:color="AAAAAA" w:sz="1"/>
+              <w:left w:val="single" w:color="AAAAAA" w:sz="1"/>
+              <w:bottom w:val="single" w:color="AAAAAA" w:sz="1"/>
+              <w:right w:val="single" w:color="AAAAAA" w:sz="1"/>
+            </w:tcBorders>
+            <w:tcMar>
+              <w:top w:type="dxa" w:w="80"/>
+              <w:left w:type="dxa" w:w="120"/>
+              <w:bottom w:type="dxa" w:w="80"/>
+              <w:right w:type="dxa" w:w="120"/>
+            </w:tcMar>
+            <w:vAlign w:val="top"/>
+          </w:tcPr>
+          <w:p>
+            <w:r>
+              <w:rPr>
+                <w:rFonts w:ascii="Arial" w:cs="Arial" w:eastAsia="Arial" w:hAnsi="Arial"/>
+                <w:sz w:val="22"/>
+                <w:szCs w:val="22"/>
+              </w:rPr>
+              <w:t xml:space="preserve">Super Admin</w:t>
+            </w:r>
+          </w:p>
+        </w:tc>
+        <w:tc>
+          <w:tcPr>
+            <w:tcW w:type="dxa" w:w="6560"/>
+            <w:tcBorders>
+              <w:top w:val="single" w:color="AAAAAA" w:sz="1"/>
+              <w:left w:val="single" w:color="AAAAAA" w:sz="1"/>
+              <w:bottom w:val="single" w:color="AAAAAA" w:sz="1"/>
+              <w:right w:val="single" w:color="AAAAAA" w:sz="1"/>
+            </w:tcBorders>
+            <w:tcMar>
+              <w:top w:type="dxa" w:w="80"/>
+              <w:left w:type="dxa" w:w="120"/>
+              <w:bottom w:type="dxa" w:w="80"/>
+              <w:right w:type="dxa" w:w="120"/>
+            </w:tcMar>
+            <w:vAlign w:val="top"/>
+          </w:tcPr>
+          <w:p>
+            <w:r>
+              <w:rPr>
+                <w:rFonts w:ascii="Arial" w:cs="Arial" w:eastAsia="Arial" w:hAnsi="Arial"/>
+                <w:sz w:val="22"/>
+                <w:szCs w:val="22"/>
+              </w:rPr>
+              <w:t xml:space="preserve">An application role with full access: all Admin capabilities plus data source management and role-mapping configuration.</w:t>
+            </w:r>
+          </w:p>
+        </w:tc>
+      </w:tr>
+      <w:tr>
+        <w:tc>
+          <w:tcPr>
+            <w:tcW w:type="dxa" w:w="2800"/>
+            <w:tcBorders>
+              <w:top w:val="single" w:color="AAAAAA" w:sz="1"/>
+              <w:left w:val="single" w:color="AAAAAA" w:sz="1"/>
+              <w:bottom w:val="single" w:color="AAAAAA" w:sz="1"/>
+              <w:right w:val="single" w:color="AAAAAA" w:sz="1"/>
+            </w:tcBorders>
+            <w:shd w:fill="F2F7FB" w:val="clear"/>
+            <w:tcMar>
+              <w:top w:type="dxa" w:w="80"/>
+              <w:left w:type="dxa" w:w="120"/>
+              <w:bottom w:type="dxa" w:w="80"/>
+              <w:right w:type="dxa" w:w="120"/>
+            </w:tcMar>
+            <w:vAlign w:val="top"/>
+          </w:tcPr>
+          <w:p>
+            <w:r>
+              <w:rPr>
+                <w:rFonts w:ascii="Arial" w:cs="Arial" w:eastAsia="Arial" w:hAnsi="Arial"/>
+                <w:sz w:val="22"/>
+                <w:szCs w:val="22"/>
+              </w:rPr>
               <w:t xml:space="preserve">View</w:t>
             </w:r>
           </w:p>
@@ -7891,6 +10773,7 @@
               <w:bottom w:val="single" w:color="AAAAAA" w:sz="1"/>
               <w:right w:val="single" w:color="AAAAAA" w:sz="1"/>
             </w:tcBorders>
+            <w:shd w:fill="F2F7FB" w:val="clear"/>
             <w:tcMar>
               <w:top w:type="dxa" w:w="80"/>
               <w:left w:type="dxa" w:w="120"/>

</xml_diff>

<commit_message>
Update L2 PRD v1.2: add technology stack (Python/FastAPI, React/TypeScript), resolve Open Issue #1
</commit_message>
<xml_diff>
--- a/PRDs/product/CustomApp/mentor_engagement_CUSTOM_app_prd_l2.docx
+++ b/PRDs/product/CustomApp/mentor_engagement_CUSTOM_app_prd_l2.docx
@@ -192,7 +192,7 @@
                 <w:sz w:val="22"/>
                 <w:szCs w:val="22"/>
               </w:rPr>
-              <w:t xml:space="preserve">1.1</w:t>
+              <w:t xml:space="preserve">1.2</w:t>
             </w:r>
           </w:p>
         </w:tc>
@@ -370,7 +370,7 @@
                 <w:sz w:val="22"/>
                 <w:szCs w:val="22"/>
               </w:rPr>
-              <w:t xml:space="preserve">04-02-26 22:00</w:t>
+              <w:t xml:space="preserve">04-02-26 23:00</w:t>
             </w:r>
           </w:p>
         </w:tc>
@@ -642,6 +642,149 @@
           <w:szCs w:val="22"/>
         </w:rPr>
         <w:t xml:space="preserve">The expected user base is under 100 concurrent users.</w:t>
+      </w:r>
+    </w:p>
+    <w:p>
+      <w:pPr>
+        <w:pStyle w:val="Heading2"/>
+        <w:spacing w:after="160" w:before="280"/>
+      </w:pPr>
+      <w:r>
+        <w:rPr>
+          <w:rFonts w:ascii="Arial" w:cs="Arial" w:eastAsia="Arial" w:hAnsi="Arial"/>
+          <w:b/>
+          <w:bCs/>
+          <w:color w:val="1F3864"/>
+          <w:sz w:val="24"/>
+          <w:szCs w:val="24"/>
+        </w:rPr>
+        <w:t xml:space="preserve">1.4 Technology Stack</w:t>
+      </w:r>
+    </w:p>
+    <w:p>
+      <w:pPr>
+        <w:spacing w:after="160"/>
+      </w:pPr>
+      <w:r>
+        <w:rPr>
+          <w:rFonts w:ascii="Arial" w:cs="Arial" w:eastAsia="Arial" w:hAnsi="Arial"/>
+          <w:color w:val="000000"/>
+          <w:sz w:val="22"/>
+          <w:szCs w:val="22"/>
+        </w:rPr>
+        <w:t xml:space="preserve">The following technology choices have been made for the initial implementation:</w:t>
+      </w:r>
+    </w:p>
+    <w:p>
+      <w:pPr>
+        <w:pStyle w:val="ListParagraph"/>
+        <w:numPr>
+          <w:ilvl w:val="0"/>
+          <w:numId w:val="2"/>
+        </w:numPr>
+        <w:spacing w:after="80"/>
+      </w:pPr>
+      <w:r>
+        <w:rPr>
+          <w:rFonts w:ascii="Arial" w:cs="Arial" w:eastAsia="Arial" w:hAnsi="Arial"/>
+          <w:b/>
+          <w:bCs/>
+          <w:sz w:val="22"/>
+          <w:szCs w:val="22"/>
+        </w:rPr>
+        <w:t xml:space="preserve">Backend: </w:t>
+      </w:r>
+      <w:r>
+        <w:rPr>
+          <w:rFonts w:ascii="Arial" w:cs="Arial" w:eastAsia="Arial" w:hAnsi="Arial"/>
+          <w:sz w:val="22"/>
+          <w:szCs w:val="22"/>
+        </w:rPr>
+        <w:t xml:space="preserve">Python with FastAPI. FastAPI provides an async-native REST API framework with built-in request validation and automatic API documentation. Python aligns with the existing CRM Builder toolchain.</w:t>
+      </w:r>
+    </w:p>
+    <w:p>
+      <w:pPr>
+        <w:pStyle w:val="ListParagraph"/>
+        <w:numPr>
+          <w:ilvl w:val="0"/>
+          <w:numId w:val="2"/>
+        </w:numPr>
+        <w:spacing w:after="80"/>
+      </w:pPr>
+      <w:r>
+        <w:rPr>
+          <w:rFonts w:ascii="Arial" w:cs="Arial" w:eastAsia="Arial" w:hAnsi="Arial"/>
+          <w:b/>
+          <w:bCs/>
+          <w:sz w:val="22"/>
+          <w:szCs w:val="22"/>
+        </w:rPr>
+        <w:t xml:space="preserve">Frontend: </w:t>
+      </w:r>
+      <w:r>
+        <w:rPr>
+          <w:rFonts w:ascii="Arial" w:cs="Arial" w:eastAsia="Arial" w:hAnsi="Arial"/>
+          <w:sz w:val="22"/>
+          <w:szCs w:val="22"/>
+        </w:rPr>
+        <w:t xml:space="preserve">React with TypeScript. React provides the strongest ecosystem for complex data grid components (hierarchical expand/collapse, column filtering, multi-column sorting). TypeScript adds type safety appropriate for the application’s complexity.</w:t>
+      </w:r>
+    </w:p>
+    <w:p>
+      <w:pPr>
+        <w:pStyle w:val="ListParagraph"/>
+        <w:numPr>
+          <w:ilvl w:val="0"/>
+          <w:numId w:val="2"/>
+        </w:numPr>
+        <w:spacing w:after="80"/>
+      </w:pPr>
+      <w:r>
+        <w:rPr>
+          <w:rFonts w:ascii="Arial" w:cs="Arial" w:eastAsia="Arial" w:hAnsi="Arial"/>
+          <w:b/>
+          <w:bCs/>
+          <w:sz w:val="22"/>
+          <w:szCs w:val="22"/>
+        </w:rPr>
+        <w:t xml:space="preserve">Database: </w:t>
+      </w:r>
+      <w:r>
+        <w:rPr>
+          <w:rFonts w:ascii="Arial" w:cs="Arial" w:eastAsia="Arial" w:hAnsi="Arial"/>
+          <w:sz w:val="22"/>
+          <w:szCs w:val="22"/>
+        </w:rPr>
+        <w:t xml:space="preserve">Shared CRM database with dedicated table prefix for application configuration data.</w:t>
+      </w:r>
+    </w:p>
+    <w:p>
+      <w:pPr>
+        <w:pStyle w:val="ListParagraph"/>
+        <w:numPr>
+          <w:ilvl w:val="0"/>
+          <w:numId w:val="2"/>
+        </w:numPr>
+        <w:spacing w:after="80"/>
+      </w:pPr>
+      <w:r>
+        <w:rPr>
+          <w:rFonts w:ascii="Arial" w:cs="Arial" w:eastAsia="Arial" w:hAnsi="Arial"/>
+          <w:b/>
+          <w:bCs/>
+          <w:sz w:val="22"/>
+          <w:szCs w:val="22"/>
+        </w:rPr>
+        <w:t xml:space="preserve">Deployment: </w:t>
+      </w:r>
+      <w:r>
+        <w:rPr>
+          <w:rFonts w:ascii="Arial" w:cs="Arial" w:eastAsia="Arial" w:hAnsi="Arial"/>
+          <w:sz w:val="22"/>
+          <w:szCs w:val="22"/>
+        </w:rPr>
+        <w:t xml:space="preserve">Docker container alongside the CRM on the same server.</w:t>
       </w:r>
     </w:p>
     <w:p>
@@ -9151,7 +9294,7 @@
                 <w:sz w:val="22"/>
                 <w:szCs w:val="22"/>
               </w:rPr>
-              <w:t xml:space="preserve">Technology stack selection</w:t>
+              <w:t xml:space="preserve">CRM security team to role mapping mechanism</w:t>
             </w:r>
           </w:p>
         </w:tc>
@@ -9179,7 +9322,7 @@
                 <w:sz w:val="22"/>
                 <w:szCs w:val="22"/>
               </w:rPr>
-              <w:t xml:space="preserve">Frontend framework (React, Vue, etc.) and backend framework/language have not been selected. This decision should be made before proof-of-concept development begins.</w:t>
+              <w:t xml:space="preserve">The application reads CRM security team memberships to determine roles, but the specific configuration interface (admin screen, config file, or database table with direct edit) needs definition.</w:t>
             </w:r>
           </w:p>
         </w:tc>
@@ -9239,7 +9382,7 @@
                 <w:sz w:val="22"/>
                 <w:szCs w:val="22"/>
               </w:rPr>
-              <w:t xml:space="preserve">CRM security team to role mapping mechanism</w:t>
+              <w:t xml:space="preserve">Mentor-client relationship identification</w:t>
             </w:r>
           </w:p>
         </w:tc>
@@ -9268,7 +9411,7 @@
                 <w:sz w:val="22"/>
                 <w:szCs w:val="22"/>
               </w:rPr>
-              <w:t xml:space="preserve">The application reads CRM security team memberships to determine roles, but the specific configuration interface (admin screen, config file, or database table with direct edit) needs definition.</w:t>
+              <w:t xml:space="preserve">The specific CRM field or relationship that identifies which clients belong to which mentor must be defined to implement the role-based data filtering parameter.</w:t>
             </w:r>
           </w:p>
         </w:tc>
@@ -9326,7 +9469,7 @@
                 <w:sz w:val="22"/>
                 <w:szCs w:val="22"/>
               </w:rPr>
-              <w:t xml:space="preserve">Mentor-client relationship identification</w:t>
+              <w:t xml:space="preserve">Detail screen design and build process</w:t>
             </w:r>
           </w:p>
         </w:tc>
@@ -9354,7 +9497,7 @@
                 <w:sz w:val="22"/>
                 <w:szCs w:val="22"/>
               </w:rPr>
-              <w:t xml:space="preserve">The specific CRM field or relationship that identifies which clients belong to which mentor must be defined to implement the role-based data filtering parameter.</w:t>
+              <w:t xml:space="preserve">The AI-assisted design workflow for detail screen components needs to be formalized, including tooling, review criteria, and deployment process.</w:t>
             </w:r>
           </w:p>
         </w:tc>
@@ -9414,7 +9557,7 @@
                 <w:sz w:val="22"/>
                 <w:szCs w:val="22"/>
               </w:rPr>
-              <w:t xml:space="preserve">Detail screen design and build process</w:t>
+              <w:t xml:space="preserve">Constrained query builder</w:t>
             </w:r>
           </w:p>
         </w:tc>
@@ -9443,7 +9586,7 @@
                 <w:sz w:val="22"/>
                 <w:szCs w:val="22"/>
               </w:rPr>
-              <w:t xml:space="preserve">The AI-assisted design workflow for detail screen components needs to be formalized, including tooling, review criteria, and deployment process.</w:t>
+              <w:t xml:space="preserve">Identified as a future-release replacement for raw SQL in data source creation. Requirements for the query builder should be captured as a separate specification when prioritized.</w:t>
             </w:r>
           </w:p>
         </w:tc>
@@ -9501,7 +9644,7 @@
                 <w:sz w:val="22"/>
                 <w:szCs w:val="22"/>
               </w:rPr>
-              <w:t xml:space="preserve">Constrained query builder</w:t>
+              <w:t xml:space="preserve">CRM schema change management</w:t>
             </w:r>
           </w:p>
         </w:tc>
@@ -9529,7 +9672,7 @@
                 <w:sz w:val="22"/>
                 <w:szCs w:val="22"/>
               </w:rPr>
-              <w:t xml:space="preserve">Identified as a future-release replacement for raw SQL in data source creation. Requirements for the query builder should be captured as a separate specification when prioritized.</w:t>
+              <w:t xml:space="preserve">Data source queries reference CRM database tables directly. A process for validating data sources after CRM upgrades needs to be defined to prevent broken views.</w:t>
             </w:r>
           </w:p>
         </w:tc>
@@ -9589,7 +9732,7 @@
                 <w:sz w:val="22"/>
                 <w:szCs w:val="22"/>
               </w:rPr>
-              <w:t xml:space="preserve">CRM schema change management</w:t>
+              <w:t xml:space="preserve">Google Workspace OAuth configuration</w:t>
             </w:r>
           </w:p>
         </w:tc>
@@ -9618,7 +9761,7 @@
                 <w:sz w:val="22"/>
                 <w:szCs w:val="22"/>
               </w:rPr>
-              <w:t xml:space="preserve">Data source queries reference CRM database tables directly. A process for validating data sources after CRM upgrades needs to be defined to prevent broken views.</w:t>
+              <w:t xml:space="preserve">The Google Cloud project, OAuth client credentials, authorized redirect URIs, and scope approvals need to be configured for the production environment.</w:t>
             </w:r>
           </w:p>
         </w:tc>
@@ -9676,7 +9819,7 @@
                 <w:sz w:val="22"/>
                 <w:szCs w:val="22"/>
               </w:rPr>
-              <w:t xml:space="preserve">Google Workspace OAuth configuration</w:t>
+              <w:t xml:space="preserve">Calendar event update and cancellation</w:t>
             </w:r>
           </w:p>
         </w:tc>
@@ -9704,7 +9847,7 @@
                 <w:sz w:val="22"/>
                 <w:szCs w:val="22"/>
               </w:rPr>
-              <w:t xml:space="preserve">The Google Cloud project, OAuth client credentials, authorized redirect URIs, and scope approvals need to be configured for the production environment.</w:t>
+              <w:t xml:space="preserve">The current specification creates calendar events but does not address updating or canceling events when sessions are rescheduled or canceled. This workflow should be defined.</w:t>
             </w:r>
           </w:p>
         </w:tc>
@@ -9764,7 +9907,7 @@
                 <w:sz w:val="22"/>
                 <w:szCs w:val="22"/>
               </w:rPr>
-              <w:t xml:space="preserve">Calendar event update and cancellation</w:t>
+              <w:t xml:space="preserve">Session summary email template</w:t>
             </w:r>
           </w:p>
         </w:tc>
@@ -9793,7 +9936,7 @@
                 <w:sz w:val="22"/>
                 <w:szCs w:val="22"/>
               </w:rPr>
-              <w:t xml:space="preserve">The current specification creates calendar events but does not address updating or canceling events when sessions are rescheduled or canceled. This workflow should be defined.</w:t>
+              <w:t xml:space="preserve">The pre-populated email format (subject line, body structure, signature) should be defined and made configurable.</w:t>
             </w:r>
           </w:p>
         </w:tc>
@@ -9851,7 +9994,7 @@
                 <w:sz w:val="22"/>
                 <w:szCs w:val="22"/>
               </w:rPr>
-              <w:t xml:space="preserve">Session summary email template</w:t>
+              <w:t xml:space="preserve">Engagement Summary data source SQL</w:t>
             </w:r>
           </w:p>
         </w:tc>
@@ -9864,95 +10007,6 @@
               <w:bottom w:val="single" w:color="AAAAAA" w:sz="1"/>
               <w:right w:val="single" w:color="AAAAAA" w:sz="1"/>
             </w:tcBorders>
-            <w:tcMar>
-              <w:top w:type="dxa" w:w="80"/>
-              <w:left w:type="dxa" w:w="120"/>
-              <w:bottom w:type="dxa" w:w="80"/>
-              <w:right w:type="dxa" w:w="120"/>
-            </w:tcMar>
-            <w:vAlign w:val="top"/>
-          </w:tcPr>
-          <w:p>
-            <w:r>
-              <w:rPr>
-                <w:rFonts w:ascii="Arial" w:cs="Arial" w:eastAsia="Arial" w:hAnsi="Arial"/>
-                <w:sz w:val="22"/>
-                <w:szCs w:val="22"/>
-              </w:rPr>
-              <w:t xml:space="preserve">The pre-populated email format (subject line, body structure, signature) should be defined and made configurable.</w:t>
-            </w:r>
-          </w:p>
-        </w:tc>
-      </w:tr>
-      <w:tr>
-        <w:tc>
-          <w:tcPr>
-            <w:tcW w:type="dxa" w:w="600"/>
-            <w:tcBorders>
-              <w:top w:val="single" w:color="AAAAAA" w:sz="1"/>
-              <w:left w:val="single" w:color="AAAAAA" w:sz="1"/>
-              <w:bottom w:val="single" w:color="AAAAAA" w:sz="1"/>
-              <w:right w:val="single" w:color="AAAAAA" w:sz="1"/>
-            </w:tcBorders>
-            <w:shd w:fill="F2F7FB" w:val="clear"/>
-            <w:tcMar>
-              <w:top w:type="dxa" w:w="80"/>
-              <w:left w:type="dxa" w:w="120"/>
-              <w:bottom w:type="dxa" w:w="80"/>
-              <w:right w:type="dxa" w:w="120"/>
-            </w:tcMar>
-            <w:vAlign w:val="top"/>
-          </w:tcPr>
-          <w:p>
-            <w:r>
-              <w:rPr>
-                <w:rFonts w:ascii="Arial" w:cs="Arial" w:eastAsia="Arial" w:hAnsi="Arial"/>
-                <w:sz w:val="22"/>
-                <w:szCs w:val="22"/>
-              </w:rPr>
-              <w:t xml:space="preserve">10</w:t>
-            </w:r>
-          </w:p>
-        </w:tc>
-        <w:tc>
-          <w:tcPr>
-            <w:tcW w:type="dxa" w:w="3200"/>
-            <w:tcBorders>
-              <w:top w:val="single" w:color="AAAAAA" w:sz="1"/>
-              <w:left w:val="single" w:color="AAAAAA" w:sz="1"/>
-              <w:bottom w:val="single" w:color="AAAAAA" w:sz="1"/>
-              <w:right w:val="single" w:color="AAAAAA" w:sz="1"/>
-            </w:tcBorders>
-            <w:shd w:fill="F2F7FB" w:val="clear"/>
-            <w:tcMar>
-              <w:top w:type="dxa" w:w="80"/>
-              <w:left w:type="dxa" w:w="120"/>
-              <w:bottom w:type="dxa" w:w="80"/>
-              <w:right w:type="dxa" w:w="120"/>
-            </w:tcMar>
-            <w:vAlign w:val="top"/>
-          </w:tcPr>
-          <w:p>
-            <w:r>
-              <w:rPr>
-                <w:rFonts w:ascii="Arial" w:cs="Arial" w:eastAsia="Arial" w:hAnsi="Arial"/>
-                <w:sz w:val="22"/>
-                <w:szCs w:val="22"/>
-              </w:rPr>
-              <w:t xml:space="preserve">Engagement Summary data source SQL</w:t>
-            </w:r>
-          </w:p>
-        </w:tc>
-        <w:tc>
-          <w:tcPr>
-            <w:tcW w:type="dxa" w:w="5560"/>
-            <w:tcBorders>
-              <w:top w:val="single" w:color="AAAAAA" w:sz="1"/>
-              <w:left w:val="single" w:color="AAAAAA" w:sz="1"/>
-              <w:bottom w:val="single" w:color="AAAAAA" w:sz="1"/>
-              <w:right w:val="single" w:color="AAAAAA" w:sz="1"/>
-            </w:tcBorders>
-            <w:shd w:fill="F2F7FB" w:val="clear"/>
             <w:tcMar>
               <w:top w:type="dxa" w:w="80"/>
               <w:left w:type="dxa" w:w="120"/>

</xml_diff>

<commit_message>
Update L2 PRD v1.3: resolve 6 open issues (role mapping, data filtering, detail screen design, health check, calendar lifecycle, email template)
</commit_message>
<xml_diff>
--- a/PRDs/product/CustomApp/mentor_engagement_CUSTOM_app_prd_l2.docx
+++ b/PRDs/product/CustomApp/mentor_engagement_CUSTOM_app_prd_l2.docx
@@ -192,7 +192,7 @@
                 <w:sz w:val="22"/>
                 <w:szCs w:val="22"/>
               </w:rPr>
-              <w:t xml:space="preserve">1.2</w:t>
+              <w:t xml:space="preserve">1.3</w:t>
             </w:r>
           </w:p>
         </w:tc>
@@ -370,7 +370,7 @@
                 <w:sz w:val="22"/>
                 <w:szCs w:val="22"/>
               </w:rPr>
-              <w:t xml:space="preserve">04-02-26 23:00</w:t>
+              <w:t xml:space="preserve">04-02-26 23:30</w:t>
             </w:r>
           </w:p>
         </w:tc>
@@ -837,7 +837,7 @@
           <w:sz w:val="22"/>
           <w:szCs w:val="22"/>
         </w:rPr>
-        <w:t xml:space="preserve">The application defines three roles arranged in a hierarchical permission model. Each higher role inherits all capabilities of the roles below it. Role assignment is determined by the user’s CRM security team membership, mapped through a configurable role-mapping table maintained by the Super Admin.</w:t>
+        <w:t xml:space="preserve">The application defines three roles arranged in a hierarchical permission model. Each higher role inherits all capabilities of the roles below it. Role assignment is determined by the user’s role in the CRM, which maps directly to an application role with no additional configuration required.</w:t>
       </w:r>
     </w:p>
     <w:p>
@@ -1231,7 +1231,7 @@
                 <w:sz w:val="22"/>
                 <w:szCs w:val="22"/>
               </w:rPr>
-              <w:t xml:space="preserve">All Admin capabilities plus: create, edit, and deactivate data sources; manage role-mapping configuration</w:t>
+              <w:t xml:space="preserve">All Admin capabilities plus: create, edit, and deactivate data sources; manage email templates; configure data source health checks</w:t>
             </w:r>
           </w:p>
         </w:tc>
@@ -1270,7 +1270,61 @@
           <w:sz w:val="22"/>
           <w:szCs w:val="22"/>
         </w:rPr>
-        <w:t xml:space="preserve">At login, the backend reads the authenticated user’s CRM security team memberships and maps them to an application role using a configurable mapping table. If a user belongs to multiple CRM security teams that map to different application roles, the highest-privilege role applies. The mapping table is stored in the application’s dedicated database tables and is editable only by Super Admins.</w:t>
+        <w:t xml:space="preserve">At login, the backend reads the authenticated user’s role from the CRM and maps it directly to the corresponding application role. No separate mapping table is required. The mapping is:</w:t>
+      </w:r>
+    </w:p>
+    <w:p>
+      <w:pPr>
+        <w:pStyle w:val="ListParagraph"/>
+        <w:numPr>
+          <w:ilvl w:val="0"/>
+          <w:numId w:val="2"/>
+        </w:numPr>
+        <w:spacing w:after="80"/>
+      </w:pPr>
+      <w:r>
+        <w:rPr>
+          <w:rFonts w:ascii="Arial" w:cs="Arial" w:eastAsia="Arial" w:hAnsi="Arial"/>
+          <w:sz w:val="22"/>
+          <w:szCs w:val="22"/>
+        </w:rPr>
+        <w:t xml:space="preserve">CRM Mentor Admin → Application Mentor</w:t>
+      </w:r>
+    </w:p>
+    <w:p>
+      <w:pPr>
+        <w:pStyle w:val="ListParagraph"/>
+        <w:numPr>
+          <w:ilvl w:val="0"/>
+          <w:numId w:val="2"/>
+        </w:numPr>
+        <w:spacing w:after="80"/>
+      </w:pPr>
+      <w:r>
+        <w:rPr>
+          <w:rFonts w:ascii="Arial" w:cs="Arial" w:eastAsia="Arial" w:hAnsi="Arial"/>
+          <w:sz w:val="22"/>
+          <w:szCs w:val="22"/>
+        </w:rPr>
+        <w:t xml:space="preserve">CRM Client Admin → Application Admin</w:t>
+      </w:r>
+    </w:p>
+    <w:p>
+      <w:pPr>
+        <w:pStyle w:val="ListParagraph"/>
+        <w:numPr>
+          <w:ilvl w:val="0"/>
+          <w:numId w:val="2"/>
+        </w:numPr>
+        <w:spacing w:after="80"/>
+      </w:pPr>
+      <w:r>
+        <w:rPr>
+          <w:rFonts w:ascii="Arial" w:cs="Arial" w:eastAsia="Arial" w:hAnsi="Arial"/>
+          <w:sz w:val="22"/>
+          <w:szCs w:val="22"/>
+        </w:rPr>
+        <w:t xml:space="preserve">CRM System Admin → Application Super Admin</w:t>
       </w:r>
     </w:p>
     <w:p>
@@ -1301,7 +1355,7 @@
           <w:sz w:val="22"/>
           <w:szCs w:val="22"/>
         </w:rPr>
-        <w:t xml:space="preserve">Data visibility is enforced at the query level, not the application layer. When the backend executes a data source query, it injects a parameter representing the current user’s identity. For Mentors, the query filters results to only those records where the mentor relationship matches the current user. For Admins and Super Admins, no mentor filter is applied, returning all records.</w:t>
+        <w:t xml:space="preserve">Data visibility is enforced at the query level, not the application layer. When the backend executes a data source query, it injects a parameter representing the current user’s identity. For Mentors, the query filters results to only those engagement records where the assigned mentor field matches the current user. For Admins and Super Admins, no mentor filter is applied, returning all records.</w:t>
       </w:r>
     </w:p>
     <w:p>
@@ -3815,7 +3869,7 @@
           <w:sz w:val="22"/>
           <w:szCs w:val="22"/>
         </w:rPr>
-        <w:t xml:space="preserve">An AI-assisted process generates an initial detail screen component based on the data source definition.</w:t>
+        <w:t xml:space="preserve">An interactive React prototype is designed and iterated in Claude.ai based on the data source definition. The prototype serves as the visual specification, allowing stakeholders to see and interact with the layout before development begins.</w:t>
       </w:r>
     </w:p>
     <w:p>
@@ -3833,7 +3887,25 @@
           <w:sz w:val="22"/>
           <w:szCs w:val="22"/>
         </w:rPr>
-        <w:t xml:space="preserve">A developer reviews and enhances the generated component for optimal usability and efficiency.</w:t>
+        <w:t xml:space="preserve">Claude Code implements the approved prototype in the application codebase with real data connections.</w:t>
+      </w:r>
+    </w:p>
+    <w:p>
+      <w:pPr>
+        <w:pStyle w:val="ListParagraph"/>
+        <w:numPr>
+          <w:ilvl w:val="0"/>
+          <w:numId w:val="3"/>
+        </w:numPr>
+        <w:spacing w:after="80"/>
+      </w:pPr>
+      <w:r>
+        <w:rPr>
+          <w:rFonts w:ascii="Arial" w:cs="Arial" w:eastAsia="Arial" w:hAnsi="Arial"/>
+          <w:sz w:val="22"/>
+          <w:szCs w:val="22"/>
+        </w:rPr>
+        <w:t xml:space="preserve">A developer reviews and enhances the implemented component for optimal usability and efficiency.</w:t>
       </w:r>
     </w:p>
     <w:p>
@@ -7149,6 +7221,181 @@
                 <w:sz w:val="22"/>
                 <w:szCs w:val="22"/>
               </w:rPr>
+              <w:t xml:space="preserve">PUT</w:t>
+            </w:r>
+          </w:p>
+        </w:tc>
+        <w:tc>
+          <w:tcPr>
+            <w:tcW w:type="dxa" w:w="3200"/>
+            <w:tcBorders>
+              <w:top w:val="single" w:color="AAAAAA" w:sz="1"/>
+              <w:left w:val="single" w:color="AAAAAA" w:sz="1"/>
+              <w:bottom w:val="single" w:color="AAAAAA" w:sz="1"/>
+              <w:right w:val="single" w:color="AAAAAA" w:sz="1"/>
+            </w:tcBorders>
+            <w:shd w:fill="F2F7FB" w:val="clear"/>
+            <w:tcMar>
+              <w:top w:type="dxa" w:w="80"/>
+              <w:left w:type="dxa" w:w="120"/>
+              <w:bottom w:type="dxa" w:w="80"/>
+              <w:right w:type="dxa" w:w="120"/>
+            </w:tcMar>
+            <w:vAlign w:val="top"/>
+          </w:tcPr>
+          <w:p>
+            <w:r>
+              <w:rPr>
+                <w:rFonts w:ascii="Arial" w:cs="Arial" w:eastAsia="Arial" w:hAnsi="Arial"/>
+                <w:sz w:val="22"/>
+                <w:szCs w:val="22"/>
+              </w:rPr>
+              <w:t xml:space="preserve">/calendar/events/:eventId</w:t>
+            </w:r>
+          </w:p>
+        </w:tc>
+        <w:tc>
+          <w:tcPr>
+            <w:tcW w:type="dxa" w:w="4360"/>
+            <w:tcBorders>
+              <w:top w:val="single" w:color="AAAAAA" w:sz="1"/>
+              <w:left w:val="single" w:color="AAAAAA" w:sz="1"/>
+              <w:bottom w:val="single" w:color="AAAAAA" w:sz="1"/>
+              <w:right w:val="single" w:color="AAAAAA" w:sz="1"/>
+            </w:tcBorders>
+            <w:shd w:fill="F2F7FB" w:val="clear"/>
+            <w:tcMar>
+              <w:top w:type="dxa" w:w="80"/>
+              <w:left w:type="dxa" w:w="120"/>
+              <w:bottom w:type="dxa" w:w="80"/>
+              <w:right w:type="dxa" w:w="120"/>
+            </w:tcMar>
+            <w:vAlign w:val="top"/>
+          </w:tcPr>
+          <w:p>
+            <w:r>
+              <w:rPr>
+                <w:rFonts w:ascii="Arial" w:cs="Arial" w:eastAsia="Arial" w:hAnsi="Arial"/>
+                <w:sz w:val="22"/>
+                <w:szCs w:val="22"/>
+              </w:rPr>
+              <w:t xml:space="preserve">Update an existing Google Calendar event (for example, when a session is rescheduled). Google sends update notifications to attendees.</w:t>
+            </w:r>
+          </w:p>
+        </w:tc>
+      </w:tr>
+      <w:tr>
+        <w:tc>
+          <w:tcPr>
+            <w:tcW w:type="dxa" w:w="1800"/>
+            <w:tcBorders>
+              <w:top w:val="single" w:color="AAAAAA" w:sz="1"/>
+              <w:left w:val="single" w:color="AAAAAA" w:sz="1"/>
+              <w:bottom w:val="single" w:color="AAAAAA" w:sz="1"/>
+              <w:right w:val="single" w:color="AAAAAA" w:sz="1"/>
+            </w:tcBorders>
+            <w:tcMar>
+              <w:top w:type="dxa" w:w="80"/>
+              <w:left w:type="dxa" w:w="120"/>
+              <w:bottom w:type="dxa" w:w="80"/>
+              <w:right w:type="dxa" w:w="120"/>
+            </w:tcMar>
+            <w:vAlign w:val="top"/>
+          </w:tcPr>
+          <w:p>
+            <w:r>
+              <w:rPr>
+                <w:rFonts w:ascii="Arial" w:cs="Arial" w:eastAsia="Arial" w:hAnsi="Arial"/>
+                <w:sz w:val="22"/>
+                <w:szCs w:val="22"/>
+              </w:rPr>
+              <w:t xml:space="preserve">DELETE</w:t>
+            </w:r>
+          </w:p>
+        </w:tc>
+        <w:tc>
+          <w:tcPr>
+            <w:tcW w:type="dxa" w:w="3200"/>
+            <w:tcBorders>
+              <w:top w:val="single" w:color="AAAAAA" w:sz="1"/>
+              <w:left w:val="single" w:color="AAAAAA" w:sz="1"/>
+              <w:bottom w:val="single" w:color="AAAAAA" w:sz="1"/>
+              <w:right w:val="single" w:color="AAAAAA" w:sz="1"/>
+            </w:tcBorders>
+            <w:tcMar>
+              <w:top w:type="dxa" w:w="80"/>
+              <w:left w:type="dxa" w:w="120"/>
+              <w:bottom w:type="dxa" w:w="80"/>
+              <w:right w:type="dxa" w:w="120"/>
+            </w:tcMar>
+            <w:vAlign w:val="top"/>
+          </w:tcPr>
+          <w:p>
+            <w:r>
+              <w:rPr>
+                <w:rFonts w:ascii="Arial" w:cs="Arial" w:eastAsia="Arial" w:hAnsi="Arial"/>
+                <w:sz w:val="22"/>
+                <w:szCs w:val="22"/>
+              </w:rPr>
+              <w:t xml:space="preserve">/calendar/events/:eventId</w:t>
+            </w:r>
+          </w:p>
+        </w:tc>
+        <w:tc>
+          <w:tcPr>
+            <w:tcW w:type="dxa" w:w="4360"/>
+            <w:tcBorders>
+              <w:top w:val="single" w:color="AAAAAA" w:sz="1"/>
+              <w:left w:val="single" w:color="AAAAAA" w:sz="1"/>
+              <w:bottom w:val="single" w:color="AAAAAA" w:sz="1"/>
+              <w:right w:val="single" w:color="AAAAAA" w:sz="1"/>
+            </w:tcBorders>
+            <w:tcMar>
+              <w:top w:type="dxa" w:w="80"/>
+              <w:left w:type="dxa" w:w="120"/>
+              <w:bottom w:type="dxa" w:w="80"/>
+              <w:right w:type="dxa" w:w="120"/>
+            </w:tcMar>
+            <w:vAlign w:val="top"/>
+          </w:tcPr>
+          <w:p>
+            <w:r>
+              <w:rPr>
+                <w:rFonts w:ascii="Arial" w:cs="Arial" w:eastAsia="Arial" w:hAnsi="Arial"/>
+                <w:sz w:val="22"/>
+                <w:szCs w:val="22"/>
+              </w:rPr>
+              <w:t xml:space="preserve">Cancel a Google Calendar event (for example, when a session is canceled). Google sends cancellation notifications to attendees.</w:t>
+            </w:r>
+          </w:p>
+        </w:tc>
+      </w:tr>
+      <w:tr>
+        <w:tc>
+          <w:tcPr>
+            <w:tcW w:type="dxa" w:w="1800"/>
+            <w:tcBorders>
+              <w:top w:val="single" w:color="AAAAAA" w:sz="1"/>
+              <w:left w:val="single" w:color="AAAAAA" w:sz="1"/>
+              <w:bottom w:val="single" w:color="AAAAAA" w:sz="1"/>
+              <w:right w:val="single" w:color="AAAAAA" w:sz="1"/>
+            </w:tcBorders>
+            <w:shd w:fill="F2F7FB" w:val="clear"/>
+            <w:tcMar>
+              <w:top w:type="dxa" w:w="80"/>
+              <w:left w:type="dxa" w:w="120"/>
+              <w:bottom w:type="dxa" w:w="80"/>
+              <w:right w:type="dxa" w:w="120"/>
+            </w:tcMar>
+            <w:vAlign w:val="top"/>
+          </w:tcPr>
+          <w:p>
+            <w:r>
+              <w:rPr>
+                <w:rFonts w:ascii="Arial" w:cs="Arial" w:eastAsia="Arial" w:hAnsi="Arial"/>
+                <w:sz w:val="22"/>
+                <w:szCs w:val="22"/>
+              </w:rPr>
               <w:t xml:space="preserve">POST</w:t>
             </w:r>
           </w:p>
@@ -7208,6 +7455,181 @@
                 <w:szCs w:val="22"/>
               </w:rPr>
               <w:t xml:space="preserve">Send a session summary email via Gmail API. Accepts recipients, subject, and body content. Returns send confirmation.</w:t>
+            </w:r>
+          </w:p>
+        </w:tc>
+      </w:tr>
+      <w:tr>
+        <w:tc>
+          <w:tcPr>
+            <w:tcW w:type="dxa" w:w="1800"/>
+            <w:tcBorders>
+              <w:top w:val="single" w:color="AAAAAA" w:sz="1"/>
+              <w:left w:val="single" w:color="AAAAAA" w:sz="1"/>
+              <w:bottom w:val="single" w:color="AAAAAA" w:sz="1"/>
+              <w:right w:val="single" w:color="AAAAAA" w:sz="1"/>
+            </w:tcBorders>
+            <w:tcMar>
+              <w:top w:type="dxa" w:w="80"/>
+              <w:left w:type="dxa" w:w="120"/>
+              <w:bottom w:type="dxa" w:w="80"/>
+              <w:right w:type="dxa" w:w="120"/>
+            </w:tcMar>
+            <w:vAlign w:val="top"/>
+          </w:tcPr>
+          <w:p>
+            <w:r>
+              <w:rPr>
+                <w:rFonts w:ascii="Arial" w:cs="Arial" w:eastAsia="Arial" w:hAnsi="Arial"/>
+                <w:sz w:val="22"/>
+                <w:szCs w:val="22"/>
+              </w:rPr>
+              <w:t xml:space="preserve">GET</w:t>
+            </w:r>
+          </w:p>
+        </w:tc>
+        <w:tc>
+          <w:tcPr>
+            <w:tcW w:type="dxa" w:w="3200"/>
+            <w:tcBorders>
+              <w:top w:val="single" w:color="AAAAAA" w:sz="1"/>
+              <w:left w:val="single" w:color="AAAAAA" w:sz="1"/>
+              <w:bottom w:val="single" w:color="AAAAAA" w:sz="1"/>
+              <w:right w:val="single" w:color="AAAAAA" w:sz="1"/>
+            </w:tcBorders>
+            <w:tcMar>
+              <w:top w:type="dxa" w:w="80"/>
+              <w:left w:type="dxa" w:w="120"/>
+              <w:bottom w:type="dxa" w:w="80"/>
+              <w:right w:type="dxa" w:w="120"/>
+            </w:tcMar>
+            <w:vAlign w:val="top"/>
+          </w:tcPr>
+          <w:p>
+            <w:r>
+              <w:rPr>
+                <w:rFonts w:ascii="Arial" w:cs="Arial" w:eastAsia="Arial" w:hAnsi="Arial"/>
+                <w:sz w:val="22"/>
+                <w:szCs w:val="22"/>
+              </w:rPr>
+              <w:t xml:space="preserve">/admin/email-templates</w:t>
+            </w:r>
+          </w:p>
+        </w:tc>
+        <w:tc>
+          <w:tcPr>
+            <w:tcW w:type="dxa" w:w="4360"/>
+            <w:tcBorders>
+              <w:top w:val="single" w:color="AAAAAA" w:sz="1"/>
+              <w:left w:val="single" w:color="AAAAAA" w:sz="1"/>
+              <w:bottom w:val="single" w:color="AAAAAA" w:sz="1"/>
+              <w:right w:val="single" w:color="AAAAAA" w:sz="1"/>
+            </w:tcBorders>
+            <w:tcMar>
+              <w:top w:type="dxa" w:w="80"/>
+              <w:left w:type="dxa" w:w="120"/>
+              <w:bottom w:type="dxa" w:w="80"/>
+              <w:right w:type="dxa" w:w="120"/>
+            </w:tcMar>
+            <w:vAlign w:val="top"/>
+          </w:tcPr>
+          <w:p>
+            <w:r>
+              <w:rPr>
+                <w:rFonts w:ascii="Arial" w:cs="Arial" w:eastAsia="Arial" w:hAnsi="Arial"/>
+                <w:sz w:val="22"/>
+                <w:szCs w:val="22"/>
+              </w:rPr>
+              <w:t xml:space="preserve">List all email templates. Super Admin only.</w:t>
+            </w:r>
+          </w:p>
+        </w:tc>
+      </w:tr>
+      <w:tr>
+        <w:tc>
+          <w:tcPr>
+            <w:tcW w:type="dxa" w:w="1800"/>
+            <w:tcBorders>
+              <w:top w:val="single" w:color="AAAAAA" w:sz="1"/>
+              <w:left w:val="single" w:color="AAAAAA" w:sz="1"/>
+              <w:bottom w:val="single" w:color="AAAAAA" w:sz="1"/>
+              <w:right w:val="single" w:color="AAAAAA" w:sz="1"/>
+            </w:tcBorders>
+            <w:shd w:fill="F2F7FB" w:val="clear"/>
+            <w:tcMar>
+              <w:top w:type="dxa" w:w="80"/>
+              <w:left w:type="dxa" w:w="120"/>
+              <w:bottom w:type="dxa" w:w="80"/>
+              <w:right w:type="dxa" w:w="120"/>
+            </w:tcMar>
+            <w:vAlign w:val="top"/>
+          </w:tcPr>
+          <w:p>
+            <w:r>
+              <w:rPr>
+                <w:rFonts w:ascii="Arial" w:cs="Arial" w:eastAsia="Arial" w:hAnsi="Arial"/>
+                <w:sz w:val="22"/>
+                <w:szCs w:val="22"/>
+              </w:rPr>
+              <w:t xml:space="preserve">PUT</w:t>
+            </w:r>
+          </w:p>
+        </w:tc>
+        <w:tc>
+          <w:tcPr>
+            <w:tcW w:type="dxa" w:w="3200"/>
+            <w:tcBorders>
+              <w:top w:val="single" w:color="AAAAAA" w:sz="1"/>
+              <w:left w:val="single" w:color="AAAAAA" w:sz="1"/>
+              <w:bottom w:val="single" w:color="AAAAAA" w:sz="1"/>
+              <w:right w:val="single" w:color="AAAAAA" w:sz="1"/>
+            </w:tcBorders>
+            <w:shd w:fill="F2F7FB" w:val="clear"/>
+            <w:tcMar>
+              <w:top w:type="dxa" w:w="80"/>
+              <w:left w:type="dxa" w:w="120"/>
+              <w:bottom w:type="dxa" w:w="80"/>
+              <w:right w:type="dxa" w:w="120"/>
+            </w:tcMar>
+            <w:vAlign w:val="top"/>
+          </w:tcPr>
+          <w:p>
+            <w:r>
+              <w:rPr>
+                <w:rFonts w:ascii="Arial" w:cs="Arial" w:eastAsia="Arial" w:hAnsi="Arial"/>
+                <w:sz w:val="22"/>
+                <w:szCs w:val="22"/>
+              </w:rPr>
+              <w:t xml:space="preserve">/admin/email-templates/:id</w:t>
+            </w:r>
+          </w:p>
+        </w:tc>
+        <w:tc>
+          <w:tcPr>
+            <w:tcW w:type="dxa" w:w="4360"/>
+            <w:tcBorders>
+              <w:top w:val="single" w:color="AAAAAA" w:sz="1"/>
+              <w:left w:val="single" w:color="AAAAAA" w:sz="1"/>
+              <w:bottom w:val="single" w:color="AAAAAA" w:sz="1"/>
+              <w:right w:val="single" w:color="AAAAAA" w:sz="1"/>
+            </w:tcBorders>
+            <w:shd w:fill="F2F7FB" w:val="clear"/>
+            <w:tcMar>
+              <w:top w:type="dxa" w:w="80"/>
+              <w:left w:type="dxa" w:w="120"/>
+              <w:bottom w:type="dxa" w:w="80"/>
+              <w:right w:type="dxa" w:w="120"/>
+            </w:tcMar>
+            <w:vAlign w:val="top"/>
+          </w:tcPr>
+          <w:p>
+            <w:r>
+              <w:rPr>
+                <w:rFonts w:ascii="Arial" w:cs="Arial" w:eastAsia="Arial" w:hAnsi="Arial"/>
+                <w:sz w:val="22"/>
+                <w:szCs w:val="22"/>
+              </w:rPr>
+              <w:t xml:space="preserve">Update an email template. Super Admin only.</w:t>
             </w:r>
           </w:p>
         </w:tc>
@@ -7501,7 +7923,7 @@
           <w:sz w:val="22"/>
           <w:szCs w:val="22"/>
         </w:rPr>
-        <w:t xml:space="preserve">Super Admin: all Admin endpoints plus data source management endpoints and role-mapping configuration.</w:t>
+        <w:t xml:space="preserve">Super Admin: all Admin endpoints plus data source management endpoints and email template configuration.</w:t>
       </w:r>
     </w:p>
     <w:p>
@@ -7788,23 +8210,6 @@
     </w:p>
     <w:p>
       <w:pPr>
-        <w:pStyle w:val="Heading2"/>
-        <w:spacing w:after="160" w:before="280"/>
-      </w:pPr>
-      <w:r>
-        <w:rPr>
-          <w:rFonts w:ascii="Arial" w:cs="Arial" w:eastAsia="Arial" w:hAnsi="Arial"/>
-          <w:b/>
-          <w:bCs/>
-          <w:color w:val="1F3864"/>
-          <w:sz w:val="24"/>
-          <w:szCs w:val="24"/>
-        </w:rPr>
-        <w:t xml:space="preserve">9.4 Gmail Integration</w:t>
-      </w:r>
-    </w:p>
-    <w:p>
-      <w:pPr>
         <w:spacing w:after="160"/>
       </w:pPr>
       <w:r>
@@ -7814,7 +8219,7 @@
           <w:sz w:val="22"/>
           <w:szCs w:val="22"/>
         </w:rPr>
-        <w:t xml:space="preserve">When a mentor completes a session and chooses to send a summary email, the application sends the email via the Gmail API with the following behavior:</w:t>
+        <w:t xml:space="preserve">Calendar event lifecycle management:</w:t>
       </w:r>
     </w:p>
     <w:p>
@@ -7829,10 +8234,20 @@
       <w:r>
         <w:rPr>
           <w:rFonts w:ascii="Arial" w:cs="Arial" w:eastAsia="Arial" w:hAnsi="Arial"/>
-          <w:sz w:val="22"/>
-          <w:szCs w:val="22"/>
-        </w:rPr>
-        <w:t xml:space="preserve">The email is sent from the mentor’s Gmail account (their address appears as the sender).</w:t>
+          <w:b/>
+          <w:bCs/>
+          <w:sz w:val="22"/>
+          <w:szCs w:val="22"/>
+        </w:rPr>
+        <w:t xml:space="preserve">Reschedule: </w:t>
+      </w:r>
+      <w:r>
+        <w:rPr>
+          <w:rFonts w:ascii="Arial" w:cs="Arial" w:eastAsia="Arial" w:hAnsi="Arial"/>
+          <w:sz w:val="22"/>
+          <w:szCs w:val="22"/>
+        </w:rPr>
+        <w:t xml:space="preserve">When a session is rescheduled to a new date or time, the application updates the existing Google Calendar event. Google Calendar automatically sends update notifications to all attendees.</w:t>
       </w:r>
     </w:p>
     <w:p>
@@ -7847,10 +8262,51 @@
       <w:r>
         <w:rPr>
           <w:rFonts w:ascii="Arial" w:cs="Arial" w:eastAsia="Arial" w:hAnsi="Arial"/>
-          <w:sz w:val="22"/>
-          <w:szCs w:val="22"/>
-        </w:rPr>
-        <w:t xml:space="preserve">The email body is pre-populated with the session notes and next steps from the session form.</w:t>
+          <w:b/>
+          <w:bCs/>
+          <w:sz w:val="22"/>
+          <w:szCs w:val="22"/>
+        </w:rPr>
+        <w:t xml:space="preserve">Cancellation: </w:t>
+      </w:r>
+      <w:r>
+        <w:rPr>
+          <w:rFonts w:ascii="Arial" w:cs="Arial" w:eastAsia="Arial" w:hAnsi="Arial"/>
+          <w:sz w:val="22"/>
+          <w:szCs w:val="22"/>
+        </w:rPr>
+        <w:t xml:space="preserve">When a session is canceled, the application cancels the corresponding Google Calendar event. Google Calendar automatically sends cancellation notifications to all attendees.</w:t>
+      </w:r>
+    </w:p>
+    <w:p>
+      <w:pPr>
+        <w:pStyle w:val="Heading2"/>
+        <w:spacing w:after="160" w:before="280"/>
+      </w:pPr>
+      <w:r>
+        <w:rPr>
+          <w:rFonts w:ascii="Arial" w:cs="Arial" w:eastAsia="Arial" w:hAnsi="Arial"/>
+          <w:b/>
+          <w:bCs/>
+          <w:color w:val="1F3864"/>
+          <w:sz w:val="24"/>
+          <w:szCs w:val="24"/>
+        </w:rPr>
+        <w:t xml:space="preserve">9.4 Gmail Integration</w:t>
+      </w:r>
+    </w:p>
+    <w:p>
+      <w:pPr>
+        <w:spacing w:after="160"/>
+      </w:pPr>
+      <w:r>
+        <w:rPr>
+          <w:rFonts w:ascii="Arial" w:cs="Arial" w:eastAsia="Arial" w:hAnsi="Arial"/>
+          <w:color w:val="000000"/>
+          <w:sz w:val="22"/>
+          <w:szCs w:val="22"/>
+        </w:rPr>
+        <w:t xml:space="preserve">When a mentor completes a session and chooses to send a summary email, the application sends the email via the Gmail API with the following behavior:</w:t>
       </w:r>
     </w:p>
     <w:p>
@@ -7868,7 +8324,7 @@
           <w:sz w:val="22"/>
           <w:szCs w:val="22"/>
         </w:rPr>
-        <w:t xml:space="preserve">The mentor can edit the email content and adjust the recipient list before sending.</w:t>
+        <w:t xml:space="preserve">The email is sent from the mentor’s Gmail account (their address appears as the sender).</w:t>
       </w:r>
     </w:p>
     <w:p>
@@ -7886,6 +8342,78 @@
           <w:sz w:val="22"/>
           <w:szCs w:val="22"/>
         </w:rPr>
+        <w:t xml:space="preserve">The email body is pre-populated using a configurable template managed by the Super Admin.</w:t>
+      </w:r>
+    </w:p>
+    <w:p>
+      <w:pPr>
+        <w:pStyle w:val="ListParagraph"/>
+        <w:numPr>
+          <w:ilvl w:val="0"/>
+          <w:numId w:val="2"/>
+        </w:numPr>
+        <w:spacing w:after="80"/>
+      </w:pPr>
+      <w:r>
+        <w:rPr>
+          <w:rFonts w:ascii="Arial" w:cs="Arial" w:eastAsia="Arial" w:hAnsi="Arial"/>
+          <w:sz w:val="22"/>
+          <w:szCs w:val="22"/>
+        </w:rPr>
+        <w:t xml:space="preserve">The template supports placeholders for session data (for example, client name, session date, session notes, next steps, next session date, attendees) that are filled in automatically at runtime.</w:t>
+      </w:r>
+    </w:p>
+    <w:p>
+      <w:pPr>
+        <w:pStyle w:val="ListParagraph"/>
+        <w:numPr>
+          <w:ilvl w:val="0"/>
+          <w:numId w:val="2"/>
+        </w:numPr>
+        <w:spacing w:after="80"/>
+      </w:pPr>
+      <w:r>
+        <w:rPr>
+          <w:rFonts w:ascii="Arial" w:cs="Arial" w:eastAsia="Arial" w:hAnsi="Arial"/>
+          <w:sz w:val="22"/>
+          <w:szCs w:val="22"/>
+        </w:rPr>
+        <w:t xml:space="preserve">The template uses plain text formatting.</w:t>
+      </w:r>
+    </w:p>
+    <w:p>
+      <w:pPr>
+        <w:pStyle w:val="ListParagraph"/>
+        <w:numPr>
+          <w:ilvl w:val="0"/>
+          <w:numId w:val="2"/>
+        </w:numPr>
+        <w:spacing w:after="80"/>
+      </w:pPr>
+      <w:r>
+        <w:rPr>
+          <w:rFonts w:ascii="Arial" w:cs="Arial" w:eastAsia="Arial" w:hAnsi="Arial"/>
+          <w:sz w:val="22"/>
+          <w:szCs w:val="22"/>
+        </w:rPr>
+        <w:t xml:space="preserve">The mentor can review and edit the email content and adjust the recipient list before sending.</w:t>
+      </w:r>
+    </w:p>
+    <w:p>
+      <w:pPr>
+        <w:pStyle w:val="ListParagraph"/>
+        <w:numPr>
+          <w:ilvl w:val="0"/>
+          <w:numId w:val="2"/>
+        </w:numPr>
+        <w:spacing w:after="80"/>
+      </w:pPr>
+      <w:r>
+        <w:rPr>
+          <w:rFonts w:ascii="Arial" w:cs="Arial" w:eastAsia="Arial" w:hAnsi="Arial"/>
+          <w:sz w:val="22"/>
+          <w:szCs w:val="22"/>
+        </w:rPr>
         <w:t xml:space="preserve">The sent email appears in the mentor’s Gmail Sent folder.</w:t>
       </w:r>
     </w:p>
@@ -8001,7 +8529,7 @@
           <w:sz w:val="22"/>
           <w:szCs w:val="22"/>
         </w:rPr>
-        <w:t xml:space="preserve">The application stores its configuration data (data source definitions, view definitions, role mappings, user preferences such as last-selected view, and Google OAuth tokens) in dedicated tables within the CRM’s database. These tables use a distinct table prefix to avoid collisions with CRM schema. The application never modifies CRM-owned tables directly.</w:t>
+        <w:t xml:space="preserve">The application stores its configuration data (data source definitions, view definitions, email templates, user preferences such as last-selected view, and Google OAuth tokens) in dedicated tables within the CRM’s database. These tables use a distinct table prefix to avoid collisions with CRM schema. The application never modifies CRM-owned tables directly.</w:t>
       </w:r>
     </w:p>
     <w:p>
@@ -8018,7 +8546,38 @@
           <w:sz w:val="24"/>
           <w:szCs w:val="24"/>
         </w:rPr>
-        <w:t xml:space="preserve">10.4 Deployment Management</w:t>
+        <w:t xml:space="preserve">10.4 Data Source Health Check</w:t>
+      </w:r>
+    </w:p>
+    <w:p>
+      <w:pPr>
+        <w:spacing w:after="160"/>
+      </w:pPr>
+      <w:r>
+        <w:rPr>
+          <w:rFonts w:ascii="Arial" w:cs="Arial" w:eastAsia="Arial" w:hAnsi="Arial"/>
+          <w:color w:val="000000"/>
+          <w:sz w:val="22"/>
+          <w:szCs w:val="22"/>
+        </w:rPr>
+        <w:t xml:space="preserve">The application includes an automated health check that validates all active data sources by executing their SQL queries on a configurable schedule and at application startup. Data sources whose queries fail (for example, due to CRM schema changes after an upgrade) are flagged as unhealthy and the Super Admin is notified. Unhealthy data sources remain active but display a warning to users. The Super Admin uses the test/preview function to diagnose and repair broken queries.</w:t>
+      </w:r>
+    </w:p>
+    <w:p>
+      <w:pPr>
+        <w:pStyle w:val="Heading2"/>
+        <w:spacing w:after="160" w:before="280"/>
+      </w:pPr>
+      <w:r>
+        <w:rPr>
+          <w:rFonts w:ascii="Arial" w:cs="Arial" w:eastAsia="Arial" w:hAnsi="Arial"/>
+          <w:b/>
+          <w:bCs/>
+          <w:color w:val="1F3864"/>
+          <w:sz w:val="24"/>
+          <w:szCs w:val="24"/>
+        </w:rPr>
+        <w:t xml:space="preserve">10.5 Deployment Management</w:t>
       </w:r>
     </w:p>
     <w:p>
@@ -9294,7 +9853,7 @@
                 <w:sz w:val="22"/>
                 <w:szCs w:val="22"/>
               </w:rPr>
-              <w:t xml:space="preserve">CRM security team to role mapping mechanism</w:t>
+              <w:t xml:space="preserve">Constrained query builder</w:t>
             </w:r>
           </w:p>
         </w:tc>
@@ -9322,7 +9881,7 @@
                 <w:sz w:val="22"/>
                 <w:szCs w:val="22"/>
               </w:rPr>
-              <w:t xml:space="preserve">The application reads CRM security team memberships to determine roles, but the specific configuration interface (admin screen, config file, or database table with direct edit) needs definition.</w:t>
+              <w:t xml:space="preserve">Identified as a future-release replacement for raw SQL in data source creation. Requirements for the query builder should be captured as a separate specification when prioritized.</w:t>
             </w:r>
           </w:p>
         </w:tc>
@@ -9382,7 +9941,7 @@
                 <w:sz w:val="22"/>
                 <w:szCs w:val="22"/>
               </w:rPr>
-              <w:t xml:space="preserve">Mentor-client relationship identification</w:t>
+              <w:t xml:space="preserve">Google Workspace OAuth configuration</w:t>
             </w:r>
           </w:p>
         </w:tc>
@@ -9411,7 +9970,7 @@
                 <w:sz w:val="22"/>
                 <w:szCs w:val="22"/>
               </w:rPr>
-              <w:t xml:space="preserve">The specific CRM field or relationship that identifies which clients belong to which mentor must be defined to implement the role-based data filtering parameter.</w:t>
+              <w:t xml:space="preserve">The Google Cloud project, OAuth client credentials, authorized redirect URIs, and scope approvals need to be configured for the production environment.</w:t>
             </w:r>
           </w:p>
         </w:tc>
@@ -9442,531 +10001,6 @@
                 <w:szCs w:val="22"/>
               </w:rPr>
               <w:t xml:space="preserve">3</w:t>
-            </w:r>
-          </w:p>
-        </w:tc>
-        <w:tc>
-          <w:tcPr>
-            <w:tcW w:type="dxa" w:w="3200"/>
-            <w:tcBorders>
-              <w:top w:val="single" w:color="AAAAAA" w:sz="1"/>
-              <w:left w:val="single" w:color="AAAAAA" w:sz="1"/>
-              <w:bottom w:val="single" w:color="AAAAAA" w:sz="1"/>
-              <w:right w:val="single" w:color="AAAAAA" w:sz="1"/>
-            </w:tcBorders>
-            <w:tcMar>
-              <w:top w:type="dxa" w:w="80"/>
-              <w:left w:type="dxa" w:w="120"/>
-              <w:bottom w:type="dxa" w:w="80"/>
-              <w:right w:type="dxa" w:w="120"/>
-            </w:tcMar>
-            <w:vAlign w:val="top"/>
-          </w:tcPr>
-          <w:p>
-            <w:r>
-              <w:rPr>
-                <w:rFonts w:ascii="Arial" w:cs="Arial" w:eastAsia="Arial" w:hAnsi="Arial"/>
-                <w:sz w:val="22"/>
-                <w:szCs w:val="22"/>
-              </w:rPr>
-              <w:t xml:space="preserve">Detail screen design and build process</w:t>
-            </w:r>
-          </w:p>
-        </w:tc>
-        <w:tc>
-          <w:tcPr>
-            <w:tcW w:type="dxa" w:w="5560"/>
-            <w:tcBorders>
-              <w:top w:val="single" w:color="AAAAAA" w:sz="1"/>
-              <w:left w:val="single" w:color="AAAAAA" w:sz="1"/>
-              <w:bottom w:val="single" w:color="AAAAAA" w:sz="1"/>
-              <w:right w:val="single" w:color="AAAAAA" w:sz="1"/>
-            </w:tcBorders>
-            <w:tcMar>
-              <w:top w:type="dxa" w:w="80"/>
-              <w:left w:type="dxa" w:w="120"/>
-              <w:bottom w:type="dxa" w:w="80"/>
-              <w:right w:type="dxa" w:w="120"/>
-            </w:tcMar>
-            <w:vAlign w:val="top"/>
-          </w:tcPr>
-          <w:p>
-            <w:r>
-              <w:rPr>
-                <w:rFonts w:ascii="Arial" w:cs="Arial" w:eastAsia="Arial" w:hAnsi="Arial"/>
-                <w:sz w:val="22"/>
-                <w:szCs w:val="22"/>
-              </w:rPr>
-              <w:t xml:space="preserve">The AI-assisted design workflow for detail screen components needs to be formalized, including tooling, review criteria, and deployment process.</w:t>
-            </w:r>
-          </w:p>
-        </w:tc>
-      </w:tr>
-      <w:tr>
-        <w:tc>
-          <w:tcPr>
-            <w:tcW w:type="dxa" w:w="600"/>
-            <w:tcBorders>
-              <w:top w:val="single" w:color="AAAAAA" w:sz="1"/>
-              <w:left w:val="single" w:color="AAAAAA" w:sz="1"/>
-              <w:bottom w:val="single" w:color="AAAAAA" w:sz="1"/>
-              <w:right w:val="single" w:color="AAAAAA" w:sz="1"/>
-            </w:tcBorders>
-            <w:shd w:fill="F2F7FB" w:val="clear"/>
-            <w:tcMar>
-              <w:top w:type="dxa" w:w="80"/>
-              <w:left w:type="dxa" w:w="120"/>
-              <w:bottom w:type="dxa" w:w="80"/>
-              <w:right w:type="dxa" w:w="120"/>
-            </w:tcMar>
-            <w:vAlign w:val="top"/>
-          </w:tcPr>
-          <w:p>
-            <w:r>
-              <w:rPr>
-                <w:rFonts w:ascii="Arial" w:cs="Arial" w:eastAsia="Arial" w:hAnsi="Arial"/>
-                <w:sz w:val="22"/>
-                <w:szCs w:val="22"/>
-              </w:rPr>
-              <w:t xml:space="preserve">4</w:t>
-            </w:r>
-          </w:p>
-        </w:tc>
-        <w:tc>
-          <w:tcPr>
-            <w:tcW w:type="dxa" w:w="3200"/>
-            <w:tcBorders>
-              <w:top w:val="single" w:color="AAAAAA" w:sz="1"/>
-              <w:left w:val="single" w:color="AAAAAA" w:sz="1"/>
-              <w:bottom w:val="single" w:color="AAAAAA" w:sz="1"/>
-              <w:right w:val="single" w:color="AAAAAA" w:sz="1"/>
-            </w:tcBorders>
-            <w:shd w:fill="F2F7FB" w:val="clear"/>
-            <w:tcMar>
-              <w:top w:type="dxa" w:w="80"/>
-              <w:left w:type="dxa" w:w="120"/>
-              <w:bottom w:type="dxa" w:w="80"/>
-              <w:right w:type="dxa" w:w="120"/>
-            </w:tcMar>
-            <w:vAlign w:val="top"/>
-          </w:tcPr>
-          <w:p>
-            <w:r>
-              <w:rPr>
-                <w:rFonts w:ascii="Arial" w:cs="Arial" w:eastAsia="Arial" w:hAnsi="Arial"/>
-                <w:sz w:val="22"/>
-                <w:szCs w:val="22"/>
-              </w:rPr>
-              <w:t xml:space="preserve">Constrained query builder</w:t>
-            </w:r>
-          </w:p>
-        </w:tc>
-        <w:tc>
-          <w:tcPr>
-            <w:tcW w:type="dxa" w:w="5560"/>
-            <w:tcBorders>
-              <w:top w:val="single" w:color="AAAAAA" w:sz="1"/>
-              <w:left w:val="single" w:color="AAAAAA" w:sz="1"/>
-              <w:bottom w:val="single" w:color="AAAAAA" w:sz="1"/>
-              <w:right w:val="single" w:color="AAAAAA" w:sz="1"/>
-            </w:tcBorders>
-            <w:shd w:fill="F2F7FB" w:val="clear"/>
-            <w:tcMar>
-              <w:top w:type="dxa" w:w="80"/>
-              <w:left w:type="dxa" w:w="120"/>
-              <w:bottom w:type="dxa" w:w="80"/>
-              <w:right w:type="dxa" w:w="120"/>
-            </w:tcMar>
-            <w:vAlign w:val="top"/>
-          </w:tcPr>
-          <w:p>
-            <w:r>
-              <w:rPr>
-                <w:rFonts w:ascii="Arial" w:cs="Arial" w:eastAsia="Arial" w:hAnsi="Arial"/>
-                <w:sz w:val="22"/>
-                <w:szCs w:val="22"/>
-              </w:rPr>
-              <w:t xml:space="preserve">Identified as a future-release replacement for raw SQL in data source creation. Requirements for the query builder should be captured as a separate specification when prioritized.</w:t>
-            </w:r>
-          </w:p>
-        </w:tc>
-      </w:tr>
-      <w:tr>
-        <w:tc>
-          <w:tcPr>
-            <w:tcW w:type="dxa" w:w="600"/>
-            <w:tcBorders>
-              <w:top w:val="single" w:color="AAAAAA" w:sz="1"/>
-              <w:left w:val="single" w:color="AAAAAA" w:sz="1"/>
-              <w:bottom w:val="single" w:color="AAAAAA" w:sz="1"/>
-              <w:right w:val="single" w:color="AAAAAA" w:sz="1"/>
-            </w:tcBorders>
-            <w:tcMar>
-              <w:top w:type="dxa" w:w="80"/>
-              <w:left w:type="dxa" w:w="120"/>
-              <w:bottom w:type="dxa" w:w="80"/>
-              <w:right w:type="dxa" w:w="120"/>
-            </w:tcMar>
-            <w:vAlign w:val="top"/>
-          </w:tcPr>
-          <w:p>
-            <w:r>
-              <w:rPr>
-                <w:rFonts w:ascii="Arial" w:cs="Arial" w:eastAsia="Arial" w:hAnsi="Arial"/>
-                <w:sz w:val="22"/>
-                <w:szCs w:val="22"/>
-              </w:rPr>
-              <w:t xml:space="preserve">5</w:t>
-            </w:r>
-          </w:p>
-        </w:tc>
-        <w:tc>
-          <w:tcPr>
-            <w:tcW w:type="dxa" w:w="3200"/>
-            <w:tcBorders>
-              <w:top w:val="single" w:color="AAAAAA" w:sz="1"/>
-              <w:left w:val="single" w:color="AAAAAA" w:sz="1"/>
-              <w:bottom w:val="single" w:color="AAAAAA" w:sz="1"/>
-              <w:right w:val="single" w:color="AAAAAA" w:sz="1"/>
-            </w:tcBorders>
-            <w:tcMar>
-              <w:top w:type="dxa" w:w="80"/>
-              <w:left w:type="dxa" w:w="120"/>
-              <w:bottom w:type="dxa" w:w="80"/>
-              <w:right w:type="dxa" w:w="120"/>
-            </w:tcMar>
-            <w:vAlign w:val="top"/>
-          </w:tcPr>
-          <w:p>
-            <w:r>
-              <w:rPr>
-                <w:rFonts w:ascii="Arial" w:cs="Arial" w:eastAsia="Arial" w:hAnsi="Arial"/>
-                <w:sz w:val="22"/>
-                <w:szCs w:val="22"/>
-              </w:rPr>
-              <w:t xml:space="preserve">CRM schema change management</w:t>
-            </w:r>
-          </w:p>
-        </w:tc>
-        <w:tc>
-          <w:tcPr>
-            <w:tcW w:type="dxa" w:w="5560"/>
-            <w:tcBorders>
-              <w:top w:val="single" w:color="AAAAAA" w:sz="1"/>
-              <w:left w:val="single" w:color="AAAAAA" w:sz="1"/>
-              <w:bottom w:val="single" w:color="AAAAAA" w:sz="1"/>
-              <w:right w:val="single" w:color="AAAAAA" w:sz="1"/>
-            </w:tcBorders>
-            <w:tcMar>
-              <w:top w:type="dxa" w:w="80"/>
-              <w:left w:type="dxa" w:w="120"/>
-              <w:bottom w:type="dxa" w:w="80"/>
-              <w:right w:type="dxa" w:w="120"/>
-            </w:tcMar>
-            <w:vAlign w:val="top"/>
-          </w:tcPr>
-          <w:p>
-            <w:r>
-              <w:rPr>
-                <w:rFonts w:ascii="Arial" w:cs="Arial" w:eastAsia="Arial" w:hAnsi="Arial"/>
-                <w:sz w:val="22"/>
-                <w:szCs w:val="22"/>
-              </w:rPr>
-              <w:t xml:space="preserve">Data source queries reference CRM database tables directly. A process for validating data sources after CRM upgrades needs to be defined to prevent broken views.</w:t>
-            </w:r>
-          </w:p>
-        </w:tc>
-      </w:tr>
-      <w:tr>
-        <w:tc>
-          <w:tcPr>
-            <w:tcW w:type="dxa" w:w="600"/>
-            <w:tcBorders>
-              <w:top w:val="single" w:color="AAAAAA" w:sz="1"/>
-              <w:left w:val="single" w:color="AAAAAA" w:sz="1"/>
-              <w:bottom w:val="single" w:color="AAAAAA" w:sz="1"/>
-              <w:right w:val="single" w:color="AAAAAA" w:sz="1"/>
-            </w:tcBorders>
-            <w:shd w:fill="F2F7FB" w:val="clear"/>
-            <w:tcMar>
-              <w:top w:type="dxa" w:w="80"/>
-              <w:left w:type="dxa" w:w="120"/>
-              <w:bottom w:type="dxa" w:w="80"/>
-              <w:right w:type="dxa" w:w="120"/>
-            </w:tcMar>
-            <w:vAlign w:val="top"/>
-          </w:tcPr>
-          <w:p>
-            <w:r>
-              <w:rPr>
-                <w:rFonts w:ascii="Arial" w:cs="Arial" w:eastAsia="Arial" w:hAnsi="Arial"/>
-                <w:sz w:val="22"/>
-                <w:szCs w:val="22"/>
-              </w:rPr>
-              <w:t xml:space="preserve">6</w:t>
-            </w:r>
-          </w:p>
-        </w:tc>
-        <w:tc>
-          <w:tcPr>
-            <w:tcW w:type="dxa" w:w="3200"/>
-            <w:tcBorders>
-              <w:top w:val="single" w:color="AAAAAA" w:sz="1"/>
-              <w:left w:val="single" w:color="AAAAAA" w:sz="1"/>
-              <w:bottom w:val="single" w:color="AAAAAA" w:sz="1"/>
-              <w:right w:val="single" w:color="AAAAAA" w:sz="1"/>
-            </w:tcBorders>
-            <w:shd w:fill="F2F7FB" w:val="clear"/>
-            <w:tcMar>
-              <w:top w:type="dxa" w:w="80"/>
-              <w:left w:type="dxa" w:w="120"/>
-              <w:bottom w:type="dxa" w:w="80"/>
-              <w:right w:type="dxa" w:w="120"/>
-            </w:tcMar>
-            <w:vAlign w:val="top"/>
-          </w:tcPr>
-          <w:p>
-            <w:r>
-              <w:rPr>
-                <w:rFonts w:ascii="Arial" w:cs="Arial" w:eastAsia="Arial" w:hAnsi="Arial"/>
-                <w:sz w:val="22"/>
-                <w:szCs w:val="22"/>
-              </w:rPr>
-              <w:t xml:space="preserve">Google Workspace OAuth configuration</w:t>
-            </w:r>
-          </w:p>
-        </w:tc>
-        <w:tc>
-          <w:tcPr>
-            <w:tcW w:type="dxa" w:w="5560"/>
-            <w:tcBorders>
-              <w:top w:val="single" w:color="AAAAAA" w:sz="1"/>
-              <w:left w:val="single" w:color="AAAAAA" w:sz="1"/>
-              <w:bottom w:val="single" w:color="AAAAAA" w:sz="1"/>
-              <w:right w:val="single" w:color="AAAAAA" w:sz="1"/>
-            </w:tcBorders>
-            <w:shd w:fill="F2F7FB" w:val="clear"/>
-            <w:tcMar>
-              <w:top w:type="dxa" w:w="80"/>
-              <w:left w:type="dxa" w:w="120"/>
-              <w:bottom w:type="dxa" w:w="80"/>
-              <w:right w:type="dxa" w:w="120"/>
-            </w:tcMar>
-            <w:vAlign w:val="top"/>
-          </w:tcPr>
-          <w:p>
-            <w:r>
-              <w:rPr>
-                <w:rFonts w:ascii="Arial" w:cs="Arial" w:eastAsia="Arial" w:hAnsi="Arial"/>
-                <w:sz w:val="22"/>
-                <w:szCs w:val="22"/>
-              </w:rPr>
-              <w:t xml:space="preserve">The Google Cloud project, OAuth client credentials, authorized redirect URIs, and scope approvals need to be configured for the production environment.</w:t>
-            </w:r>
-          </w:p>
-        </w:tc>
-      </w:tr>
-      <w:tr>
-        <w:tc>
-          <w:tcPr>
-            <w:tcW w:type="dxa" w:w="600"/>
-            <w:tcBorders>
-              <w:top w:val="single" w:color="AAAAAA" w:sz="1"/>
-              <w:left w:val="single" w:color="AAAAAA" w:sz="1"/>
-              <w:bottom w:val="single" w:color="AAAAAA" w:sz="1"/>
-              <w:right w:val="single" w:color="AAAAAA" w:sz="1"/>
-            </w:tcBorders>
-            <w:tcMar>
-              <w:top w:type="dxa" w:w="80"/>
-              <w:left w:type="dxa" w:w="120"/>
-              <w:bottom w:type="dxa" w:w="80"/>
-              <w:right w:type="dxa" w:w="120"/>
-            </w:tcMar>
-            <w:vAlign w:val="top"/>
-          </w:tcPr>
-          <w:p>
-            <w:r>
-              <w:rPr>
-                <w:rFonts w:ascii="Arial" w:cs="Arial" w:eastAsia="Arial" w:hAnsi="Arial"/>
-                <w:sz w:val="22"/>
-                <w:szCs w:val="22"/>
-              </w:rPr>
-              <w:t xml:space="preserve">7</w:t>
-            </w:r>
-          </w:p>
-        </w:tc>
-        <w:tc>
-          <w:tcPr>
-            <w:tcW w:type="dxa" w:w="3200"/>
-            <w:tcBorders>
-              <w:top w:val="single" w:color="AAAAAA" w:sz="1"/>
-              <w:left w:val="single" w:color="AAAAAA" w:sz="1"/>
-              <w:bottom w:val="single" w:color="AAAAAA" w:sz="1"/>
-              <w:right w:val="single" w:color="AAAAAA" w:sz="1"/>
-            </w:tcBorders>
-            <w:tcMar>
-              <w:top w:type="dxa" w:w="80"/>
-              <w:left w:type="dxa" w:w="120"/>
-              <w:bottom w:type="dxa" w:w="80"/>
-              <w:right w:type="dxa" w:w="120"/>
-            </w:tcMar>
-            <w:vAlign w:val="top"/>
-          </w:tcPr>
-          <w:p>
-            <w:r>
-              <w:rPr>
-                <w:rFonts w:ascii="Arial" w:cs="Arial" w:eastAsia="Arial" w:hAnsi="Arial"/>
-                <w:sz w:val="22"/>
-                <w:szCs w:val="22"/>
-              </w:rPr>
-              <w:t xml:space="preserve">Calendar event update and cancellation</w:t>
-            </w:r>
-          </w:p>
-        </w:tc>
-        <w:tc>
-          <w:tcPr>
-            <w:tcW w:type="dxa" w:w="5560"/>
-            <w:tcBorders>
-              <w:top w:val="single" w:color="AAAAAA" w:sz="1"/>
-              <w:left w:val="single" w:color="AAAAAA" w:sz="1"/>
-              <w:bottom w:val="single" w:color="AAAAAA" w:sz="1"/>
-              <w:right w:val="single" w:color="AAAAAA" w:sz="1"/>
-            </w:tcBorders>
-            <w:tcMar>
-              <w:top w:type="dxa" w:w="80"/>
-              <w:left w:type="dxa" w:w="120"/>
-              <w:bottom w:type="dxa" w:w="80"/>
-              <w:right w:type="dxa" w:w="120"/>
-            </w:tcMar>
-            <w:vAlign w:val="top"/>
-          </w:tcPr>
-          <w:p>
-            <w:r>
-              <w:rPr>
-                <w:rFonts w:ascii="Arial" w:cs="Arial" w:eastAsia="Arial" w:hAnsi="Arial"/>
-                <w:sz w:val="22"/>
-                <w:szCs w:val="22"/>
-              </w:rPr>
-              <w:t xml:space="preserve">The current specification creates calendar events but does not address updating or canceling events when sessions are rescheduled or canceled. This workflow should be defined.</w:t>
-            </w:r>
-          </w:p>
-        </w:tc>
-      </w:tr>
-      <w:tr>
-        <w:tc>
-          <w:tcPr>
-            <w:tcW w:type="dxa" w:w="600"/>
-            <w:tcBorders>
-              <w:top w:val="single" w:color="AAAAAA" w:sz="1"/>
-              <w:left w:val="single" w:color="AAAAAA" w:sz="1"/>
-              <w:bottom w:val="single" w:color="AAAAAA" w:sz="1"/>
-              <w:right w:val="single" w:color="AAAAAA" w:sz="1"/>
-            </w:tcBorders>
-            <w:shd w:fill="F2F7FB" w:val="clear"/>
-            <w:tcMar>
-              <w:top w:type="dxa" w:w="80"/>
-              <w:left w:type="dxa" w:w="120"/>
-              <w:bottom w:type="dxa" w:w="80"/>
-              <w:right w:type="dxa" w:w="120"/>
-            </w:tcMar>
-            <w:vAlign w:val="top"/>
-          </w:tcPr>
-          <w:p>
-            <w:r>
-              <w:rPr>
-                <w:rFonts w:ascii="Arial" w:cs="Arial" w:eastAsia="Arial" w:hAnsi="Arial"/>
-                <w:sz w:val="22"/>
-                <w:szCs w:val="22"/>
-              </w:rPr>
-              <w:t xml:space="preserve">8</w:t>
-            </w:r>
-          </w:p>
-        </w:tc>
-        <w:tc>
-          <w:tcPr>
-            <w:tcW w:type="dxa" w:w="3200"/>
-            <w:tcBorders>
-              <w:top w:val="single" w:color="AAAAAA" w:sz="1"/>
-              <w:left w:val="single" w:color="AAAAAA" w:sz="1"/>
-              <w:bottom w:val="single" w:color="AAAAAA" w:sz="1"/>
-              <w:right w:val="single" w:color="AAAAAA" w:sz="1"/>
-            </w:tcBorders>
-            <w:shd w:fill="F2F7FB" w:val="clear"/>
-            <w:tcMar>
-              <w:top w:type="dxa" w:w="80"/>
-              <w:left w:type="dxa" w:w="120"/>
-              <w:bottom w:type="dxa" w:w="80"/>
-              <w:right w:type="dxa" w:w="120"/>
-            </w:tcMar>
-            <w:vAlign w:val="top"/>
-          </w:tcPr>
-          <w:p>
-            <w:r>
-              <w:rPr>
-                <w:rFonts w:ascii="Arial" w:cs="Arial" w:eastAsia="Arial" w:hAnsi="Arial"/>
-                <w:sz w:val="22"/>
-                <w:szCs w:val="22"/>
-              </w:rPr>
-              <w:t xml:space="preserve">Session summary email template</w:t>
-            </w:r>
-          </w:p>
-        </w:tc>
-        <w:tc>
-          <w:tcPr>
-            <w:tcW w:type="dxa" w:w="5560"/>
-            <w:tcBorders>
-              <w:top w:val="single" w:color="AAAAAA" w:sz="1"/>
-              <w:left w:val="single" w:color="AAAAAA" w:sz="1"/>
-              <w:bottom w:val="single" w:color="AAAAAA" w:sz="1"/>
-              <w:right w:val="single" w:color="AAAAAA" w:sz="1"/>
-            </w:tcBorders>
-            <w:shd w:fill="F2F7FB" w:val="clear"/>
-            <w:tcMar>
-              <w:top w:type="dxa" w:w="80"/>
-              <w:left w:type="dxa" w:w="120"/>
-              <w:bottom w:type="dxa" w:w="80"/>
-              <w:right w:type="dxa" w:w="120"/>
-            </w:tcMar>
-            <w:vAlign w:val="top"/>
-          </w:tcPr>
-          <w:p>
-            <w:r>
-              <w:rPr>
-                <w:rFonts w:ascii="Arial" w:cs="Arial" w:eastAsia="Arial" w:hAnsi="Arial"/>
-                <w:sz w:val="22"/>
-                <w:szCs w:val="22"/>
-              </w:rPr>
-              <w:t xml:space="preserve">The pre-populated email format (subject line, body structure, signature) should be defined and made configurable.</w:t>
-            </w:r>
-          </w:p>
-        </w:tc>
-      </w:tr>
-      <w:tr>
-        <w:tc>
-          <w:tcPr>
-            <w:tcW w:type="dxa" w:w="600"/>
-            <w:tcBorders>
-              <w:top w:val="single" w:color="AAAAAA" w:sz="1"/>
-              <w:left w:val="single" w:color="AAAAAA" w:sz="1"/>
-              <w:bottom w:val="single" w:color="AAAAAA" w:sz="1"/>
-              <w:right w:val="single" w:color="AAAAAA" w:sz="1"/>
-            </w:tcBorders>
-            <w:tcMar>
-              <w:top w:type="dxa" w:w="80"/>
-              <w:left w:type="dxa" w:w="120"/>
-              <w:bottom w:type="dxa" w:w="80"/>
-              <w:right w:type="dxa" w:w="120"/>
-            </w:tcMar>
-            <w:vAlign w:val="top"/>
-          </w:tcPr>
-          <w:p>
-            <w:r>
-              <w:rPr>
-                <w:rFonts w:ascii="Arial" w:cs="Arial" w:eastAsia="Arial" w:hAnsi="Arial"/>
-                <w:sz w:val="22"/>
-                <w:szCs w:val="22"/>
-              </w:rPr>
-              <w:t xml:space="preserve">9</w:t>
             </w:r>
           </w:p>
         </w:tc>
@@ -10193,7 +10227,7 @@
                 <w:sz w:val="22"/>
                 <w:szCs w:val="22"/>
               </w:rPr>
-              <w:t xml:space="preserve">An application role that can use all views, see all client data, and create and manage views on existing data sources. Maps to CRM Client Admin and Mentor Admin security teams.</w:t>
+              <w:t xml:space="preserve">An application role that can use all views, see all client data, and create and manage views on existing data sources. Maps to the CRM Client Admin role.</w:t>
             </w:r>
           </w:p>
         </w:tc>
@@ -10342,7 +10376,7 @@
                 <w:sz w:val="22"/>
                 <w:szCs w:val="22"/>
               </w:rPr>
-              <w:t xml:space="preserve">Hierarchy</w:t>
+              <w:t xml:space="preserve">Email Template</w:t>
             </w:r>
           </w:p>
         </w:tc>
@@ -10371,7 +10405,7 @@
                 <w:sz w:val="22"/>
                 <w:szCs w:val="22"/>
               </w:rPr>
-              <w:t xml:space="preserve">A parent-child grouping structure defined on a data source that controls how flat query results are organized into expandable/collapsible levels in the data grid.</w:t>
+              <w:t xml:space="preserve">A configurable plain text template with placeholders for session data, used to pre-populate session summary emails. Managed by the Super Admin.</w:t>
             </w:r>
           </w:p>
         </w:tc>
@@ -10401,7 +10435,7 @@
                 <w:sz w:val="22"/>
                 <w:szCs w:val="22"/>
               </w:rPr>
-              <w:t xml:space="preserve">Mentor</w:t>
+              <w:t xml:space="preserve">Health Check</w:t>
             </w:r>
           </w:p>
         </w:tc>
@@ -10429,7 +10463,7 @@
                 <w:sz w:val="22"/>
                 <w:szCs w:val="22"/>
               </w:rPr>
-              <w:t xml:space="preserve">An application role that can use all views but sees only their own assigned clients. Maps to the CRM Mentor security team.</w:t>
+              <w:t xml:space="preserve">An automated process that validates all active data sources by executing their SQL queries on a schedule and at startup, flagging any that fail due to schema changes or other issues.</w:t>
             </w:r>
           </w:p>
         </w:tc>
@@ -10460,7 +10494,7 @@
                 <w:sz w:val="22"/>
                 <w:szCs w:val="22"/>
               </w:rPr>
-              <w:t xml:space="preserve">Named Parameter</w:t>
+              <w:t xml:space="preserve">Hierarchy</w:t>
             </w:r>
           </w:p>
         </w:tc>
@@ -10489,7 +10523,7 @@
                 <w:sz w:val="22"/>
                 <w:szCs w:val="22"/>
               </w:rPr>
-              <w:t xml:space="preserve">A placeholder in a data source SQL query that the backend replaces with a runtime value (such as the current user’s ID) at query execution time.</w:t>
+              <w:t xml:space="preserve">A parent-child grouping structure defined on a data source that controls how flat query results are organized into expandable/collapsible levels in the data grid.</w:t>
             </w:r>
           </w:p>
         </w:tc>
@@ -10519,7 +10553,7 @@
                 <w:sz w:val="22"/>
                 <w:szCs w:val="22"/>
               </w:rPr>
-              <w:t xml:space="preserve">OAuth 2.0</w:t>
+              <w:t xml:space="preserve">Mentor</w:t>
             </w:r>
           </w:p>
         </w:tc>
@@ -10547,7 +10581,7 @@
                 <w:sz w:val="22"/>
                 <w:szCs w:val="22"/>
               </w:rPr>
-              <w:t xml:space="preserve">An authorization framework that allows the application to access Google Workspace services (Calendar, Gmail) on behalf of the user without storing their Google password.</w:t>
+              <w:t xml:space="preserve">An application role that can use all views but sees only their own assigned clients. Maps to the CRM Mentor Admin role.</w:t>
             </w:r>
           </w:p>
         </w:tc>
@@ -10578,7 +10612,7 @@
                 <w:sz w:val="22"/>
                 <w:szCs w:val="22"/>
               </w:rPr>
-              <w:t xml:space="preserve">QuickNote</w:t>
+              <w:t xml:space="preserve">Named Parameter</w:t>
             </w:r>
           </w:p>
         </w:tc>
@@ -10607,7 +10641,7 @@
                 <w:sz w:val="22"/>
                 <w:szCs w:val="22"/>
               </w:rPr>
-              <w:t xml:space="preserve">A short-form text field on the engagement record that is visible in the grid view, allowing mentors to see brief status notes without opening the detail screen.</w:t>
+              <w:t xml:space="preserve">A placeholder in a data source SQL query that the backend replaces with a runtime value (such as the current user’s ID) at query execution time.</w:t>
             </w:r>
           </w:p>
         </w:tc>
@@ -10637,7 +10671,7 @@
                 <w:sz w:val="22"/>
                 <w:szCs w:val="22"/>
               </w:rPr>
-              <w:t xml:space="preserve">Role-Mapping Table</w:t>
+              <w:t xml:space="preserve">OAuth 2.0</w:t>
             </w:r>
           </w:p>
         </w:tc>
@@ -10665,7 +10699,7 @@
                 <w:sz w:val="22"/>
                 <w:szCs w:val="22"/>
               </w:rPr>
-              <w:t xml:space="preserve">A configuration table that maps CRM security team memberships to application roles (Mentor, Admin, Super Admin).</w:t>
+              <w:t xml:space="preserve">An authorization framework that allows the application to access Google Workspace services (Calendar, Gmail) on behalf of the user without storing their Google password.</w:t>
             </w:r>
           </w:p>
         </w:tc>
@@ -10696,7 +10730,7 @@
                 <w:sz w:val="22"/>
                 <w:szCs w:val="22"/>
               </w:rPr>
-              <w:t xml:space="preserve">Session Form</w:t>
+              <w:t xml:space="preserve">QuickNote</w:t>
             </w:r>
           </w:p>
         </w:tc>
@@ -10725,7 +10759,7 @@
                 <w:sz w:val="22"/>
                 <w:szCs w:val="22"/>
               </w:rPr>
-              <w:t xml:space="preserve">The data entry interface for capturing session details including date, duration, attendees, notes, topics, and next session scheduling.</w:t>
+              <w:t xml:space="preserve">A short-form text field on the engagement record that is visible in the grid view, allowing mentors to see brief status notes without opening the detail screen.</w:t>
             </w:r>
           </w:p>
         </w:tc>
@@ -10755,7 +10789,7 @@
                 <w:sz w:val="22"/>
                 <w:szCs w:val="22"/>
               </w:rPr>
-              <w:t xml:space="preserve">Super Admin</w:t>
+              <w:t xml:space="preserve">Session Form</w:t>
             </w:r>
           </w:p>
         </w:tc>
@@ -10783,7 +10817,7 @@
                 <w:sz w:val="22"/>
                 <w:szCs w:val="22"/>
               </w:rPr>
-              <w:t xml:space="preserve">An application role with full access: all Admin capabilities plus data source management and role-mapping configuration.</w:t>
+              <w:t xml:space="preserve">The data entry interface for capturing session details including date, duration, attendees, notes, topics, and next session scheduling.</w:t>
             </w:r>
           </w:p>
         </w:tc>
@@ -10814,6 +10848,65 @@
                 <w:sz w:val="22"/>
                 <w:szCs w:val="22"/>
               </w:rPr>
+              <w:t xml:space="preserve">Super Admin</w:t>
+            </w:r>
+          </w:p>
+        </w:tc>
+        <w:tc>
+          <w:tcPr>
+            <w:tcW w:type="dxa" w:w="6560"/>
+            <w:tcBorders>
+              <w:top w:val="single" w:color="AAAAAA" w:sz="1"/>
+              <w:left w:val="single" w:color="AAAAAA" w:sz="1"/>
+              <w:bottom w:val="single" w:color="AAAAAA" w:sz="1"/>
+              <w:right w:val="single" w:color="AAAAAA" w:sz="1"/>
+            </w:tcBorders>
+            <w:shd w:fill="F2F7FB" w:val="clear"/>
+            <w:tcMar>
+              <w:top w:type="dxa" w:w="80"/>
+              <w:left w:type="dxa" w:w="120"/>
+              <w:bottom w:type="dxa" w:w="80"/>
+              <w:right w:type="dxa" w:w="120"/>
+            </w:tcMar>
+            <w:vAlign w:val="top"/>
+          </w:tcPr>
+          <w:p>
+            <w:r>
+              <w:rPr>
+                <w:rFonts w:ascii="Arial" w:cs="Arial" w:eastAsia="Arial" w:hAnsi="Arial"/>
+                <w:sz w:val="22"/>
+                <w:szCs w:val="22"/>
+              </w:rPr>
+              <w:t xml:space="preserve">An application role with full access: all Admin capabilities plus data source management, email template configuration, and health check management. Maps to the CRM System Admin role.</w:t>
+            </w:r>
+          </w:p>
+        </w:tc>
+      </w:tr>
+      <w:tr>
+        <w:tc>
+          <w:tcPr>
+            <w:tcW w:type="dxa" w:w="2800"/>
+            <w:tcBorders>
+              <w:top w:val="single" w:color="AAAAAA" w:sz="1"/>
+              <w:left w:val="single" w:color="AAAAAA" w:sz="1"/>
+              <w:bottom w:val="single" w:color="AAAAAA" w:sz="1"/>
+              <w:right w:val="single" w:color="AAAAAA" w:sz="1"/>
+            </w:tcBorders>
+            <w:tcMar>
+              <w:top w:type="dxa" w:w="80"/>
+              <w:left w:type="dxa" w:w="120"/>
+              <w:bottom w:type="dxa" w:w="80"/>
+              <w:right w:type="dxa" w:w="120"/>
+            </w:tcMar>
+            <w:vAlign w:val="top"/>
+          </w:tcPr>
+          <w:p>
+            <w:r>
+              <w:rPr>
+                <w:rFonts w:ascii="Arial" w:cs="Arial" w:eastAsia="Arial" w:hAnsi="Arial"/>
+                <w:sz w:val="22"/>
+                <w:szCs w:val="22"/>
+              </w:rPr>
               <w:t xml:space="preserve">View</w:t>
             </w:r>
           </w:p>
@@ -10827,7 +10920,6 @@
               <w:bottom w:val="single" w:color="AAAAAA" w:sz="1"/>
               <w:right w:val="single" w:color="AAAAAA" w:sz="1"/>
             </w:tcBorders>
-            <w:shd w:fill="F2F7FB" w:val="clear"/>
             <w:tcMar>
               <w:top w:type="dxa" w:w="80"/>
               <w:left w:type="dxa" w:w="120"/>

</xml_diff>